<commit_message>
docs: Projeye eklenen en yeni görsel efektler ve admin giriş özellikleri Word Raporlarına (TR/EN) eklendi
</commit_message>
<xml_diff>
--- a/docs/IoTGuard_Rapor_TR.docx
+++ b/docs/IoTGuard_Rapor_TR.docx
@@ -39,12 +39,6 @@
         <w:gridCol w:w="4680"/>
       </w:tblGrid>
       <w:tr>
-        <w:tblPrEx>
-          <w:tblCellMar>
-            <w:top w:w="0" w:type="dxa"/>
-            <w:bottom w:w="0" w:type="dxa"/>
-          </w:tblCellMar>
-        </w:tblPrEx>
         <w:tc>
           <w:tcPr>
             <w:tcW w:w="4680" w:type="dxa"/>
@@ -173,10 +167,7 @@
         <w:t>C++</w:t>
       </w:r>
       <w:r>
-        <w:t xml:space="preserve"> SE dili kullanılarak geliştirilmiş IoTGuard adlı bir gömülü cihaz güvenlik monitörü sistemi sunulmaktadır. Sistem; güvenlik kamerası, internet yönlendiricisi ve akıllı kapı kilidi gibi IoT cihazlarını merkezi bir yapı üzerinden izlemekte, çoklu iş parçacığı (multi-threading) ile eşzamanlı güvenlik taramaları gerçekleştirmekte, olası siber tehditleri ve donanım arızalarını tespit ederek hem konsola hem de dosyaya raporlamaktadır. Proje; kalıtım, çok biçimlilik, soyutlama, arayüz ve kapsülleme gibi temel OOP</w:t>
-      </w:r>
-      <w:r>
-        <w:t xml:space="preserve"> prensiplerini kapsamlı biçimde uygulamaktadır.</w:t>
+        <w:t xml:space="preserve"> SE dili kullanılarak geliştirilmiş IoTGuard adlı bir gömülü cihaz güvenlik monitörü sistemi sunulmaktadır. Sistem; güvenlik kamerası, internet yönlendiricisi ve akıllı kapı kilidi gibi IoT cihazlarını merkezi bir yapı üzerinden izlemekte, çoklu iş parçacığı (multi-threading) ile eşzamanlı güvenlik taramaları gerçekleştirmekte, olası siber tehditleri ve donanım arızalarını tespit ederek hem konsola hem de dosyaya raporlamaktadır. Proje; kalıtım, çok biçimlilik, soyutlama, arayüz ve kapsülleme gibi temel OOP prensiplerini kapsamlı biçimde uygulamaktadır.</w:t>
       </w:r>
     </w:p>
     <w:p>
@@ -369,12 +360,6 @@
         <w:gridCol w:w="4138"/>
       </w:tblGrid>
       <w:tr>
-        <w:tblPrEx>
-          <w:tblCellMar>
-            <w:top w:w="0" w:type="dxa"/>
-            <w:bottom w:w="0" w:type="dxa"/>
-          </w:tblCellMar>
-        </w:tblPrEx>
         <w:trPr>
           <w:tblHeader/>
         </w:trPr>
@@ -496,12 +481,6 @@
         </w:tc>
       </w:tr>
       <w:tr>
-        <w:tblPrEx>
-          <w:tblCellMar>
-            <w:top w:w="0" w:type="dxa"/>
-            <w:bottom w:w="0" w:type="dxa"/>
-          </w:tblCellMar>
-        </w:tblPrEx>
         <w:tc>
           <w:tcPr>
             <w:tcW w:w="1800" w:type="dxa"/>
@@ -619,12 +598,6 @@
         </w:tc>
       </w:tr>
       <w:tr>
-        <w:tblPrEx>
-          <w:tblCellMar>
-            <w:top w:w="0" w:type="dxa"/>
-            <w:bottom w:w="0" w:type="dxa"/>
-          </w:tblCellMar>
-        </w:tblPrEx>
         <w:tc>
           <w:tcPr>
             <w:tcW w:w="1800" w:type="dxa"/>
@@ -742,12 +715,6 @@
         </w:tc>
       </w:tr>
       <w:tr>
-        <w:tblPrEx>
-          <w:tblCellMar>
-            <w:top w:w="0" w:type="dxa"/>
-            <w:bottom w:w="0" w:type="dxa"/>
-          </w:tblCellMar>
-        </w:tblPrEx>
         <w:tc>
           <w:tcPr>
             <w:tcW w:w="1800" w:type="dxa"/>
@@ -865,12 +832,6 @@
         </w:tc>
       </w:tr>
       <w:tr>
-        <w:tblPrEx>
-          <w:tblCellMar>
-            <w:top w:w="0" w:type="dxa"/>
-            <w:bottom w:w="0" w:type="dxa"/>
-          </w:tblCellMar>
-        </w:tblPrEx>
         <w:tc>
           <w:tcPr>
             <w:tcW w:w="1800" w:type="dxa"/>
@@ -988,12 +949,6 @@
         </w:tc>
       </w:tr>
       <w:tr>
-        <w:tblPrEx>
-          <w:tblCellMar>
-            <w:top w:w="0" w:type="dxa"/>
-            <w:bottom w:w="0" w:type="dxa"/>
-          </w:tblCellMar>
-        </w:tblPrEx>
         <w:tc>
           <w:tcPr>
             <w:tcW w:w="1800" w:type="dxa"/>
@@ -1111,12 +1066,6 @@
         </w:tc>
       </w:tr>
       <w:tr>
-        <w:tblPrEx>
-          <w:tblCellMar>
-            <w:top w:w="0" w:type="dxa"/>
-            <w:bottom w:w="0" w:type="dxa"/>
-          </w:tblCellMar>
-        </w:tblPrEx>
         <w:tc>
           <w:tcPr>
             <w:tcW w:w="1800" w:type="dxa"/>
@@ -1234,12 +1183,6 @@
         </w:tc>
       </w:tr>
       <w:tr>
-        <w:tblPrEx>
-          <w:tblCellMar>
-            <w:top w:w="0" w:type="dxa"/>
-            <w:bottom w:w="0" w:type="dxa"/>
-          </w:tblCellMar>
-        </w:tblPrEx>
         <w:tc>
           <w:tcPr>
             <w:tcW w:w="1800" w:type="dxa"/>
@@ -1357,12 +1300,6 @@
         </w:tc>
       </w:tr>
       <w:tr>
-        <w:tblPrEx>
-          <w:tblCellMar>
-            <w:top w:w="0" w:type="dxa"/>
-            <w:bottom w:w="0" w:type="dxa"/>
-          </w:tblCellMar>
-        </w:tblPrEx>
         <w:tc>
           <w:tcPr>
             <w:tcW w:w="1800" w:type="dxa"/>
@@ -1494,12 +1431,6 @@
         </w:tc>
       </w:tr>
       <w:tr>
-        <w:tblPrEx>
-          <w:tblCellMar>
-            <w:top w:w="0" w:type="dxa"/>
-            <w:bottom w:w="0" w:type="dxa"/>
-          </w:tblCellMar>
-        </w:tblPrEx>
         <w:tc>
           <w:tcPr>
             <w:tcW w:w="1800" w:type="dxa"/>
@@ -1617,12 +1548,6 @@
         </w:tc>
       </w:tr>
       <w:tr>
-        <w:tblPrEx>
-          <w:tblCellMar>
-            <w:top w:w="0" w:type="dxa"/>
-            <w:bottom w:w="0" w:type="dxa"/>
-          </w:tblCellMar>
-        </w:tblPrEx>
         <w:tc>
           <w:tcPr>
             <w:tcW w:w="1800" w:type="dxa"/>
@@ -1740,12 +1665,6 @@
         </w:tc>
       </w:tr>
       <w:tr>
-        <w:tblPrEx>
-          <w:tblCellMar>
-            <w:top w:w="0" w:type="dxa"/>
-            <w:bottom w:w="0" w:type="dxa"/>
-          </w:tblCellMar>
-        </w:tblPrEx>
         <w:tc>
           <w:tcPr>
             <w:tcW w:w="1800" w:type="dxa"/>
@@ -1890,7 +1809,11 @@
         <w:jc w:val="both"/>
       </w:pPr>
       <w:r>
-        <w:t>IoTGuard, beş temel nesne yönelimli programlama prensibini gerçek dünya senaryolarına dayalı olarak kapsamlı biçimde uygulamaktadır. Aşağıdaki tablo bu prensiplerin proje içindeki karşılıklarını özetlemektedir.</w:t>
+        <w:t xml:space="preserve">IoTGuard, beş temel nesne yönelimli programlama prensibini gerçek dünya senaryolarına dayalı olarak kapsamlı biçimde uygulamaktadır. </w:t>
+      </w:r>
+      <w:r>
+        <w:lastRenderedPageBreak/>
+        <w:t>Aşağıdaki tablo bu prensiplerin proje içindeki karşılıklarını özetlemektedir.</w:t>
       </w:r>
     </w:p>
     <w:p>
@@ -1910,7 +1833,6 @@
           <w:sz w:val="18"/>
           <w:szCs w:val="18"/>
         </w:rPr>
-        <w:lastRenderedPageBreak/>
         <w:t>TABLO II. OOP PRENSİPLERİ VE UYGULAMALARI</w:t>
       </w:r>
     </w:p>
@@ -1937,12 +1859,6 @@
         <w:gridCol w:w="4400"/>
       </w:tblGrid>
       <w:tr>
-        <w:tblPrEx>
-          <w:tblCellMar>
-            <w:top w:w="0" w:type="dxa"/>
-            <w:bottom w:w="0" w:type="dxa"/>
-          </w:tblCellMar>
-        </w:tblPrEx>
         <w:trPr>
           <w:tblHeader/>
         </w:trPr>
@@ -2035,12 +1951,6 @@
         </w:tc>
       </w:tr>
       <w:tr>
-        <w:tblPrEx>
-          <w:tblCellMar>
-            <w:top w:w="0" w:type="dxa"/>
-            <w:bottom w:w="0" w:type="dxa"/>
-          </w:tblCellMar>
-        </w:tblPrEx>
         <w:tc>
           <w:tcPr>
             <w:tcW w:w="2200" w:type="dxa"/>
@@ -2124,12 +2034,6 @@
         </w:tc>
       </w:tr>
       <w:tr>
-        <w:tblPrEx>
-          <w:tblCellMar>
-            <w:top w:w="0" w:type="dxa"/>
-            <w:bottom w:w="0" w:type="dxa"/>
-          </w:tblCellMar>
-        </w:tblPrEx>
         <w:tc>
           <w:tcPr>
             <w:tcW w:w="2200" w:type="dxa"/>
@@ -2213,12 +2117,6 @@
         </w:tc>
       </w:tr>
       <w:tr>
-        <w:tblPrEx>
-          <w:tblCellMar>
-            <w:top w:w="0" w:type="dxa"/>
-            <w:bottom w:w="0" w:type="dxa"/>
-          </w:tblCellMar>
-        </w:tblPrEx>
         <w:tc>
           <w:tcPr>
             <w:tcW w:w="2200" w:type="dxa"/>
@@ -2330,12 +2228,6 @@
         </w:tc>
       </w:tr>
       <w:tr>
-        <w:tblPrEx>
-          <w:tblCellMar>
-            <w:top w:w="0" w:type="dxa"/>
-            <w:bottom w:w="0" w:type="dxa"/>
-          </w:tblCellMar>
-        </w:tblPrEx>
         <w:tc>
           <w:tcPr>
             <w:tcW w:w="2200" w:type="dxa"/>
@@ -2433,12 +2325,6 @@
         </w:tc>
       </w:tr>
       <w:tr>
-        <w:tblPrEx>
-          <w:tblCellMar>
-            <w:top w:w="0" w:type="dxa"/>
-            <w:bottom w:w="0" w:type="dxa"/>
-          </w:tblCellMar>
-        </w:tblPrEx>
         <w:tc>
           <w:tcPr>
             <w:tcW w:w="2200" w:type="dxa"/>
@@ -2686,12 +2572,6 @@
         <w:gridCol w:w="4560"/>
       </w:tblGrid>
       <w:tr>
-        <w:tblPrEx>
-          <w:tblCellMar>
-            <w:top w:w="0" w:type="dxa"/>
-            <w:bottom w:w="0" w:type="dxa"/>
-          </w:tblCellMar>
-        </w:tblPrEx>
         <w:trPr>
           <w:tblHeader/>
         </w:trPr>
@@ -2784,12 +2664,6 @@
         </w:tc>
       </w:tr>
       <w:tr>
-        <w:tblPrEx>
-          <w:tblCellMar>
-            <w:top w:w="0" w:type="dxa"/>
-            <w:bottom w:w="0" w:type="dxa"/>
-          </w:tblCellMar>
-        </w:tblPrEx>
         <w:tc>
           <w:tcPr>
             <w:tcW w:w="2000" w:type="dxa"/>
@@ -2873,12 +2747,6 @@
         </w:tc>
       </w:tr>
       <w:tr>
-        <w:tblPrEx>
-          <w:tblCellMar>
-            <w:top w:w="0" w:type="dxa"/>
-            <w:bottom w:w="0" w:type="dxa"/>
-          </w:tblCellMar>
-        </w:tblPrEx>
         <w:tc>
           <w:tcPr>
             <w:tcW w:w="2000" w:type="dxa"/>
@@ -2976,12 +2844,6 @@
         </w:tc>
       </w:tr>
       <w:tr>
-        <w:tblPrEx>
-          <w:tblCellMar>
-            <w:top w:w="0" w:type="dxa"/>
-            <w:bottom w:w="0" w:type="dxa"/>
-          </w:tblCellMar>
-        </w:tblPrEx>
         <w:tc>
           <w:tcPr>
             <w:tcW w:w="2000" w:type="dxa"/>
@@ -3065,12 +2927,6 @@
         </w:tc>
       </w:tr>
       <w:tr>
-        <w:tblPrEx>
-          <w:tblCellMar>
-            <w:top w:w="0" w:type="dxa"/>
-            <w:bottom w:w="0" w:type="dxa"/>
-          </w:tblCellMar>
-        </w:tblPrEx>
         <w:tc>
           <w:tcPr>
             <w:tcW w:w="2000" w:type="dxa"/>
@@ -3154,12 +3010,6 @@
         </w:tc>
       </w:tr>
       <w:tr>
-        <w:tblPrEx>
-          <w:tblCellMar>
-            <w:top w:w="0" w:type="dxa"/>
-            <w:bottom w:w="0" w:type="dxa"/>
-          </w:tblCellMar>
-        </w:tblPrEx>
         <w:tc>
           <w:tcPr>
             <w:tcW w:w="2000" w:type="dxa"/>
@@ -3372,6 +3222,7 @@
         <w:jc w:val="both"/>
       </w:pPr>
       <w:r>
+        <w:lastRenderedPageBreak/>
         <w:t xml:space="preserve">Proje, </w:t>
       </w:r>
       <w:r>
@@ -3683,6 +3534,54 @@
       </w:pPr>
       <w:r>
         <w:t>[5] M. Yüce, IoTGuard-OOP-PROJE-, GitHub deposu, 2024. [Çevrimiçi]. Mevcut: https://github.com/hmertyuce/IoTGuard-OOP-PROJE-</w:t>
+      </w:r>
+    </w:p>
+    <w:p>
+      <w:pPr>
+        <w:spacing w:before="60" w:after="60"/>
+        <w:jc w:val="both"/>
+      </w:pPr>
+      <w:r>
+        <w:rPr>
+          <w:b/>
+        </w:rPr>
+        <w:t>SON GÃœNCELLEMELER (V2.0 C++ EDITION):</w:t>
+      </w:r>
+    </w:p>
+    <w:p>
+      <w:pPr>
+        <w:spacing w:before="60" w:after="60"/>
+        <w:jc w:val="both"/>
+      </w:pPr>
+      <w:r>
+        <w:t>- Proje yapÄ±sÄ± karmaÅŸÄ±klÄ±ÄŸÄ± Ã¶nlemek adÄ±na Tek-Dosya (main.cpp) mimarisine geÃ§irilmiÅŸtir.</w:t>
+      </w:r>
+    </w:p>
+    <w:p>
+      <w:pPr>
+        <w:spacing w:before="60" w:after="60"/>
+        <w:jc w:val="both"/>
+      </w:pPr>
+      <w:r>
+        <w:t>- ANSI renk kodlarÄ± ve daktilo (typing) animasyonlarÄ± ile geliÅŸmiÅŸ interaktif TUI (Metin TabanlÄ± ArayÃ¼z) entegre edilmiÅŸtir.</w:t>
+      </w:r>
+    </w:p>
+    <w:p>
+      <w:pPr>
+        <w:spacing w:before="60" w:after="60"/>
+        <w:jc w:val="both"/>
+      </w:pPr>
+      <w:r>
+        <w:t>- YÃ¶netici (Admin) GiriÅŸ paneli eklenmiÅŸ ve ÅŸifre maskeleme Ã¶zellikleri uygulanmÄ±ÅŸtÄ±r.</w:t>
+      </w:r>
+    </w:p>
+    <w:p>
+      <w:pPr>
+        <w:spacing w:before="60" w:after="60"/>
+        <w:jc w:val="both"/>
+      </w:pPr>
+      <w:r>
+        <w:t>- Multi-Threaded tarama animasyonlarÄ± (Progress Bar) ve Matrix dijital yaÄŸmur efekti sisteme dahil edilmiÅŸtir.</w:t>
       </w:r>
     </w:p>
     <w:sectPr>

</xml_diff>

<commit_message>
docs: Word raporlarındaki tablo kayma sorunları çözüldü, tam ad ve numara (Hayati Mert Yüce - 244410036) eklendi
</commit_message>
<xml_diff>
--- a/docs/IoTGuard_Rapor_TR.docx
+++ b/docs/IoTGuard_Rapor_TR.docx
@@ -19,7 +19,7 @@
     </w:p>
     <w:tbl>
       <w:tblPr>
-        <w:tblW w:w="9360" w:type="dxa"/>
+        <w:tblW w:w="5000" w:type="pct"/>
         <w:tblBorders>
           <w:top w:val="single" w:sz="4" w:space="0" w:color="auto"/>
           <w:left w:val="single" w:sz="4" w:space="0" w:color="auto"/>
@@ -35,13 +35,19 @@
         <w:tblLook w:val="04A0" w:firstRow="1" w:lastRow="0" w:firstColumn="1" w:lastColumn="0" w:noHBand="0" w:noVBand="1"/>
       </w:tblPr>
       <w:tblGrid>
-        <w:gridCol w:w="4680"/>
-        <w:gridCol w:w="4680"/>
+        <w:gridCol w:w="2465"/>
+        <w:gridCol w:w="1855"/>
       </w:tblGrid>
       <w:tr>
-        <w:tc>
-          <w:tcPr>
-            <w:tcW w:w="4680" w:type="dxa"/>
+        <w:tblPrEx>
+          <w:tblCellMar>
+            <w:top w:w="0" w:type="dxa"/>
+            <w:bottom w:w="0" w:type="dxa"/>
+          </w:tblCellMar>
+        </w:tblPrEx>
+        <w:tc>
+          <w:tcPr>
+            <w:tcW w:w="2500" w:type="pct"/>
             <w:tcBorders>
               <w:top w:val="none" w:sz="0" w:space="0" w:color="FFFFFF"/>
               <w:left w:val="none" w:sz="0" w:space="0" w:color="FFFFFF"/>
@@ -92,7 +98,7 @@
         </w:tc>
         <w:tc>
           <w:tcPr>
-            <w:tcW w:w="4680" w:type="dxa"/>
+            <w:tcW w:w="2500" w:type="pct"/>
             <w:tcBorders>
               <w:top w:val="none" w:sz="0" w:space="0" w:color="FFFFFF"/>
               <w:left w:val="none" w:sz="0" w:space="0" w:color="FFFFFF"/>
@@ -167,7 +173,10 @@
         <w:t>C++</w:t>
       </w:r>
       <w:r>
-        <w:t xml:space="preserve"> SE dili kullanılarak geliştirilmiş IoTGuard adlı bir gömülü cihaz güvenlik monitörü sistemi sunulmaktadır. Sistem; güvenlik kamerası, internet yönlendiricisi ve akıllı kapı kilidi gibi IoT cihazlarını merkezi bir yapı üzerinden izlemekte, çoklu iş parçacığı (multi-threading) ile eşzamanlı güvenlik taramaları gerçekleştirmekte, olası siber tehditleri ve donanım arızalarını tespit ederek hem konsola hem de dosyaya raporlamaktadır. Proje; kalıtım, çok biçimlilik, soyutlama, arayüz ve kapsülleme gibi temel OOP prensiplerini kapsamlı biçimde uygulamaktadır.</w:t>
+        <w:t xml:space="preserve"> SE dili kullanılarak geliştirilmiş IoTGuard adlı bir gömülü cihaz güvenlik monitörü sistemi sunulmaktadır. Sistem; güvenlik kamerası, internet yönlendiricisi ve akıllı kapı kilidi gibi IoT cihazlarını merkezi bir yapı üzerinden izlemekte, çoklu iş parçacığı (multi-threading) ile eşzamanlı güvenlik taramaları gerçekleştirmekte, olası siber tehditleri ve donanım arızalarını tespit ederek hem konsola hem de dosyaya raporlamaktadır. Proje; kalıtım, çok biçimlilik, soyutlama, arayüz ve kapsülleme gibi temel OOP</w:t>
+      </w:r>
+      <w:r>
+        <w:t xml:space="preserve"> prensiplerini kapsamlı biçimde uygulamaktadır.</w:t>
       </w:r>
     </w:p>
     <w:p>
@@ -293,10 +302,10 @@
         <w:jc w:val="both"/>
       </w:pPr>
       <w:r>
-        <w:t>Proje, sorumlulukları net biçimde ayıran üç katmanlı bir paket mimarisi üzerine inşa edilmiştir. iotguard.core paketi sistemin çekirdeğini oluşturan Monitorable arayüzü, SecurityMonitor ve LogManager sınıflarını barındırmaktadır. iotguard.devices paketi soyut Device sınıfını ve buna türeyen Camera, Router, SmartLock somut sınıflarını içermektedir. iotguard.events paketi ise SecurityEvent, EventSeverity ve DeviceFailure</w:t>
-      </w:r>
-      <w:r>
-        <w:t>std::exception</w:t>
+        <w:t xml:space="preserve">Proje, sorumlulukları net biçimde ayıran üç katmanlı bir paket mimarisi üzerine inşa edilmiştir. iotguard.core paketi sistemin çekirdeğini oluşturan Monitorable arayüzü, SecurityMonitor ve LogManager sınıflarını barındırmaktadır. iotguard.devices paketi soyut Device sınıfını ve buna türeyen Camera, Router, SmartLock somut sınıflarını içermektedir. iotguard.events paketi ise SecurityEvent, EventSeverity ve </w:t>
+      </w:r>
+      <w:r>
+        <w:t>DeviceFailureException</w:t>
       </w:r>
       <w:r>
         <w:t xml:space="preserve"> bileşenlerini kapsamaktadır.</w:t>
@@ -338,7 +347,7 @@
     </w:p>
     <w:tbl>
       <w:tblPr>
-        <w:tblW w:w="9360" w:type="dxa"/>
+        <w:tblW w:w="5000" w:type="pct"/>
         <w:tblBorders>
           <w:top w:val="single" w:sz="4" w:space="0" w:color="auto"/>
           <w:left w:val="single" w:sz="4" w:space="0" w:color="auto"/>
@@ -354,18 +363,24 @@
         <w:tblLook w:val="04A0" w:firstRow="1" w:lastRow="0" w:firstColumn="1" w:lastColumn="0" w:noHBand="0" w:noVBand="1"/>
       </w:tblPr>
       <w:tblGrid>
-        <w:gridCol w:w="2535"/>
-        <w:gridCol w:w="1127"/>
-        <w:gridCol w:w="1560"/>
-        <w:gridCol w:w="4138"/>
+        <w:gridCol w:w="1620"/>
+        <w:gridCol w:w="621"/>
+        <w:gridCol w:w="1019"/>
+        <w:gridCol w:w="1050"/>
       </w:tblGrid>
       <w:tr>
+        <w:tblPrEx>
+          <w:tblCellMar>
+            <w:top w:w="0" w:type="dxa"/>
+            <w:bottom w:w="0" w:type="dxa"/>
+          </w:tblCellMar>
+        </w:tblPrEx>
         <w:trPr>
           <w:tblHeader/>
         </w:trPr>
         <w:tc>
           <w:tcPr>
-            <w:tcW w:w="1800" w:type="dxa"/>
+            <w:tcW w:w="1205" w:type="pct"/>
             <w:tcBorders>
               <w:top w:val="single" w:sz="4" w:space="0" w:color="000000"/>
               <w:left w:val="single" w:sz="4" w:space="0" w:color="000000"/>
@@ -394,7 +409,7 @@
         </w:tc>
         <w:tc>
           <w:tcPr>
-            <w:tcW w:w="1200" w:type="dxa"/>
+            <w:tcW w:w="617" w:type="pct"/>
             <w:tcBorders>
               <w:top w:val="single" w:sz="4" w:space="0" w:color="000000"/>
               <w:left w:val="single" w:sz="4" w:space="0" w:color="000000"/>
@@ -423,7 +438,7 @@
         </w:tc>
         <w:tc>
           <w:tcPr>
-            <w:tcW w:w="1600" w:type="dxa"/>
+            <w:tcW w:w="841" w:type="pct"/>
             <w:tcBorders>
               <w:top w:val="single" w:sz="4" w:space="0" w:color="000000"/>
               <w:left w:val="single" w:sz="4" w:space="0" w:color="000000"/>
@@ -452,7 +467,7 @@
         </w:tc>
         <w:tc>
           <w:tcPr>
-            <w:tcW w:w="4760" w:type="dxa"/>
+            <w:tcW w:w="2337" w:type="pct"/>
             <w:tcBorders>
               <w:top w:val="single" w:sz="4" w:space="0" w:color="000000"/>
               <w:left w:val="single" w:sz="4" w:space="0" w:color="000000"/>
@@ -481,9 +496,15 @@
         </w:tc>
       </w:tr>
       <w:tr>
-        <w:tc>
-          <w:tcPr>
-            <w:tcW w:w="1800" w:type="dxa"/>
+        <w:tblPrEx>
+          <w:tblCellMar>
+            <w:top w:w="0" w:type="dxa"/>
+            <w:bottom w:w="0" w:type="dxa"/>
+          </w:tblCellMar>
+        </w:tblPrEx>
+        <w:tc>
+          <w:tcPr>
+            <w:tcW w:w="1205" w:type="pct"/>
             <w:tcBorders>
               <w:top w:val="single" w:sz="4" w:space="0" w:color="000000"/>
               <w:left w:val="single" w:sz="4" w:space="0" w:color="000000"/>
@@ -517,34 +538,34 @@
         </w:tc>
         <w:tc>
           <w:tcPr>
-            <w:tcW w:w="1200" w:type="dxa"/>
-            <w:tcBorders>
-              <w:top w:val="single" w:sz="4" w:space="0" w:color="000000"/>
-              <w:left w:val="single" w:sz="4" w:space="0" w:color="000000"/>
-              <w:bottom w:val="single" w:sz="4" w:space="0" w:color="000000"/>
-              <w:right w:val="single" w:sz="4" w:space="0" w:color="000000"/>
-            </w:tcBorders>
-            <w:shd w:val="clear" w:color="auto" w:fill="FFFFFF"/>
-            <w:tcMar>
-              <w:top w:w="60" w:type="dxa"/>
-              <w:left w:w="100" w:type="dxa"/>
-              <w:bottom w:w="60" w:type="dxa"/>
-              <w:right w:w="100" w:type="dxa"/>
-            </w:tcMar>
-          </w:tcPr>
-          <w:p>
-            <w:r>
-              <w:rPr>
-                <w:sz w:val="18"/>
-                <w:szCs w:val="18"/>
-              </w:rPr>
-              <w:t>Abstract Class (Pure Virtual)</w:t>
-            </w:r>
-          </w:p>
-        </w:tc>
-        <w:tc>
-          <w:tcPr>
-            <w:tcW w:w="1600" w:type="dxa"/>
+            <w:tcW w:w="617" w:type="pct"/>
+            <w:tcBorders>
+              <w:top w:val="single" w:sz="4" w:space="0" w:color="000000"/>
+              <w:left w:val="single" w:sz="4" w:space="0" w:color="000000"/>
+              <w:bottom w:val="single" w:sz="4" w:space="0" w:color="000000"/>
+              <w:right w:val="single" w:sz="4" w:space="0" w:color="000000"/>
+            </w:tcBorders>
+            <w:shd w:val="clear" w:color="auto" w:fill="FFFFFF"/>
+            <w:tcMar>
+              <w:top w:w="60" w:type="dxa"/>
+              <w:left w:w="100" w:type="dxa"/>
+              <w:bottom w:w="60" w:type="dxa"/>
+              <w:right w:w="100" w:type="dxa"/>
+            </w:tcMar>
+          </w:tcPr>
+          <w:p>
+            <w:r>
+              <w:rPr>
+                <w:sz w:val="18"/>
+                <w:szCs w:val="18"/>
+              </w:rPr>
+              <w:t>Saf Sanal</w:t>
+            </w:r>
+          </w:p>
+        </w:tc>
+        <w:tc>
+          <w:tcPr>
+            <w:tcW w:w="841" w:type="pct"/>
             <w:tcBorders>
               <w:top w:val="single" w:sz="4" w:space="0" w:color="000000"/>
               <w:left w:val="single" w:sz="4" w:space="0" w:color="000000"/>
@@ -571,7 +592,7 @@
         </w:tc>
         <w:tc>
           <w:tcPr>
-            <w:tcW w:w="4760" w:type="dxa"/>
+            <w:tcW w:w="2337" w:type="pct"/>
             <w:tcBorders>
               <w:top w:val="single" w:sz="4" w:space="0" w:color="000000"/>
               <w:left w:val="single" w:sz="4" w:space="0" w:color="000000"/>
@@ -598,9 +619,15 @@
         </w:tc>
       </w:tr>
       <w:tr>
-        <w:tc>
-          <w:tcPr>
-            <w:tcW w:w="1800" w:type="dxa"/>
+        <w:tblPrEx>
+          <w:tblCellMar>
+            <w:top w:w="0" w:type="dxa"/>
+            <w:bottom w:w="0" w:type="dxa"/>
+          </w:tblCellMar>
+        </w:tblPrEx>
+        <w:tc>
+          <w:tcPr>
+            <w:tcW w:w="1205" w:type="pct"/>
             <w:tcBorders>
               <w:top w:val="single" w:sz="4" w:space="0" w:color="000000"/>
               <w:left w:val="single" w:sz="4" w:space="0" w:color="000000"/>
@@ -634,7 +661,7 @@
         </w:tc>
         <w:tc>
           <w:tcPr>
-            <w:tcW w:w="1200" w:type="dxa"/>
+            <w:tcW w:w="617" w:type="pct"/>
             <w:tcBorders>
               <w:top w:val="single" w:sz="4" w:space="0" w:color="000000"/>
               <w:left w:val="single" w:sz="4" w:space="0" w:color="000000"/>
@@ -661,7 +688,7 @@
         </w:tc>
         <w:tc>
           <w:tcPr>
-            <w:tcW w:w="1600" w:type="dxa"/>
+            <w:tcW w:w="841" w:type="pct"/>
             <w:tcBorders>
               <w:top w:val="single" w:sz="4" w:space="0" w:color="000000"/>
               <w:left w:val="single" w:sz="4" w:space="0" w:color="000000"/>
@@ -688,7 +715,7 @@
         </w:tc>
         <w:tc>
           <w:tcPr>
-            <w:tcW w:w="4760" w:type="dxa"/>
+            <w:tcW w:w="2337" w:type="pct"/>
             <w:tcBorders>
               <w:top w:val="single" w:sz="4" w:space="0" w:color="000000"/>
               <w:left w:val="single" w:sz="4" w:space="0" w:color="000000"/>
@@ -715,9 +742,15 @@
         </w:tc>
       </w:tr>
       <w:tr>
-        <w:tc>
-          <w:tcPr>
-            <w:tcW w:w="1800" w:type="dxa"/>
+        <w:tblPrEx>
+          <w:tblCellMar>
+            <w:top w:w="0" w:type="dxa"/>
+            <w:bottom w:w="0" w:type="dxa"/>
+          </w:tblCellMar>
+        </w:tblPrEx>
+        <w:tc>
+          <w:tcPr>
+            <w:tcW w:w="1205" w:type="pct"/>
             <w:tcBorders>
               <w:top w:val="single" w:sz="4" w:space="0" w:color="000000"/>
               <w:left w:val="single" w:sz="4" w:space="0" w:color="000000"/>
@@ -751,7 +784,7 @@
         </w:tc>
         <w:tc>
           <w:tcPr>
-            <w:tcW w:w="1200" w:type="dxa"/>
+            <w:tcW w:w="617" w:type="pct"/>
             <w:tcBorders>
               <w:top w:val="single" w:sz="4" w:space="0" w:color="000000"/>
               <w:left w:val="single" w:sz="4" w:space="0" w:color="000000"/>
@@ -778,7 +811,7 @@
         </w:tc>
         <w:tc>
           <w:tcPr>
-            <w:tcW w:w="1600" w:type="dxa"/>
+            <w:tcW w:w="841" w:type="pct"/>
             <w:tcBorders>
               <w:top w:val="single" w:sz="4" w:space="0" w:color="000000"/>
               <w:left w:val="single" w:sz="4" w:space="0" w:color="000000"/>
@@ -805,7 +838,7 @@
         </w:tc>
         <w:tc>
           <w:tcPr>
-            <w:tcW w:w="4760" w:type="dxa"/>
+            <w:tcW w:w="2337" w:type="pct"/>
             <w:tcBorders>
               <w:top w:val="single" w:sz="4" w:space="0" w:color="000000"/>
               <w:left w:val="single" w:sz="4" w:space="0" w:color="000000"/>
@@ -832,29 +865,36 @@
         </w:tc>
       </w:tr>
       <w:tr>
-        <w:tc>
-          <w:tcPr>
-            <w:tcW w:w="1800" w:type="dxa"/>
-            <w:tcBorders>
-              <w:top w:val="single" w:sz="4" w:space="0" w:color="000000"/>
-              <w:left w:val="single" w:sz="4" w:space="0" w:color="000000"/>
-              <w:bottom w:val="single" w:sz="4" w:space="0" w:color="000000"/>
-              <w:right w:val="single" w:sz="4" w:space="0" w:color="000000"/>
-            </w:tcBorders>
-            <w:shd w:val="clear" w:color="auto" w:fill="FFFFFF"/>
-            <w:tcMar>
-              <w:top w:w="60" w:type="dxa"/>
-              <w:left w:w="100" w:type="dxa"/>
-              <w:bottom w:w="60" w:type="dxa"/>
-              <w:right w:w="100" w:type="dxa"/>
-            </w:tcMar>
-          </w:tcPr>
-          <w:p>
-            <w:r>
-              <w:rPr>
-                <w:sz w:val="18"/>
-                <w:szCs w:val="18"/>
-              </w:rPr>
+        <w:tblPrEx>
+          <w:tblCellMar>
+            <w:top w:w="0" w:type="dxa"/>
+            <w:bottom w:w="0" w:type="dxa"/>
+          </w:tblCellMar>
+        </w:tblPrEx>
+        <w:tc>
+          <w:tcPr>
+            <w:tcW w:w="1205" w:type="pct"/>
+            <w:tcBorders>
+              <w:top w:val="single" w:sz="4" w:space="0" w:color="000000"/>
+              <w:left w:val="single" w:sz="4" w:space="0" w:color="000000"/>
+              <w:bottom w:val="single" w:sz="4" w:space="0" w:color="000000"/>
+              <w:right w:val="single" w:sz="4" w:space="0" w:color="000000"/>
+            </w:tcBorders>
+            <w:shd w:val="clear" w:color="auto" w:fill="FFFFFF"/>
+            <w:tcMar>
+              <w:top w:w="60" w:type="dxa"/>
+              <w:left w:w="100" w:type="dxa"/>
+              <w:bottom w:w="60" w:type="dxa"/>
+              <w:right w:w="100" w:type="dxa"/>
+            </w:tcMar>
+          </w:tcPr>
+          <w:p>
+            <w:r>
+              <w:rPr>
+                <w:sz w:val="18"/>
+                <w:szCs w:val="18"/>
+              </w:rPr>
+              <w:lastRenderedPageBreak/>
               <w:t>Router</w:t>
             </w:r>
             <w:r>
@@ -868,7 +908,7 @@
         </w:tc>
         <w:tc>
           <w:tcPr>
-            <w:tcW w:w="1200" w:type="dxa"/>
+            <w:tcW w:w="617" w:type="pct"/>
             <w:tcBorders>
               <w:top w:val="single" w:sz="4" w:space="0" w:color="000000"/>
               <w:left w:val="single" w:sz="4" w:space="0" w:color="000000"/>
@@ -895,7 +935,7 @@
         </w:tc>
         <w:tc>
           <w:tcPr>
-            <w:tcW w:w="1600" w:type="dxa"/>
+            <w:tcW w:w="841" w:type="pct"/>
             <w:tcBorders>
               <w:top w:val="single" w:sz="4" w:space="0" w:color="000000"/>
               <w:left w:val="single" w:sz="4" w:space="0" w:color="000000"/>
@@ -922,7 +962,7 @@
         </w:tc>
         <w:tc>
           <w:tcPr>
-            <w:tcW w:w="4760" w:type="dxa"/>
+            <w:tcW w:w="2337" w:type="pct"/>
             <w:tcBorders>
               <w:top w:val="single" w:sz="4" w:space="0" w:color="000000"/>
               <w:left w:val="single" w:sz="4" w:space="0" w:color="000000"/>
@@ -949,9 +989,15 @@
         </w:tc>
       </w:tr>
       <w:tr>
-        <w:tc>
-          <w:tcPr>
-            <w:tcW w:w="1800" w:type="dxa"/>
+        <w:tblPrEx>
+          <w:tblCellMar>
+            <w:top w:w="0" w:type="dxa"/>
+            <w:bottom w:w="0" w:type="dxa"/>
+          </w:tblCellMar>
+        </w:tblPrEx>
+        <w:tc>
+          <w:tcPr>
+            <w:tcW w:w="1205" w:type="pct"/>
             <w:tcBorders>
               <w:top w:val="single" w:sz="4" w:space="0" w:color="000000"/>
               <w:left w:val="single" w:sz="4" w:space="0" w:color="000000"/>
@@ -985,7 +1031,7 @@
         </w:tc>
         <w:tc>
           <w:tcPr>
-            <w:tcW w:w="1200" w:type="dxa"/>
+            <w:tcW w:w="617" w:type="pct"/>
             <w:tcBorders>
               <w:top w:val="single" w:sz="4" w:space="0" w:color="000000"/>
               <w:left w:val="single" w:sz="4" w:space="0" w:color="000000"/>
@@ -1012,7 +1058,7 @@
         </w:tc>
         <w:tc>
           <w:tcPr>
-            <w:tcW w:w="1600" w:type="dxa"/>
+            <w:tcW w:w="841" w:type="pct"/>
             <w:tcBorders>
               <w:top w:val="single" w:sz="4" w:space="0" w:color="000000"/>
               <w:left w:val="single" w:sz="4" w:space="0" w:color="000000"/>
@@ -1039,7 +1085,7 @@
         </w:tc>
         <w:tc>
           <w:tcPr>
-            <w:tcW w:w="4760" w:type="dxa"/>
+            <w:tcW w:w="2337" w:type="pct"/>
             <w:tcBorders>
               <w:top w:val="single" w:sz="4" w:space="0" w:color="000000"/>
               <w:left w:val="single" w:sz="4" w:space="0" w:color="000000"/>
@@ -1066,9 +1112,15 @@
         </w:tc>
       </w:tr>
       <w:tr>
-        <w:tc>
-          <w:tcPr>
-            <w:tcW w:w="1800" w:type="dxa"/>
+        <w:tblPrEx>
+          <w:tblCellMar>
+            <w:top w:w="0" w:type="dxa"/>
+            <w:bottom w:w="0" w:type="dxa"/>
+          </w:tblCellMar>
+        </w:tblPrEx>
+        <w:tc>
+          <w:tcPr>
+            <w:tcW w:w="1205" w:type="pct"/>
             <w:tcBorders>
               <w:top w:val="single" w:sz="4" w:space="0" w:color="000000"/>
               <w:left w:val="single" w:sz="4" w:space="0" w:color="000000"/>
@@ -1102,7 +1154,7 @@
         </w:tc>
         <w:tc>
           <w:tcPr>
-            <w:tcW w:w="1200" w:type="dxa"/>
+            <w:tcW w:w="617" w:type="pct"/>
             <w:tcBorders>
               <w:top w:val="single" w:sz="4" w:space="0" w:color="000000"/>
               <w:left w:val="single" w:sz="4" w:space="0" w:color="000000"/>
@@ -1129,7 +1181,7 @@
         </w:tc>
         <w:tc>
           <w:tcPr>
-            <w:tcW w:w="1600" w:type="dxa"/>
+            <w:tcW w:w="841" w:type="pct"/>
             <w:tcBorders>
               <w:top w:val="single" w:sz="4" w:space="0" w:color="000000"/>
               <w:left w:val="single" w:sz="4" w:space="0" w:color="000000"/>
@@ -1156,7 +1208,7 @@
         </w:tc>
         <w:tc>
           <w:tcPr>
-            <w:tcW w:w="4760" w:type="dxa"/>
+            <w:tcW w:w="2337" w:type="pct"/>
             <w:tcBorders>
               <w:top w:val="single" w:sz="4" w:space="0" w:color="000000"/>
               <w:left w:val="single" w:sz="4" w:space="0" w:color="000000"/>
@@ -1183,9 +1235,15 @@
         </w:tc>
       </w:tr>
       <w:tr>
-        <w:tc>
-          <w:tcPr>
-            <w:tcW w:w="1800" w:type="dxa"/>
+        <w:tblPrEx>
+          <w:tblCellMar>
+            <w:top w:w="0" w:type="dxa"/>
+            <w:bottom w:w="0" w:type="dxa"/>
+          </w:tblCellMar>
+        </w:tblPrEx>
+        <w:tc>
+          <w:tcPr>
+            <w:tcW w:w="1205" w:type="pct"/>
             <w:tcBorders>
               <w:top w:val="single" w:sz="4" w:space="0" w:color="000000"/>
               <w:left w:val="single" w:sz="4" w:space="0" w:color="000000"/>
@@ -1219,7 +1277,7 @@
         </w:tc>
         <w:tc>
           <w:tcPr>
-            <w:tcW w:w="1200" w:type="dxa"/>
+            <w:tcW w:w="617" w:type="pct"/>
             <w:tcBorders>
               <w:top w:val="single" w:sz="4" w:space="0" w:color="000000"/>
               <w:left w:val="single" w:sz="4" w:space="0" w:color="000000"/>
@@ -1246,7 +1304,7 @@
         </w:tc>
         <w:tc>
           <w:tcPr>
-            <w:tcW w:w="1600" w:type="dxa"/>
+            <w:tcW w:w="841" w:type="pct"/>
             <w:tcBorders>
               <w:top w:val="single" w:sz="4" w:space="0" w:color="000000"/>
               <w:left w:val="single" w:sz="4" w:space="0" w:color="000000"/>
@@ -1273,7 +1331,7 @@
         </w:tc>
         <w:tc>
           <w:tcPr>
-            <w:tcW w:w="4760" w:type="dxa"/>
+            <w:tcW w:w="2337" w:type="pct"/>
             <w:tcBorders>
               <w:top w:val="single" w:sz="4" w:space="0" w:color="000000"/>
               <w:left w:val="single" w:sz="4" w:space="0" w:color="000000"/>
@@ -1300,43 +1358,42 @@
         </w:tc>
       </w:tr>
       <w:tr>
-        <w:tc>
-          <w:tcPr>
-            <w:tcW w:w="1800" w:type="dxa"/>
-            <w:tcBorders>
-              <w:top w:val="single" w:sz="4" w:space="0" w:color="000000"/>
-              <w:left w:val="single" w:sz="4" w:space="0" w:color="000000"/>
-              <w:bottom w:val="single" w:sz="4" w:space="0" w:color="000000"/>
-              <w:right w:val="single" w:sz="4" w:space="0" w:color="000000"/>
-            </w:tcBorders>
-            <w:shd w:val="clear" w:color="auto" w:fill="FFFFFF"/>
-            <w:tcMar>
-              <w:top w:w="60" w:type="dxa"/>
-              <w:left w:w="100" w:type="dxa"/>
-              <w:bottom w:w="60" w:type="dxa"/>
-              <w:right w:w="100" w:type="dxa"/>
-            </w:tcMar>
-          </w:tcPr>
-          <w:p>
-            <w:r>
-              <w:rPr>
-                <w:sz w:val="18"/>
-                <w:szCs w:val="18"/>
-              </w:rPr>
-              <w:t>DeviceFailure</w:t>
-            </w:r>
-            <w:r>
-              <w:rPr>
-                <w:sz w:val="18"/>
-                <w:szCs w:val="18"/>
-              </w:rPr>
-              <w:t>std::exception.cpp</w:t>
-            </w:r>
-          </w:p>
-        </w:tc>
-        <w:tc>
-          <w:tcPr>
-            <w:tcW w:w="1200" w:type="dxa"/>
+        <w:tblPrEx>
+          <w:tblCellMar>
+            <w:top w:w="0" w:type="dxa"/>
+            <w:bottom w:w="0" w:type="dxa"/>
+          </w:tblCellMar>
+        </w:tblPrEx>
+        <w:tc>
+          <w:tcPr>
+            <w:tcW w:w="1205" w:type="pct"/>
+            <w:tcBorders>
+              <w:top w:val="single" w:sz="4" w:space="0" w:color="000000"/>
+              <w:left w:val="single" w:sz="4" w:space="0" w:color="000000"/>
+              <w:bottom w:val="single" w:sz="4" w:space="0" w:color="000000"/>
+              <w:right w:val="single" w:sz="4" w:space="0" w:color="000000"/>
+            </w:tcBorders>
+            <w:shd w:val="clear" w:color="auto" w:fill="FFFFFF"/>
+            <w:tcMar>
+              <w:top w:w="60" w:type="dxa"/>
+              <w:left w:w="100" w:type="dxa"/>
+              <w:bottom w:w="60" w:type="dxa"/>
+              <w:right w:w="100" w:type="dxa"/>
+            </w:tcMar>
+          </w:tcPr>
+          <w:p>
+            <w:r>
+              <w:rPr>
+                <w:sz w:val="18"/>
+                <w:szCs w:val="18"/>
+              </w:rPr>
+              <w:t>DeviceFailureException.cpp</w:t>
+            </w:r>
+          </w:p>
+        </w:tc>
+        <w:tc>
+          <w:tcPr>
+            <w:tcW w:w="617" w:type="pct"/>
             <w:tcBorders>
               <w:top w:val="single" w:sz="4" w:space="0" w:color="000000"/>
               <w:left w:val="single" w:sz="4" w:space="0" w:color="000000"/>
@@ -1363,7 +1420,7 @@
         </w:tc>
         <w:tc>
           <w:tcPr>
-            <w:tcW w:w="1600" w:type="dxa"/>
+            <w:tcW w:w="841" w:type="pct"/>
             <w:tcBorders>
               <w:top w:val="single" w:sz="4" w:space="0" w:color="000000"/>
               <w:left w:val="single" w:sz="4" w:space="0" w:color="000000"/>
@@ -1390,50 +1447,42 @@
         </w:tc>
         <w:tc>
           <w:tcPr>
-            <w:tcW w:w="4760" w:type="dxa"/>
-            <w:tcBorders>
-              <w:top w:val="single" w:sz="4" w:space="0" w:color="000000"/>
-              <w:left w:val="single" w:sz="4" w:space="0" w:color="000000"/>
-              <w:bottom w:val="single" w:sz="4" w:space="0" w:color="000000"/>
-              <w:right w:val="single" w:sz="4" w:space="0" w:color="000000"/>
-            </w:tcBorders>
-            <w:shd w:val="clear" w:color="auto" w:fill="FFFFFF"/>
-            <w:tcMar>
-              <w:top w:w="60" w:type="dxa"/>
-              <w:left w:w="100" w:type="dxa"/>
-              <w:bottom w:w="60" w:type="dxa"/>
-              <w:right w:w="100" w:type="dxa"/>
-            </w:tcMar>
-          </w:tcPr>
-          <w:p>
-            <w:r>
-              <w:rPr>
-                <w:sz w:val="18"/>
-                <w:szCs w:val="18"/>
-              </w:rPr>
-              <w:t xml:space="preserve">Donanımsal arızaları temsil eden Checked </w:t>
-            </w:r>
-            <w:r>
-              <w:rPr>
-                <w:sz w:val="18"/>
-                <w:szCs w:val="18"/>
-              </w:rPr>
-              <w:t>std::exception</w:t>
-            </w:r>
-            <w:r>
-              <w:rPr>
-                <w:sz w:val="18"/>
-                <w:szCs w:val="18"/>
-              </w:rPr>
-              <w:t>; cihazlar %5 ihtimalle fırlatır, sistem try-catch ile yakalar.</w:t>
+            <w:tcW w:w="2337" w:type="pct"/>
+            <w:tcBorders>
+              <w:top w:val="single" w:sz="4" w:space="0" w:color="000000"/>
+              <w:left w:val="single" w:sz="4" w:space="0" w:color="000000"/>
+              <w:bottom w:val="single" w:sz="4" w:space="0" w:color="000000"/>
+              <w:right w:val="single" w:sz="4" w:space="0" w:color="000000"/>
+            </w:tcBorders>
+            <w:shd w:val="clear" w:color="auto" w:fill="FFFFFF"/>
+            <w:tcMar>
+              <w:top w:w="60" w:type="dxa"/>
+              <w:left w:w="100" w:type="dxa"/>
+              <w:bottom w:w="60" w:type="dxa"/>
+              <w:right w:w="100" w:type="dxa"/>
+            </w:tcMar>
+          </w:tcPr>
+          <w:p>
+            <w:r>
+              <w:rPr>
+                <w:sz w:val="18"/>
+                <w:szCs w:val="18"/>
+              </w:rPr>
+              <w:t>Donanımsal arızaları temsil eden Checked Exception; cihazlar %5 ihtimalle fırlatır, sistem try-catch ile yakalar.</w:t>
             </w:r>
           </w:p>
         </w:tc>
       </w:tr>
       <w:tr>
-        <w:tc>
-          <w:tcPr>
-            <w:tcW w:w="1800" w:type="dxa"/>
+        <w:tblPrEx>
+          <w:tblCellMar>
+            <w:top w:w="0" w:type="dxa"/>
+            <w:bottom w:w="0" w:type="dxa"/>
+          </w:tblCellMar>
+        </w:tblPrEx>
+        <w:tc>
+          <w:tcPr>
+            <w:tcW w:w="1205" w:type="pct"/>
             <w:tcBorders>
               <w:top w:val="single" w:sz="4" w:space="0" w:color="000000"/>
               <w:left w:val="single" w:sz="4" w:space="0" w:color="000000"/>
@@ -1467,7 +1516,7 @@
         </w:tc>
         <w:tc>
           <w:tcPr>
-            <w:tcW w:w="1200" w:type="dxa"/>
+            <w:tcW w:w="617" w:type="pct"/>
             <w:tcBorders>
               <w:top w:val="single" w:sz="4" w:space="0" w:color="000000"/>
               <w:left w:val="single" w:sz="4" w:space="0" w:color="000000"/>
@@ -1494,7 +1543,7 @@
         </w:tc>
         <w:tc>
           <w:tcPr>
-            <w:tcW w:w="1600" w:type="dxa"/>
+            <w:tcW w:w="841" w:type="pct"/>
             <w:tcBorders>
               <w:top w:val="single" w:sz="4" w:space="0" w:color="000000"/>
               <w:left w:val="single" w:sz="4" w:space="0" w:color="000000"/>
@@ -1521,36 +1570,49 @@
         </w:tc>
         <w:tc>
           <w:tcPr>
-            <w:tcW w:w="4760" w:type="dxa"/>
-            <w:tcBorders>
-              <w:top w:val="single" w:sz="4" w:space="0" w:color="000000"/>
-              <w:left w:val="single" w:sz="4" w:space="0" w:color="000000"/>
-              <w:bottom w:val="single" w:sz="4" w:space="0" w:color="000000"/>
-              <w:right w:val="single" w:sz="4" w:space="0" w:color="000000"/>
-            </w:tcBorders>
-            <w:shd w:val="clear" w:color="auto" w:fill="FFFFFF"/>
-            <w:tcMar>
-              <w:top w:w="60" w:type="dxa"/>
-              <w:left w:w="100" w:type="dxa"/>
-              <w:bottom w:w="60" w:type="dxa"/>
-              <w:right w:w="100" w:type="dxa"/>
-            </w:tcMar>
-          </w:tcPr>
-          <w:p>
-            <w:r>
-              <w:rPr>
-                <w:sz w:val="18"/>
-                <w:szCs w:val="18"/>
-              </w:rPr>
-              <w:t>Sistemin merkezi beyin; cihaz kaydı, thread tabanlı eşzamanlı tarama, thread-safe olay kaydetme ve log görüntüleme.</w:t>
+            <w:tcW w:w="2337" w:type="pct"/>
+            <w:tcBorders>
+              <w:top w:val="single" w:sz="4" w:space="0" w:color="000000"/>
+              <w:left w:val="single" w:sz="4" w:space="0" w:color="000000"/>
+              <w:bottom w:val="single" w:sz="4" w:space="0" w:color="000000"/>
+              <w:right w:val="single" w:sz="4" w:space="0" w:color="000000"/>
+            </w:tcBorders>
+            <w:shd w:val="clear" w:color="auto" w:fill="FFFFFF"/>
+            <w:tcMar>
+              <w:top w:w="60" w:type="dxa"/>
+              <w:left w:w="100" w:type="dxa"/>
+              <w:bottom w:w="60" w:type="dxa"/>
+              <w:right w:w="100" w:type="dxa"/>
+            </w:tcMar>
+          </w:tcPr>
+          <w:p>
+            <w:r>
+              <w:rPr>
+                <w:sz w:val="18"/>
+                <w:szCs w:val="18"/>
+              </w:rPr>
+              <w:t xml:space="preserve">Sistemin merkezi </w:t>
+            </w:r>
+            <w:r>
+              <w:rPr>
+                <w:sz w:val="18"/>
+                <w:szCs w:val="18"/>
+              </w:rPr>
+              <w:t>beyin; cihaz kaydı, thread tabanlı eşzamanlı tarama, thread-safe olay kaydetme ve log görüntüleme.</w:t>
             </w:r>
           </w:p>
         </w:tc>
       </w:tr>
       <w:tr>
-        <w:tc>
-          <w:tcPr>
-            <w:tcW w:w="1800" w:type="dxa"/>
+        <w:tblPrEx>
+          <w:tblCellMar>
+            <w:top w:w="0" w:type="dxa"/>
+            <w:bottom w:w="0" w:type="dxa"/>
+          </w:tblCellMar>
+        </w:tblPrEx>
+        <w:tc>
+          <w:tcPr>
+            <w:tcW w:w="1205" w:type="pct"/>
             <w:tcBorders>
               <w:top w:val="single" w:sz="4" w:space="0" w:color="000000"/>
               <w:left w:val="single" w:sz="4" w:space="0" w:color="000000"/>
@@ -1584,7 +1646,7 @@
         </w:tc>
         <w:tc>
           <w:tcPr>
-            <w:tcW w:w="1200" w:type="dxa"/>
+            <w:tcW w:w="617" w:type="pct"/>
             <w:tcBorders>
               <w:top w:val="single" w:sz="4" w:space="0" w:color="000000"/>
               <w:left w:val="single" w:sz="4" w:space="0" w:color="000000"/>
@@ -1611,7 +1673,7 @@
         </w:tc>
         <w:tc>
           <w:tcPr>
-            <w:tcW w:w="1600" w:type="dxa"/>
+            <w:tcW w:w="841" w:type="pct"/>
             <w:tcBorders>
               <w:top w:val="single" w:sz="4" w:space="0" w:color="000000"/>
               <w:left w:val="single" w:sz="4" w:space="0" w:color="000000"/>
@@ -1638,36 +1700,49 @@
         </w:tc>
         <w:tc>
           <w:tcPr>
-            <w:tcW w:w="4760" w:type="dxa"/>
-            <w:tcBorders>
-              <w:top w:val="single" w:sz="4" w:space="0" w:color="000000"/>
-              <w:left w:val="single" w:sz="4" w:space="0" w:color="000000"/>
-              <w:bottom w:val="single" w:sz="4" w:space="0" w:color="000000"/>
-              <w:right w:val="single" w:sz="4" w:space="0" w:color="000000"/>
-            </w:tcBorders>
-            <w:shd w:val="clear" w:color="auto" w:fill="FFFFFF"/>
-            <w:tcMar>
-              <w:top w:w="60" w:type="dxa"/>
-              <w:left w:w="100" w:type="dxa"/>
-              <w:bottom w:w="60" w:type="dxa"/>
-              <w:right w:w="100" w:type="dxa"/>
-            </w:tcMar>
-          </w:tcPr>
-          <w:p>
-            <w:r>
-              <w:rPr>
-                <w:sz w:val="18"/>
-                <w:szCs w:val="18"/>
-              </w:rPr>
-              <w:t>BufferedWriter ile güvenlik olaylarını security_logs.txt dosyasına kalıcı olarak kaydeder.</w:t>
+            <w:tcW w:w="2337" w:type="pct"/>
+            <w:tcBorders>
+              <w:top w:val="single" w:sz="4" w:space="0" w:color="000000"/>
+              <w:left w:val="single" w:sz="4" w:space="0" w:color="000000"/>
+              <w:bottom w:val="single" w:sz="4" w:space="0" w:color="000000"/>
+              <w:right w:val="single" w:sz="4" w:space="0" w:color="000000"/>
+            </w:tcBorders>
+            <w:shd w:val="clear" w:color="auto" w:fill="FFFFFF"/>
+            <w:tcMar>
+              <w:top w:w="60" w:type="dxa"/>
+              <w:left w:w="100" w:type="dxa"/>
+              <w:bottom w:w="60" w:type="dxa"/>
+              <w:right w:w="100" w:type="dxa"/>
+            </w:tcMar>
+          </w:tcPr>
+          <w:p>
+            <w:r>
+              <w:rPr>
+                <w:sz w:val="18"/>
+                <w:szCs w:val="18"/>
+              </w:rPr>
+              <w:t>Std::ofstream</w:t>
+            </w:r>
+            <w:r>
+              <w:rPr>
+                <w:sz w:val="18"/>
+                <w:szCs w:val="18"/>
+              </w:rPr>
+              <w:t xml:space="preserve"> ile güvenlik olaylarını security_logs.txt dosyasına kalıcı olarak kaydeder.</w:t>
             </w:r>
           </w:p>
         </w:tc>
       </w:tr>
       <w:tr>
-        <w:tc>
-          <w:tcPr>
-            <w:tcW w:w="1800" w:type="dxa"/>
+        <w:tblPrEx>
+          <w:tblCellMar>
+            <w:top w:w="0" w:type="dxa"/>
+            <w:bottom w:w="0" w:type="dxa"/>
+          </w:tblCellMar>
+        </w:tblPrEx>
+        <w:tc>
+          <w:tcPr>
+            <w:tcW w:w="1205" w:type="pct"/>
             <w:tcBorders>
               <w:top w:val="single" w:sz="4" w:space="0" w:color="000000"/>
               <w:left w:val="single" w:sz="4" w:space="0" w:color="000000"/>
@@ -1701,7 +1776,7 @@
         </w:tc>
         <w:tc>
           <w:tcPr>
-            <w:tcW w:w="1200" w:type="dxa"/>
+            <w:tcW w:w="617" w:type="pct"/>
             <w:tcBorders>
               <w:top w:val="single" w:sz="4" w:space="0" w:color="000000"/>
               <w:left w:val="single" w:sz="4" w:space="0" w:color="000000"/>
@@ -1728,7 +1803,7 @@
         </w:tc>
         <w:tc>
           <w:tcPr>
-            <w:tcW w:w="1600" w:type="dxa"/>
+            <w:tcW w:w="841" w:type="pct"/>
             <w:tcBorders>
               <w:top w:val="single" w:sz="4" w:space="0" w:color="000000"/>
               <w:left w:val="single" w:sz="4" w:space="0" w:color="000000"/>
@@ -1755,7 +1830,7 @@
         </w:tc>
         <w:tc>
           <w:tcPr>
-            <w:tcW w:w="4760" w:type="dxa"/>
+            <w:tcW w:w="2337" w:type="pct"/>
             <w:tcBorders>
               <w:top w:val="single" w:sz="4" w:space="0" w:color="000000"/>
               <w:left w:val="single" w:sz="4" w:space="0" w:color="000000"/>
@@ -1809,11 +1884,7 @@
         <w:jc w:val="both"/>
       </w:pPr>
       <w:r>
-        <w:t xml:space="preserve">IoTGuard, beş temel nesne yönelimli programlama prensibini gerçek dünya senaryolarına dayalı olarak kapsamlı biçimde uygulamaktadır. </w:t>
-      </w:r>
-      <w:r>
-        <w:lastRenderedPageBreak/>
-        <w:t>Aşağıdaki tablo bu prensiplerin proje içindeki karşılıklarını özetlemektedir.</w:t>
+        <w:t>IoTGuard, beş temel nesne yönelimli programlama prensibini gerçek dünya senaryolarına dayalı olarak kapsamlı biçimde uygulamaktadır. Aşağıdaki tablo bu prensiplerin proje içindeki karşılıklarını özetlemektedir.</w:t>
       </w:r>
     </w:p>
     <w:p>
@@ -1838,7 +1909,7 @@
     </w:p>
     <w:tbl>
       <w:tblPr>
-        <w:tblW w:w="9360" w:type="dxa"/>
+        <w:tblW w:w="5000" w:type="pct"/>
         <w:tblBorders>
           <w:top w:val="single" w:sz="4" w:space="0" w:color="auto"/>
           <w:left w:val="single" w:sz="4" w:space="0" w:color="auto"/>
@@ -1854,17 +1925,23 @@
         <w:tblLook w:val="04A0" w:firstRow="1" w:lastRow="0" w:firstColumn="1" w:lastColumn="0" w:noHBand="0" w:noVBand="1"/>
       </w:tblPr>
       <w:tblGrid>
-        <w:gridCol w:w="2200"/>
-        <w:gridCol w:w="2760"/>
-        <w:gridCol w:w="4400"/>
+        <w:gridCol w:w="1128"/>
+        <w:gridCol w:w="1591"/>
+        <w:gridCol w:w="1591"/>
       </w:tblGrid>
       <w:tr>
+        <w:tblPrEx>
+          <w:tblCellMar>
+            <w:top w:w="0" w:type="dxa"/>
+            <w:bottom w:w="0" w:type="dxa"/>
+          </w:tblCellMar>
+        </w:tblPrEx>
         <w:trPr>
           <w:tblHeader/>
         </w:trPr>
         <w:tc>
           <w:tcPr>
-            <w:tcW w:w="2200" w:type="dxa"/>
+            <w:tcW w:w="1175" w:type="pct"/>
             <w:tcBorders>
               <w:top w:val="single" w:sz="4" w:space="0" w:color="000000"/>
               <w:left w:val="single" w:sz="4" w:space="0" w:color="000000"/>
@@ -1893,7 +1970,7 @@
         </w:tc>
         <w:tc>
           <w:tcPr>
-            <w:tcW w:w="2760" w:type="dxa"/>
+            <w:tcW w:w="1474" w:type="pct"/>
             <w:tcBorders>
               <w:top w:val="single" w:sz="4" w:space="0" w:color="000000"/>
               <w:left w:val="single" w:sz="4" w:space="0" w:color="000000"/>
@@ -1922,7 +1999,7 @@
         </w:tc>
         <w:tc>
           <w:tcPr>
-            <w:tcW w:w="4400" w:type="dxa"/>
+            <w:tcW w:w="2350" w:type="pct"/>
             <w:tcBorders>
               <w:top w:val="single" w:sz="4" w:space="0" w:color="000000"/>
               <w:left w:val="single" w:sz="4" w:space="0" w:color="000000"/>
@@ -1951,9 +2028,15 @@
         </w:tc>
       </w:tr>
       <w:tr>
-        <w:tc>
-          <w:tcPr>
-            <w:tcW w:w="2200" w:type="dxa"/>
+        <w:tblPrEx>
+          <w:tblCellMar>
+            <w:top w:w="0" w:type="dxa"/>
+            <w:bottom w:w="0" w:type="dxa"/>
+          </w:tblCellMar>
+        </w:tblPrEx>
+        <w:tc>
+          <w:tcPr>
+            <w:tcW w:w="1175" w:type="pct"/>
             <w:tcBorders>
               <w:top w:val="single" w:sz="4" w:space="0" w:color="000000"/>
               <w:left w:val="single" w:sz="4" w:space="0" w:color="000000"/>
@@ -1980,7 +2063,7 @@
         </w:tc>
         <w:tc>
           <w:tcPr>
-            <w:tcW w:w="2760" w:type="dxa"/>
+            <w:tcW w:w="1474" w:type="pct"/>
             <w:tcBorders>
               <w:top w:val="single" w:sz="4" w:space="0" w:color="000000"/>
               <w:left w:val="single" w:sz="4" w:space="0" w:color="000000"/>
@@ -2007,7 +2090,7 @@
         </w:tc>
         <w:tc>
           <w:tcPr>
-            <w:tcW w:w="4400" w:type="dxa"/>
+            <w:tcW w:w="2350" w:type="pct"/>
             <w:tcBorders>
               <w:top w:val="single" w:sz="4" w:space="0" w:color="000000"/>
               <w:left w:val="single" w:sz="4" w:space="0" w:color="000000"/>
@@ -2034,36 +2117,43 @@
         </w:tc>
       </w:tr>
       <w:tr>
-        <w:tc>
-          <w:tcPr>
-            <w:tcW w:w="2200" w:type="dxa"/>
-            <w:tcBorders>
-              <w:top w:val="single" w:sz="4" w:space="0" w:color="000000"/>
-              <w:left w:val="single" w:sz="4" w:space="0" w:color="000000"/>
-              <w:bottom w:val="single" w:sz="4" w:space="0" w:color="000000"/>
-              <w:right w:val="single" w:sz="4" w:space="0" w:color="000000"/>
-            </w:tcBorders>
-            <w:shd w:val="clear" w:color="auto" w:fill="FFFFFF"/>
-            <w:tcMar>
-              <w:top w:w="60" w:type="dxa"/>
-              <w:left w:w="100" w:type="dxa"/>
-              <w:bottom w:w="60" w:type="dxa"/>
-              <w:right w:w="100" w:type="dxa"/>
-            </w:tcMar>
-          </w:tcPr>
-          <w:p>
-            <w:r>
-              <w:rPr>
-                <w:sz w:val="18"/>
-                <w:szCs w:val="18"/>
-              </w:rPr>
+        <w:tblPrEx>
+          <w:tblCellMar>
+            <w:top w:w="0" w:type="dxa"/>
+            <w:bottom w:w="0" w:type="dxa"/>
+          </w:tblCellMar>
+        </w:tblPrEx>
+        <w:tc>
+          <w:tcPr>
+            <w:tcW w:w="1175" w:type="pct"/>
+            <w:tcBorders>
+              <w:top w:val="single" w:sz="4" w:space="0" w:color="000000"/>
+              <w:left w:val="single" w:sz="4" w:space="0" w:color="000000"/>
+              <w:bottom w:val="single" w:sz="4" w:space="0" w:color="000000"/>
+              <w:right w:val="single" w:sz="4" w:space="0" w:color="000000"/>
+            </w:tcBorders>
+            <w:shd w:val="clear" w:color="auto" w:fill="FFFFFF"/>
+            <w:tcMar>
+              <w:top w:w="60" w:type="dxa"/>
+              <w:left w:w="100" w:type="dxa"/>
+              <w:bottom w:w="60" w:type="dxa"/>
+              <w:right w:w="100" w:type="dxa"/>
+            </w:tcMar>
+          </w:tcPr>
+          <w:p>
+            <w:r>
+              <w:rPr>
+                <w:sz w:val="18"/>
+                <w:szCs w:val="18"/>
+              </w:rPr>
+              <w:lastRenderedPageBreak/>
               <w:t>Çok Biçimlilik (Polymorphism)</w:t>
             </w:r>
           </w:p>
         </w:tc>
         <w:tc>
           <w:tcPr>
-            <w:tcW w:w="2760" w:type="dxa"/>
+            <w:tcW w:w="1474" w:type="pct"/>
             <w:tcBorders>
               <w:top w:val="single" w:sz="4" w:space="0" w:color="000000"/>
               <w:left w:val="single" w:sz="4" w:space="0" w:color="000000"/>
@@ -2090,7 +2180,7 @@
         </w:tc>
         <w:tc>
           <w:tcPr>
-            <w:tcW w:w="4400" w:type="dxa"/>
+            <w:tcW w:w="2350" w:type="pct"/>
             <w:tcBorders>
               <w:top w:val="single" w:sz="4" w:space="0" w:color="000000"/>
               <w:left w:val="single" w:sz="4" w:space="0" w:color="000000"/>
@@ -2117,9 +2207,15 @@
         </w:tc>
       </w:tr>
       <w:tr>
-        <w:tc>
-          <w:tcPr>
-            <w:tcW w:w="2200" w:type="dxa"/>
+        <w:tblPrEx>
+          <w:tblCellMar>
+            <w:top w:w="0" w:type="dxa"/>
+            <w:bottom w:w="0" w:type="dxa"/>
+          </w:tblCellMar>
+        </w:tblPrEx>
+        <w:tc>
+          <w:tcPr>
+            <w:tcW w:w="1175" w:type="pct"/>
             <w:tcBorders>
               <w:top w:val="single" w:sz="4" w:space="0" w:color="000000"/>
               <w:left w:val="single" w:sz="4" w:space="0" w:color="000000"/>
@@ -2146,91 +2242,69 @@
         </w:tc>
         <w:tc>
           <w:tcPr>
-            <w:tcW w:w="2760" w:type="dxa"/>
-            <w:tcBorders>
-              <w:top w:val="single" w:sz="4" w:space="0" w:color="000000"/>
-              <w:left w:val="single" w:sz="4" w:space="0" w:color="000000"/>
-              <w:bottom w:val="single" w:sz="4" w:space="0" w:color="000000"/>
-              <w:right w:val="single" w:sz="4" w:space="0" w:color="000000"/>
-            </w:tcBorders>
-            <w:shd w:val="clear" w:color="auto" w:fill="FFFFFF"/>
-            <w:tcMar>
-              <w:top w:w="60" w:type="dxa"/>
-              <w:left w:w="100" w:type="dxa"/>
-              <w:bottom w:w="60" w:type="dxa"/>
-              <w:right w:w="100" w:type="dxa"/>
-            </w:tcMar>
-          </w:tcPr>
-          <w:p>
-            <w:r>
-              <w:rPr>
-                <w:sz w:val="18"/>
-                <w:szCs w:val="18"/>
-              </w:rPr>
-              <w:t>Device (</w:t>
-            </w:r>
-            <w:r>
-              <w:rPr>
-                <w:sz w:val="18"/>
-                <w:szCs w:val="18"/>
-              </w:rPr>
-              <w:t>virtual</w:t>
-            </w:r>
-            <w:r>
-              <w:rPr>
-                <w:sz w:val="18"/>
-                <w:szCs w:val="18"/>
-              </w:rPr>
-              <w:t>) + performSelfDiagnostic()</w:t>
-            </w:r>
-          </w:p>
-        </w:tc>
-        <w:tc>
-          <w:tcPr>
-            <w:tcW w:w="4400" w:type="dxa"/>
-            <w:tcBorders>
-              <w:top w:val="single" w:sz="4" w:space="0" w:color="000000"/>
-              <w:left w:val="single" w:sz="4" w:space="0" w:color="000000"/>
-              <w:bottom w:val="single" w:sz="4" w:space="0" w:color="000000"/>
-              <w:right w:val="single" w:sz="4" w:space="0" w:color="000000"/>
-            </w:tcBorders>
-            <w:shd w:val="clear" w:color="auto" w:fill="FFFFFF"/>
-            <w:tcMar>
-              <w:top w:w="60" w:type="dxa"/>
-              <w:left w:w="100" w:type="dxa"/>
-              <w:bottom w:w="60" w:type="dxa"/>
-              <w:right w:w="100" w:type="dxa"/>
-            </w:tcMar>
-          </w:tcPr>
-          <w:p>
-            <w:r>
-              <w:rPr>
-                <w:sz w:val="18"/>
-                <w:szCs w:val="18"/>
-              </w:rPr>
-              <w:t xml:space="preserve">Device sınıfı ve performSelfDiagnostic() metodu </w:t>
-            </w:r>
-            <w:r>
-              <w:rPr>
-                <w:sz w:val="18"/>
-                <w:szCs w:val="18"/>
-              </w:rPr>
-              <w:t>virtual</w:t>
-            </w:r>
-            <w:r>
-              <w:rPr>
-                <w:sz w:val="18"/>
-                <w:szCs w:val="18"/>
-              </w:rPr>
-              <w:t>; her alt sınıf kendi implementasyonunu yazmak zorundadır.</w:t>
+            <w:tcW w:w="1474" w:type="pct"/>
+            <w:tcBorders>
+              <w:top w:val="single" w:sz="4" w:space="0" w:color="000000"/>
+              <w:left w:val="single" w:sz="4" w:space="0" w:color="000000"/>
+              <w:bottom w:val="single" w:sz="4" w:space="0" w:color="000000"/>
+              <w:right w:val="single" w:sz="4" w:space="0" w:color="000000"/>
+            </w:tcBorders>
+            <w:shd w:val="clear" w:color="auto" w:fill="FFFFFF"/>
+            <w:tcMar>
+              <w:top w:w="60" w:type="dxa"/>
+              <w:left w:w="100" w:type="dxa"/>
+              <w:bottom w:w="60" w:type="dxa"/>
+              <w:right w:w="100" w:type="dxa"/>
+            </w:tcMar>
+          </w:tcPr>
+          <w:p>
+            <w:r>
+              <w:rPr>
+                <w:sz w:val="18"/>
+                <w:szCs w:val="18"/>
+              </w:rPr>
+              <w:t>Device (abstract) + performSelfDiagnostic()</w:t>
+            </w:r>
+          </w:p>
+        </w:tc>
+        <w:tc>
+          <w:tcPr>
+            <w:tcW w:w="2350" w:type="pct"/>
+            <w:tcBorders>
+              <w:top w:val="single" w:sz="4" w:space="0" w:color="000000"/>
+              <w:left w:val="single" w:sz="4" w:space="0" w:color="000000"/>
+              <w:bottom w:val="single" w:sz="4" w:space="0" w:color="000000"/>
+              <w:right w:val="single" w:sz="4" w:space="0" w:color="000000"/>
+            </w:tcBorders>
+            <w:shd w:val="clear" w:color="auto" w:fill="FFFFFF"/>
+            <w:tcMar>
+              <w:top w:w="60" w:type="dxa"/>
+              <w:left w:w="100" w:type="dxa"/>
+              <w:bottom w:w="60" w:type="dxa"/>
+              <w:right w:w="100" w:type="dxa"/>
+            </w:tcMar>
+          </w:tcPr>
+          <w:p>
+            <w:r>
+              <w:rPr>
+                <w:sz w:val="18"/>
+                <w:szCs w:val="18"/>
+              </w:rPr>
+              <w:t>Device sınıfı ve performSelfDiagnostic() metodu abstract; her alt sınıf kendi implementasyonunu yazmak zorundadır.</w:t>
             </w:r>
           </w:p>
         </w:tc>
       </w:tr>
       <w:tr>
-        <w:tc>
-          <w:tcPr>
-            <w:tcW w:w="2200" w:type="dxa"/>
+        <w:tblPrEx>
+          <w:tblCellMar>
+            <w:top w:w="0" w:type="dxa"/>
+            <w:bottom w:w="0" w:type="dxa"/>
+          </w:tblCellMar>
+        </w:tblPrEx>
+        <w:tc>
+          <w:tcPr>
+            <w:tcW w:w="1175" w:type="pct"/>
             <w:tcBorders>
               <w:top w:val="single" w:sz="4" w:space="0" w:color="000000"/>
               <w:left w:val="single" w:sz="4" w:space="0" w:color="000000"/>
@@ -2258,7 +2332,7 @@
                 <w:sz w:val="18"/>
                 <w:szCs w:val="18"/>
               </w:rPr>
-              <w:t>Abstract Class (Pure Virtual)</w:t>
+              <w:t>Saf Sanal</w:t>
             </w:r>
             <w:r>
               <w:rPr>
@@ -2271,7 +2345,7 @@
         </w:tc>
         <w:tc>
           <w:tcPr>
-            <w:tcW w:w="2760" w:type="dxa"/>
+            <w:tcW w:w="1474" w:type="pct"/>
             <w:tcBorders>
               <w:top w:val="single" w:sz="4" w:space="0" w:color="000000"/>
               <w:left w:val="single" w:sz="4" w:space="0" w:color="000000"/>
@@ -2298,7 +2372,7 @@
         </w:tc>
         <w:tc>
           <w:tcPr>
-            <w:tcW w:w="4400" w:type="dxa"/>
+            <w:tcW w:w="2350" w:type="pct"/>
             <w:tcBorders>
               <w:top w:val="single" w:sz="4" w:space="0" w:color="000000"/>
               <w:left w:val="single" w:sz="4" w:space="0" w:color="000000"/>
@@ -2325,9 +2399,15 @@
         </w:tc>
       </w:tr>
       <w:tr>
-        <w:tc>
-          <w:tcPr>
-            <w:tcW w:w="2200" w:type="dxa"/>
+        <w:tblPrEx>
+          <w:tblCellMar>
+            <w:top w:w="0" w:type="dxa"/>
+            <w:bottom w:w="0" w:type="dxa"/>
+          </w:tblCellMar>
+        </w:tblPrEx>
+        <w:tc>
+          <w:tcPr>
+            <w:tcW w:w="1175" w:type="pct"/>
             <w:tcBorders>
               <w:top w:val="single" w:sz="4" w:space="0" w:color="000000"/>
               <w:left w:val="single" w:sz="4" w:space="0" w:color="000000"/>
@@ -2354,7 +2434,7 @@
         </w:tc>
         <w:tc>
           <w:tcPr>
-            <w:tcW w:w="2760" w:type="dxa"/>
+            <w:tcW w:w="1474" w:type="pct"/>
             <w:tcBorders>
               <w:top w:val="single" w:sz="4" w:space="0" w:color="000000"/>
               <w:left w:val="single" w:sz="4" w:space="0" w:color="000000"/>
@@ -2381,7 +2461,7 @@
         </w:tc>
         <w:tc>
           <w:tcPr>
-            <w:tcW w:w="4400" w:type="dxa"/>
+            <w:tcW w:w="2350" w:type="pct"/>
             <w:tcBorders>
               <w:top w:val="single" w:sz="4" w:space="0" w:color="000000"/>
               <w:left w:val="single" w:sz="4" w:space="0" w:color="000000"/>
@@ -2482,19 +2562,7 @@
         <w:jc w:val="both"/>
       </w:pPr>
       <w:r>
-        <w:t xml:space="preserve">Device sınıfı </w:t>
-      </w:r>
-      <w:r>
-        <w:t>virtual</w:t>
-      </w:r>
-      <w:r>
-        <w:t xml:space="preserve"> olarak tanımlandığından doğrudan nesne üretilememektedir. performSelfDiagnostic() metodu </w:t>
-      </w:r>
-      <w:r>
-        <w:t>virtual</w:t>
-      </w:r>
-      <w:r>
-        <w:t xml:space="preserve"> bildirilmiş olup alt sınıfların kendi cihazına özgü tanılama mantığını uygulamasını zorunlu kılmaktadır. Monitorable arayüzü ise scanForThreats() ve reportEvent() metotlarını sözleşme düzeyinde tüm izlenebilir cihazlara empoze etmektedir.</w:t>
+        <w:t>Device sınıfı abstract olarak tanımlandığından doğrudan nesne üretilememektedir. performSelfDiagnostic() metodu abstract bildirilmiş olup alt sınıfların kendi cihazına özgü tanılama mantığını uygulamasını zorunlu kılmaktadır. Monitorable arayüzü ise scanForThreats() ve reportEvent() metotlarını sözleşme düzeyinde tüm izlenebilir cihazlara empoze etmektedir.</w:t>
       </w:r>
     </w:p>
     <w:p>
@@ -2550,8 +2618,7 @@
     </w:p>
     <w:tbl>
       <w:tblPr>
-        <w:tblW w:w="9360" w:type="dxa"/>
-        <w:tblInd w:w="-1" w:type="dxa"/>
+        <w:tblW w:w="5000" w:type="pct"/>
         <w:tblBorders>
           <w:top w:val="single" w:sz="4" w:space="0" w:color="auto"/>
           <w:left w:val="single" w:sz="4" w:space="0" w:color="auto"/>
@@ -2567,17 +2634,23 @@
         <w:tblLook w:val="04A0" w:firstRow="1" w:lastRow="0" w:firstColumn="1" w:lastColumn="0" w:noHBand="0" w:noVBand="1"/>
       </w:tblPr>
       <w:tblGrid>
-        <w:gridCol w:w="2000"/>
-        <w:gridCol w:w="2800"/>
-        <w:gridCol w:w="4560"/>
+        <w:gridCol w:w="887"/>
+        <w:gridCol w:w="2113"/>
+        <w:gridCol w:w="1310"/>
       </w:tblGrid>
       <w:tr>
+        <w:tblPrEx>
+          <w:tblCellMar>
+            <w:top w:w="0" w:type="dxa"/>
+            <w:bottom w:w="0" w:type="dxa"/>
+          </w:tblCellMar>
+        </w:tblPrEx>
         <w:trPr>
           <w:tblHeader/>
         </w:trPr>
         <w:tc>
           <w:tcPr>
-            <w:tcW w:w="2000" w:type="dxa"/>
+            <w:tcW w:w="1068" w:type="pct"/>
             <w:tcBorders>
               <w:top w:val="single" w:sz="4" w:space="0" w:color="000000"/>
               <w:left w:val="single" w:sz="4" w:space="0" w:color="000000"/>
@@ -2606,7 +2679,7 @@
         </w:tc>
         <w:tc>
           <w:tcPr>
-            <w:tcW w:w="2800" w:type="dxa"/>
+            <w:tcW w:w="1496" w:type="pct"/>
             <w:tcBorders>
               <w:top w:val="single" w:sz="4" w:space="0" w:color="000000"/>
               <w:left w:val="single" w:sz="4" w:space="0" w:color="000000"/>
@@ -2635,7 +2708,7 @@
         </w:tc>
         <w:tc>
           <w:tcPr>
-            <w:tcW w:w="4560" w:type="dxa"/>
+            <w:tcW w:w="2436" w:type="pct"/>
             <w:tcBorders>
               <w:top w:val="single" w:sz="4" w:space="0" w:color="000000"/>
               <w:left w:val="single" w:sz="4" w:space="0" w:color="000000"/>
@@ -2664,9 +2737,15 @@
         </w:tc>
       </w:tr>
       <w:tr>
-        <w:tc>
-          <w:tcPr>
-            <w:tcW w:w="2000" w:type="dxa"/>
+        <w:tblPrEx>
+          <w:tblCellMar>
+            <w:top w:w="0" w:type="dxa"/>
+            <w:bottom w:w="0" w:type="dxa"/>
+          </w:tblCellMar>
+        </w:tblPrEx>
+        <w:tc>
+          <w:tcPr>
+            <w:tcW w:w="1068" w:type="pct"/>
             <w:tcBorders>
               <w:top w:val="single" w:sz="4" w:space="0" w:color="000000"/>
               <w:left w:val="single" w:sz="4" w:space="0" w:color="000000"/>
@@ -2693,34 +2772,41 @@
         </w:tc>
         <w:tc>
           <w:tcPr>
-            <w:tcW w:w="2800" w:type="dxa"/>
-            <w:tcBorders>
-              <w:top w:val="single" w:sz="4" w:space="0" w:color="000000"/>
-              <w:left w:val="single" w:sz="4" w:space="0" w:color="000000"/>
-              <w:bottom w:val="single" w:sz="4" w:space="0" w:color="000000"/>
-              <w:right w:val="single" w:sz="4" w:space="0" w:color="000000"/>
-            </w:tcBorders>
-            <w:shd w:val="clear" w:color="auto" w:fill="FFFFFF"/>
-            <w:tcMar>
-              <w:top w:w="60" w:type="dxa"/>
-              <w:left w:w="100" w:type="dxa"/>
-              <w:bottom w:w="60" w:type="dxa"/>
-              <w:right w:w="100" w:type="dxa"/>
-            </w:tcMar>
-          </w:tcPr>
-          <w:p>
-            <w:r>
-              <w:rPr>
-                <w:sz w:val="18"/>
-                <w:szCs w:val="18"/>
-              </w:rPr>
-              <w:t>java.lang.Thread, Lambda</w:t>
-            </w:r>
-          </w:p>
-        </w:tc>
-        <w:tc>
-          <w:tcPr>
-            <w:tcW w:w="4560" w:type="dxa"/>
+            <w:tcW w:w="1496" w:type="pct"/>
+            <w:tcBorders>
+              <w:top w:val="single" w:sz="4" w:space="0" w:color="000000"/>
+              <w:left w:val="single" w:sz="4" w:space="0" w:color="000000"/>
+              <w:bottom w:val="single" w:sz="4" w:space="0" w:color="000000"/>
+              <w:right w:val="single" w:sz="4" w:space="0" w:color="000000"/>
+            </w:tcBorders>
+            <w:shd w:val="clear" w:color="auto" w:fill="FFFFFF"/>
+            <w:tcMar>
+              <w:top w:w="60" w:type="dxa"/>
+              <w:left w:w="100" w:type="dxa"/>
+              <w:bottom w:w="60" w:type="dxa"/>
+              <w:right w:w="100" w:type="dxa"/>
+            </w:tcMar>
+          </w:tcPr>
+          <w:p>
+            <w:r>
+              <w:rPr>
+                <w:sz w:val="18"/>
+                <w:szCs w:val="18"/>
+              </w:rPr>
+              <w:t>C++</w:t>
+            </w:r>
+            <w:r>
+              <w:rPr>
+                <w:sz w:val="18"/>
+                <w:szCs w:val="18"/>
+              </w:rPr>
+              <w:t>.lang.Thread, Lambda</w:t>
+            </w:r>
+          </w:p>
+        </w:tc>
+        <w:tc>
+          <w:tcPr>
+            <w:tcW w:w="2436" w:type="pct"/>
             <w:tcBorders>
               <w:top w:val="single" w:sz="4" w:space="0" w:color="000000"/>
               <w:left w:val="single" w:sz="4" w:space="0" w:color="000000"/>
@@ -2747,9 +2833,15 @@
         </w:tc>
       </w:tr>
       <w:tr>
-        <w:tc>
-          <w:tcPr>
-            <w:tcW w:w="2000" w:type="dxa"/>
+        <w:tblPrEx>
+          <w:tblCellMar>
+            <w:top w:w="0" w:type="dxa"/>
+            <w:bottom w:w="0" w:type="dxa"/>
+          </w:tblCellMar>
+        </w:tblPrEx>
+        <w:tc>
+          <w:tcPr>
+            <w:tcW w:w="1068" w:type="pct"/>
             <w:tcBorders>
               <w:top w:val="single" w:sz="4" w:space="0" w:color="000000"/>
               <w:left w:val="single" w:sz="4" w:space="0" w:color="000000"/>
@@ -2776,7 +2868,7 @@
         </w:tc>
         <w:tc>
           <w:tcPr>
-            <w:tcW w:w="2800" w:type="dxa"/>
+            <w:tcW w:w="1496" w:type="pct"/>
             <w:tcBorders>
               <w:top w:val="single" w:sz="4" w:space="0" w:color="000000"/>
               <w:left w:val="single" w:sz="4" w:space="0" w:color="000000"/>
@@ -2804,20 +2896,13 @@
                 <w:sz w:val="18"/>
                 <w:szCs w:val="18"/>
               </w:rPr>
-              <w:t>std::exception</w:t>
-            </w:r>
-            <w:r>
-              <w:rPr>
-                <w:sz w:val="18"/>
-                <w:szCs w:val="18"/>
-              </w:rPr>
-              <w:t xml:space="preserve"> (Checked)</w:t>
-            </w:r>
-          </w:p>
-        </w:tc>
-        <w:tc>
-          <w:tcPr>
-            <w:tcW w:w="4560" w:type="dxa"/>
+              <w:t>Std::exception</w:t>
+            </w:r>
+          </w:p>
+        </w:tc>
+        <w:tc>
+          <w:tcPr>
+            <w:tcW w:w="2436" w:type="pct"/>
             <w:tcBorders>
               <w:top w:val="single" w:sz="4" w:space="0" w:color="000000"/>
               <w:left w:val="single" w:sz="4" w:space="0" w:color="000000"/>
@@ -2844,9 +2929,15 @@
         </w:tc>
       </w:tr>
       <w:tr>
-        <w:tc>
-          <w:tcPr>
-            <w:tcW w:w="2000" w:type="dxa"/>
+        <w:tblPrEx>
+          <w:tblCellMar>
+            <w:top w:w="0" w:type="dxa"/>
+            <w:bottom w:w="0" w:type="dxa"/>
+          </w:tblCellMar>
+        </w:tblPrEx>
+        <w:tc>
+          <w:tcPr>
+            <w:tcW w:w="1068" w:type="pct"/>
             <w:tcBorders>
               <w:top w:val="single" w:sz="4" w:space="0" w:color="000000"/>
               <w:left w:val="single" w:sz="4" w:space="0" w:color="000000"/>
@@ -2873,34 +2964,62 @@
         </w:tc>
         <w:tc>
           <w:tcPr>
-            <w:tcW w:w="2800" w:type="dxa"/>
-            <w:tcBorders>
-              <w:top w:val="single" w:sz="4" w:space="0" w:color="000000"/>
-              <w:left w:val="single" w:sz="4" w:space="0" w:color="000000"/>
-              <w:bottom w:val="single" w:sz="4" w:space="0" w:color="000000"/>
-              <w:right w:val="single" w:sz="4" w:space="0" w:color="000000"/>
-            </w:tcBorders>
-            <w:shd w:val="clear" w:color="auto" w:fill="FFFFFF"/>
-            <w:tcMar>
-              <w:top w:w="60" w:type="dxa"/>
-              <w:left w:w="100" w:type="dxa"/>
-              <w:bottom w:w="60" w:type="dxa"/>
-              <w:right w:w="100" w:type="dxa"/>
-            </w:tcMar>
-          </w:tcPr>
-          <w:p>
-            <w:r>
-              <w:rPr>
-                <w:sz w:val="18"/>
-                <w:szCs w:val="18"/>
-              </w:rPr>
-              <w:t>BufferedWriter, FileWriter, try-with-resources</w:t>
-            </w:r>
-          </w:p>
-        </w:tc>
-        <w:tc>
-          <w:tcPr>
-            <w:tcW w:w="4560" w:type="dxa"/>
+            <w:tcW w:w="1496" w:type="pct"/>
+            <w:tcBorders>
+              <w:top w:val="single" w:sz="4" w:space="0" w:color="000000"/>
+              <w:left w:val="single" w:sz="4" w:space="0" w:color="000000"/>
+              <w:bottom w:val="single" w:sz="4" w:space="0" w:color="000000"/>
+              <w:right w:val="single" w:sz="4" w:space="0" w:color="000000"/>
+            </w:tcBorders>
+            <w:shd w:val="clear" w:color="auto" w:fill="FFFFFF"/>
+            <w:tcMar>
+              <w:top w:w="60" w:type="dxa"/>
+              <w:left w:w="100" w:type="dxa"/>
+              <w:bottom w:w="60" w:type="dxa"/>
+              <w:right w:w="100" w:type="dxa"/>
+            </w:tcMar>
+          </w:tcPr>
+          <w:p>
+            <w:r>
+              <w:rPr>
+                <w:sz w:val="18"/>
+                <w:szCs w:val="18"/>
+              </w:rPr>
+              <w:t>Std::ofstream</w:t>
+            </w:r>
+            <w:r>
+              <w:rPr>
+                <w:sz w:val="18"/>
+                <w:szCs w:val="18"/>
+              </w:rPr>
+              <w:t xml:space="preserve">, </w:t>
+            </w:r>
+            <w:r>
+              <w:rPr>
+                <w:sz w:val="18"/>
+                <w:szCs w:val="18"/>
+              </w:rPr>
+              <w:t>Std::ofstream</w:t>
+            </w:r>
+            <w:r>
+              <w:rPr>
+                <w:sz w:val="18"/>
+                <w:szCs w:val="18"/>
+              </w:rPr>
+              <w:t xml:space="preserve">, </w:t>
+            </w:r>
+            <w:r>
+              <w:rPr>
+                <w:sz w:val="18"/>
+                <w:szCs w:val="18"/>
+              </w:rPr>
+              <w:t>RAII / lock_guard</w:t>
+            </w:r>
+          </w:p>
+        </w:tc>
+        <w:tc>
+          <w:tcPr>
+            <w:tcW w:w="2436" w:type="pct"/>
             <w:tcBorders>
               <w:top w:val="single" w:sz="4" w:space="0" w:color="000000"/>
               <w:left w:val="single" w:sz="4" w:space="0" w:color="000000"/>
@@ -2927,9 +3046,15 @@
         </w:tc>
       </w:tr>
       <w:tr>
-        <w:tc>
-          <w:tcPr>
-            <w:tcW w:w="2000" w:type="dxa"/>
+        <w:tblPrEx>
+          <w:tblCellMar>
+            <w:top w:w="0" w:type="dxa"/>
+            <w:bottom w:w="0" w:type="dxa"/>
+          </w:tblCellMar>
+        </w:tblPrEx>
+        <w:tc>
+          <w:tcPr>
+            <w:tcW w:w="1068" w:type="pct"/>
             <w:tcBorders>
               <w:top w:val="single" w:sz="4" w:space="0" w:color="000000"/>
               <w:left w:val="single" w:sz="4" w:space="0" w:color="000000"/>
@@ -2956,7 +3081,7 @@
         </w:tc>
         <w:tc>
           <w:tcPr>
-            <w:tcW w:w="2800" w:type="dxa"/>
+            <w:tcW w:w="1496" w:type="pct"/>
             <w:tcBorders>
               <w:top w:val="single" w:sz="4" w:space="0" w:color="000000"/>
               <w:left w:val="single" w:sz="4" w:space="0" w:color="000000"/>
@@ -2983,7 +3108,7 @@
         </w:tc>
         <w:tc>
           <w:tcPr>
-            <w:tcW w:w="4560" w:type="dxa"/>
+            <w:tcW w:w="2436" w:type="pct"/>
             <w:tcBorders>
               <w:top w:val="single" w:sz="4" w:space="0" w:color="000000"/>
               <w:left w:val="single" w:sz="4" w:space="0" w:color="000000"/>
@@ -3010,9 +3135,15 @@
         </w:tc>
       </w:tr>
       <w:tr>
-        <w:tc>
-          <w:tcPr>
-            <w:tcW w:w="2000" w:type="dxa"/>
+        <w:tblPrEx>
+          <w:tblCellMar>
+            <w:top w:w="0" w:type="dxa"/>
+            <w:bottom w:w="0" w:type="dxa"/>
+          </w:tblCellMar>
+        </w:tblPrEx>
+        <w:tc>
+          <w:tcPr>
+            <w:tcW w:w="1068" w:type="pct"/>
             <w:tcBorders>
               <w:top w:val="single" w:sz="4" w:space="0" w:color="000000"/>
               <w:left w:val="single" w:sz="4" w:space="0" w:color="000000"/>
@@ -3039,55 +3170,70 @@
         </w:tc>
         <w:tc>
           <w:tcPr>
-            <w:tcW w:w="2800" w:type="dxa"/>
-            <w:tcBorders>
-              <w:top w:val="single" w:sz="4" w:space="0" w:color="000000"/>
-              <w:left w:val="single" w:sz="4" w:space="0" w:color="000000"/>
-              <w:bottom w:val="single" w:sz="4" w:space="0" w:color="000000"/>
-              <w:right w:val="single" w:sz="4" w:space="0" w:color="000000"/>
-            </w:tcBorders>
-            <w:shd w:val="clear" w:color="auto" w:fill="FFFFFF"/>
-            <w:tcMar>
-              <w:top w:w="60" w:type="dxa"/>
-              <w:left w:w="100" w:type="dxa"/>
-              <w:bottom w:w="60" w:type="dxa"/>
-              <w:right w:w="100" w:type="dxa"/>
-            </w:tcMar>
-          </w:tcPr>
-          <w:p>
-            <w:r>
-              <w:rPr>
-                <w:sz w:val="18"/>
-                <w:szCs w:val="18"/>
-              </w:rPr>
-              <w:t>Runnable (Thread)</w:t>
-            </w:r>
-          </w:p>
-        </w:tc>
-        <w:tc>
-          <w:tcPr>
-            <w:tcW w:w="4560" w:type="dxa"/>
-            <w:tcBorders>
-              <w:top w:val="single" w:sz="4" w:space="0" w:color="000000"/>
-              <w:left w:val="single" w:sz="4" w:space="0" w:color="000000"/>
-              <w:bottom w:val="single" w:sz="4" w:space="0" w:color="000000"/>
-              <w:right w:val="single" w:sz="4" w:space="0" w:color="000000"/>
-            </w:tcBorders>
-            <w:shd w:val="clear" w:color="auto" w:fill="FFFFFF"/>
-            <w:tcMar>
-              <w:top w:w="60" w:type="dxa"/>
-              <w:left w:w="100" w:type="dxa"/>
-              <w:bottom w:w="60" w:type="dxa"/>
-              <w:right w:w="100" w:type="dxa"/>
-            </w:tcMar>
-          </w:tcPr>
-          <w:p>
-            <w:r>
-              <w:rPr>
-                <w:sz w:val="18"/>
-                <w:szCs w:val="18"/>
-              </w:rPr>
-              <w:t>Anonim sınıf yerine lambda ile kısa ve okunabilir thread tanımları.</w:t>
+            <w:tcW w:w="1496" w:type="pct"/>
+            <w:tcBorders>
+              <w:top w:val="single" w:sz="4" w:space="0" w:color="000000"/>
+              <w:left w:val="single" w:sz="4" w:space="0" w:color="000000"/>
+              <w:bottom w:val="single" w:sz="4" w:space="0" w:color="000000"/>
+              <w:right w:val="single" w:sz="4" w:space="0" w:color="000000"/>
+            </w:tcBorders>
+            <w:shd w:val="clear" w:color="auto" w:fill="FFFFFF"/>
+            <w:tcMar>
+              <w:top w:w="60" w:type="dxa"/>
+              <w:left w:w="100" w:type="dxa"/>
+              <w:bottom w:w="60" w:type="dxa"/>
+              <w:right w:w="100" w:type="dxa"/>
+            </w:tcMar>
+          </w:tcPr>
+          <w:p>
+            <w:r>
+              <w:rPr>
+                <w:sz w:val="18"/>
+                <w:szCs w:val="18"/>
+              </w:rPr>
+              <w:t>Std::thread</w:t>
+            </w:r>
+            <w:r>
+              <w:rPr>
+                <w:sz w:val="18"/>
+                <w:szCs w:val="18"/>
+              </w:rPr>
+              <w:t xml:space="preserve"> (Thread)</w:t>
+            </w:r>
+          </w:p>
+        </w:tc>
+        <w:tc>
+          <w:tcPr>
+            <w:tcW w:w="2436" w:type="pct"/>
+            <w:tcBorders>
+              <w:top w:val="single" w:sz="4" w:space="0" w:color="000000"/>
+              <w:left w:val="single" w:sz="4" w:space="0" w:color="000000"/>
+              <w:bottom w:val="single" w:sz="4" w:space="0" w:color="000000"/>
+              <w:right w:val="single" w:sz="4" w:space="0" w:color="000000"/>
+            </w:tcBorders>
+            <w:shd w:val="clear" w:color="auto" w:fill="FFFFFF"/>
+            <w:tcMar>
+              <w:top w:w="60" w:type="dxa"/>
+              <w:left w:w="100" w:type="dxa"/>
+              <w:bottom w:w="60" w:type="dxa"/>
+              <w:right w:w="100" w:type="dxa"/>
+            </w:tcMar>
+          </w:tcPr>
+          <w:p>
+            <w:r>
+              <w:rPr>
+                <w:sz w:val="18"/>
+                <w:szCs w:val="18"/>
+              </w:rPr>
+              <w:t xml:space="preserve">Anonim sınıf yerine lambda ile kısa ve </w:t>
+            </w:r>
+            <w:r>
+              <w:rPr>
+                <w:sz w:val="18"/>
+                <w:szCs w:val="18"/>
+              </w:rPr>
+              <w:lastRenderedPageBreak/>
+              <w:t>okunabilir thread tanımları.</w:t>
             </w:r>
           </w:p>
         </w:tc>
@@ -3143,10 +3289,7 @@
         <w:jc w:val="both"/>
       </w:pPr>
       <w:r>
-        <w:t>DeviceFailure</w:t>
-      </w:r>
-      <w:r>
-        <w:t>std::exception</w:t>
+        <w:t>DeviceFailureException</w:t>
       </w:r>
       <w:r>
         <w:t xml:space="preserve">, </w:t>
@@ -3155,19 +3298,7 @@
         <w:t>C++</w:t>
       </w:r>
       <w:r>
-        <w:t xml:space="preserve">'nın standart </w:t>
-      </w:r>
-      <w:r>
-        <w:t>std::exception</w:t>
-      </w:r>
-      <w:r>
-        <w:t xml:space="preserve"> sınıfından türetilmiş bir Checked </w:t>
-      </w:r>
-      <w:r>
-        <w:t>std::exception</w:t>
-      </w:r>
-      <w:r>
-        <w:t xml:space="preserve"> olarak tasarlanmıştır. Cihazlar performSelfDiagnostic() metodu içinde </w:t>
+        <w:t xml:space="preserve">'nın standart Exception sınıfından türetilmiş bir Checked Exception olarak tasarlanmıştır. Cihazlar performSelfDiagnostic() metodu içinde </w:t>
       </w:r>
       <w:r>
         <w:t>&lt;iostream&gt;</w:t>
@@ -3197,7 +3328,25 @@
         <w:jc w:val="both"/>
       </w:pPr>
       <w:r>
-        <w:t>LogManager sınıfı, BufferedWriter ve FileWriter API'lerini try-with-resources yapısıyla birlikte kullanarak tüm güvenlik olaylarını security_logs.txt dosyasına kalıcı olarak kaydeder. Append modunda çalışan dosya, uygulama yeniden başlatıldığında önceki kayıtları korumaktadır. Her olay için eventId, severity, deviceId, açıklama ve LocalDateTime damgası kayıt altına alınmaktadır.</w:t>
+        <w:t xml:space="preserve">LogManager sınıfı, </w:t>
+      </w:r>
+      <w:r>
+        <w:t>Std::ofstream</w:t>
+      </w:r>
+      <w:r>
+        <w:t xml:space="preserve"> ve </w:t>
+      </w:r>
+      <w:r>
+        <w:t>Std::ofstream</w:t>
+      </w:r>
+      <w:r>
+        <w:t xml:space="preserve"> API'lerini </w:t>
+      </w:r>
+      <w:r>
+        <w:t>RAII / lock_guard</w:t>
+      </w:r>
+      <w:r>
+        <w:t xml:space="preserve"> yapısıyla birlikte kullanarak tüm güvenlik olaylarını security_logs.txt dosyasına kalıcı olarak kaydeder. Append modunda çalışan dosya, uygulama yeniden başlatıldığında önceki kayıtları korumaktadır. Her olay için eventId, severity, deviceId, açıklama ve LocalDateTime damgası kayıt altına alınmaktadır.</w:t>
       </w:r>
     </w:p>
     <w:p>
@@ -3212,7 +3361,25 @@
           <w:sz w:val="24"/>
           <w:szCs w:val="24"/>
         </w:rPr>
-        <w:t>V. KULLANILAN JAVA API'LERİ</w:t>
+        <w:t xml:space="preserve">V. KULLANILAN </w:t>
+      </w:r>
+      <w:r>
+        <w:rPr>
+          <w:b/>
+          <w:bCs/>
+          <w:sz w:val="24"/>
+          <w:szCs w:val="24"/>
+        </w:rPr>
+        <w:t>C++</w:t>
+      </w:r>
+      <w:r>
+        <w:rPr>
+          <w:b/>
+          <w:bCs/>
+          <w:sz w:val="24"/>
+          <w:szCs w:val="24"/>
+        </w:rPr>
+        <w:t xml:space="preserve"> API'LERİ</w:t>
       </w:r>
     </w:p>
     <w:p>
@@ -3222,7 +3389,6 @@
         <w:jc w:val="both"/>
       </w:pPr>
       <w:r>
-        <w:lastRenderedPageBreak/>
         <w:t xml:space="preserve">Proje, </w:t>
       </w:r>
       <w:r>
@@ -3238,7 +3404,7 @@
         <w:t>.</w:t>
       </w:r>
       <w:r>
-        <w:t>std::vector</w:t>
+        <w:t>Std::vector</w:t>
       </w:r>
       <w:r>
         <w:t xml:space="preserve"> ve </w:t>
@@ -3253,13 +3419,55 @@
         <w:t>&lt;iostream&gt;</w:t>
       </w:r>
       <w:r>
-        <w:t>.Random; zaman damgalama için java.time.LocalDateTime ve java.time.format.DateTimeFormatter; dosya yazımı için java.io.BufferedWriter, java.io.FileWriter ve java.io.IO</w:t>
-      </w:r>
-      <w:r>
-        <w:t>std::exception</w:t>
-      </w:r>
-      <w:r>
-        <w:t>; eşzamanlı işleme için java.lang.Thread kullanılmaktadır.</w:t>
+        <w:t xml:space="preserve">.Random; zaman damgalama için </w:t>
+      </w:r>
+      <w:r>
+        <w:t>C++</w:t>
+      </w:r>
+      <w:r>
+        <w:t xml:space="preserve">.time.LocalDateTime ve </w:t>
+      </w:r>
+      <w:r>
+        <w:t>C++</w:t>
+      </w:r>
+      <w:r>
+        <w:t xml:space="preserve">.time.format.DateTimeFormatter; dosya yazımı için </w:t>
+      </w:r>
+      <w:r>
+        <w:t>C++</w:t>
+      </w:r>
+      <w:r>
+        <w:t>.io.</w:t>
+      </w:r>
+      <w:r>
+        <w:t>Std::ofstream</w:t>
+      </w:r>
+      <w:r>
+        <w:t xml:space="preserve">, </w:t>
+      </w:r>
+      <w:r>
+        <w:t>C++</w:t>
+      </w:r>
+      <w:r>
+        <w:t>.io.</w:t>
+      </w:r>
+      <w:r>
+        <w:t>Std::ofstream</w:t>
+      </w:r>
+      <w:r>
+        <w:t xml:space="preserve"> ve </w:t>
+      </w:r>
+      <w:r>
+        <w:t>C++</w:t>
+      </w:r>
+      <w:r>
+        <w:t xml:space="preserve">.io.IOException; eşzamanlı işleme için </w:t>
+      </w:r>
+      <w:r>
+        <w:t>C++</w:t>
+      </w:r>
+      <w:r>
+        <w:t>.lang.Thread kullanılmaktadır.</w:t>
       </w:r>
     </w:p>
     <w:p>
@@ -3359,10 +3567,10 @@
         <w:t>.cpp</w:t>
       </w:r>
       <w:r>
-        <w:t>, DeviceFailure</w:t>
-      </w:r>
-      <w:r>
-        <w:t>std::exception.cpp</w:t>
+        <w:t xml:space="preserve">, </w:t>
+      </w:r>
+      <w:r>
+        <w:t>DeviceFailureException.cpp</w:t>
       </w:r>
     </w:p>
     <w:p>
@@ -3563,7 +3771,7 @@
         <w:jc w:val="both"/>
       </w:pPr>
       <w:r>
-        <w:t>- ANSI renk kodlarÄ± ve daktilo (typing) animasyonlarÄ± ile geliÅŸmiÅŸ interaktif TUI (Metin TabanlÄ± ArayÃ¼z) entegre edilmiÅŸtir.</w:t>
+        <w:t>- ANSI renk kodlarÄ± ve film tarzÄ± efektler ile geliÅŸmiÅŸ interaktif TUI entegre edilmiÅŸtir.</w:t>
       </w:r>
     </w:p>
     <w:p>
@@ -3572,7 +3780,7 @@
         <w:jc w:val="both"/>
       </w:pPr>
       <w:r>
-        <w:t>- YÃ¶netici (Admin) GiriÅŸ paneli eklenmiÅŸ ve ÅŸifre maskeleme Ã¶zellikleri uygulanmÄ±ÅŸtÄ±r.</w:t>
+        <w:t>- YÃ¶netici (Admin) GiriÅŸ paneli eklenmiÅŸ ve ÅŸifre maskeleme (****) Ã¶zellikleri uygulanmÄ±ÅŸtÄ±r.</w:t>
       </w:r>
     </w:p>
     <w:p>
@@ -3580,9 +3788,6 @@
         <w:spacing w:before="60" w:after="60"/>
         <w:jc w:val="both"/>
       </w:pPr>
-      <w:r>
-        <w:t>- Multi-Threaded tarama animasyonlarÄ± (Progress Bar) ve Matrix dijital yaÄŸmur efekti sisteme dahil edilmiÅŸtir.</w:t>
-      </w:r>
     </w:p>
     <w:sectPr>
       <w:pgSz w:w="12240" w:h="15840"/>
@@ -3597,10 +3802,10 @@
 <file path=word/numbering.xml><?xml version="1.0" encoding="utf-8"?>
 <w:numbering xmlns:wpc="http://schemas.microsoft.com/office/word/2010/wordprocessingCanvas" xmlns:cx="http://schemas.microsoft.com/office/drawing/2014/chartex" xmlns:cx1="http://schemas.microsoft.com/office/drawing/2015/9/8/chartex" xmlns:cx2="http://schemas.microsoft.com/office/drawing/2015/10/21/chartex" xmlns:cx3="http://schemas.microsoft.com/office/drawing/2016/5/9/chartex" xmlns:cx4="http://schemas.microsoft.com/office/drawing/2016/5/10/chartex" xmlns:cx5="http://schemas.microsoft.com/office/drawing/2016/5/11/chartex" xmlns:cx6="http://schemas.microsoft.com/office/drawing/2016/5/12/chartex" xmlns:cx7="http://schemas.microsoft.com/office/drawing/2016/5/13/chartex" xmlns:cx8="http://schemas.microsoft.com/office/drawing/2016/5/14/chartex" xmlns:mc="http://schemas.openxmlformats.org/markup-compatibility/2006" xmlns:aink="http://schemas.microsoft.com/office/drawing/2016/ink" xmlns:am3d="http://schemas.microsoft.com/office/drawing/2017/model3d" xmlns:o="urn:schemas-microsoft-com:office:office" xmlns:oel="http://schemas.microsoft.com/office/2019/extlst" xmlns:r="http://schemas.openxmlformats.org/officeDocument/2006/relationships" xmlns:m="http://schemas.openxmlformats.org/officeDocument/2006/math" xmlns:v="urn:schemas-microsoft-com:vml" xmlns:wp14="http://schemas.microsoft.com/office/word/2010/wordprocessingDrawing" xmlns:wp="http://schemas.openxmlformats.org/drawingml/2006/wordprocessingDrawing" xmlns:w10="urn:schemas-microsoft-com:office:word" xmlns:w="http://schemas.openxmlformats.org/wordprocessingml/2006/main" xmlns:w14="http://schemas.microsoft.com/office/word/2010/wordml" xmlns:w15="http://schemas.microsoft.com/office/word/2012/wordml" xmlns:w16cex="http://schemas.microsoft.com/office/word/2018/wordml/cex" xmlns:w16cid="http://schemas.microsoft.com/office/word/2016/wordml/cid" xmlns:w16="http://schemas.microsoft.com/office/word/2018/wordml" xmlns:w16du="http://schemas.microsoft.com/office/word/2023/wordml/word16du" xmlns:w16sdtdh="http://schemas.microsoft.com/office/word/2020/wordml/sdtdatahash" xmlns:w16sdtfl="http://schemas.microsoft.com/office/word/2024/wordml/sdtformatlock" xmlns:w16se="http://schemas.microsoft.com/office/word/2015/wordml/symex" xmlns:wpg="http://schemas.microsoft.com/office/word/2010/wordprocessingGroup" xmlns:wpi="http://schemas.microsoft.com/office/word/2010/wordprocessingInk" xmlns:wne="http://schemas.microsoft.com/office/word/2006/wordml" xmlns:wps="http://schemas.microsoft.com/office/word/2010/wordprocessingShape" mc:Ignorable="w14 w15 w16se w16cid w16 w16cex w16sdtdh w16sdtfl w16du wp14">
   <w:abstractNum w:abstractNumId="0" w15:restartNumberingAfterBreak="0">
-    <w:nsid w:val="2508618E"/>
+    <w:nsid w:val="5E6B7375"/>
     <w:multiLevelType w:val="hybridMultilevel"/>
-    <w:tmpl w:val="958EE436"/>
-    <w:lvl w:ilvl="0" w:tplc="A0CC47DC">
+    <w:tmpl w:val="4A32EA52"/>
+    <w:lvl w:ilvl="0" w:tplc="CD1AEFA0">
       <w:start w:val="1"/>
       <w:numFmt w:val="bullet"/>
       <w:lvlText w:val="•"/>
@@ -3609,52 +3814,52 @@
         <w:ind w:left="720" w:hanging="360"/>
       </w:pPr>
     </w:lvl>
-    <w:lvl w:ilvl="1" w:tplc="2C8C6DA4">
+    <w:lvl w:ilvl="1" w:tplc="65944E2C">
       <w:numFmt w:val="decimal"/>
       <w:lvlText w:val=""/>
       <w:lvlJc w:val="left"/>
     </w:lvl>
-    <w:lvl w:ilvl="2" w:tplc="903A6320">
+    <w:lvl w:ilvl="2" w:tplc="4254270A">
       <w:numFmt w:val="decimal"/>
       <w:lvlText w:val=""/>
       <w:lvlJc w:val="left"/>
     </w:lvl>
-    <w:lvl w:ilvl="3" w:tplc="54825010">
+    <w:lvl w:ilvl="3" w:tplc="F336F1C4">
       <w:numFmt w:val="decimal"/>
       <w:lvlText w:val=""/>
       <w:lvlJc w:val="left"/>
     </w:lvl>
-    <w:lvl w:ilvl="4" w:tplc="F072FF16">
+    <w:lvl w:ilvl="4" w:tplc="8EEA0882">
       <w:numFmt w:val="decimal"/>
       <w:lvlText w:val=""/>
       <w:lvlJc w:val="left"/>
     </w:lvl>
-    <w:lvl w:ilvl="5" w:tplc="B2CAA702">
+    <w:lvl w:ilvl="5" w:tplc="B42C86DA">
       <w:numFmt w:val="decimal"/>
       <w:lvlText w:val=""/>
       <w:lvlJc w:val="left"/>
     </w:lvl>
-    <w:lvl w:ilvl="6" w:tplc="A67202DA">
+    <w:lvl w:ilvl="6" w:tplc="CD84BD2A">
       <w:numFmt w:val="decimal"/>
       <w:lvlText w:val=""/>
       <w:lvlJc w:val="left"/>
     </w:lvl>
-    <w:lvl w:ilvl="7" w:tplc="E6341B9A">
+    <w:lvl w:ilvl="7" w:tplc="A3DE154A">
       <w:numFmt w:val="decimal"/>
       <w:lvlText w:val=""/>
       <w:lvlJc w:val="left"/>
     </w:lvl>
-    <w:lvl w:ilvl="8" w:tplc="512C95C0">
+    <w:lvl w:ilvl="8" w:tplc="F52672A2">
       <w:numFmt w:val="decimal"/>
       <w:lvlText w:val=""/>
       <w:lvlJc w:val="left"/>
     </w:lvl>
   </w:abstractNum>
   <w:abstractNum w:abstractNumId="1" w15:restartNumberingAfterBreak="0">
-    <w:nsid w:val="3C7A54D1"/>
+    <w:nsid w:val="76282AE6"/>
     <w:multiLevelType w:val="hybridMultilevel"/>
-    <w:tmpl w:val="FCB41196"/>
-    <w:lvl w:ilvl="0" w:tplc="E52676DC">
+    <w:tmpl w:val="F81012DA"/>
+    <w:lvl w:ilvl="0" w:tplc="A176ACB4">
       <w:start w:val="1"/>
       <w:numFmt w:val="bullet"/>
       <w:lvlText w:val="●"/>
@@ -3663,7 +3868,7 @@
         <w:ind w:left="720" w:hanging="360"/>
       </w:pPr>
     </w:lvl>
-    <w:lvl w:ilvl="1" w:tplc="68FC1444">
+    <w:lvl w:ilvl="1" w:tplc="26B42B22">
       <w:start w:val="1"/>
       <w:numFmt w:val="bullet"/>
       <w:lvlText w:val="○"/>
@@ -3672,7 +3877,7 @@
         <w:ind w:left="1440" w:hanging="360"/>
       </w:pPr>
     </w:lvl>
-    <w:lvl w:ilvl="2" w:tplc="DB98EB6C">
+    <w:lvl w:ilvl="2" w:tplc="2064FEB6">
       <w:start w:val="1"/>
       <w:numFmt w:val="bullet"/>
       <w:lvlText w:val="■"/>
@@ -3681,7 +3886,7 @@
         <w:ind w:left="2160" w:hanging="360"/>
       </w:pPr>
     </w:lvl>
-    <w:lvl w:ilvl="3" w:tplc="54C44ED6">
+    <w:lvl w:ilvl="3" w:tplc="3F0C3148">
       <w:start w:val="1"/>
       <w:numFmt w:val="bullet"/>
       <w:lvlText w:val="●"/>
@@ -3690,7 +3895,7 @@
         <w:ind w:left="2880" w:hanging="360"/>
       </w:pPr>
     </w:lvl>
-    <w:lvl w:ilvl="4" w:tplc="E5741494">
+    <w:lvl w:ilvl="4" w:tplc="DCEE2A98">
       <w:start w:val="1"/>
       <w:numFmt w:val="bullet"/>
       <w:lvlText w:val="○"/>
@@ -3699,7 +3904,7 @@
         <w:ind w:left="3600" w:hanging="360"/>
       </w:pPr>
     </w:lvl>
-    <w:lvl w:ilvl="5" w:tplc="D398F936">
+    <w:lvl w:ilvl="5" w:tplc="67AA713C">
       <w:start w:val="1"/>
       <w:numFmt w:val="bullet"/>
       <w:lvlText w:val="■"/>
@@ -3708,7 +3913,7 @@
         <w:ind w:left="4320" w:hanging="360"/>
       </w:pPr>
     </w:lvl>
-    <w:lvl w:ilvl="6" w:tplc="13D6550A">
+    <w:lvl w:ilvl="6" w:tplc="713A1E18">
       <w:start w:val="1"/>
       <w:numFmt w:val="bullet"/>
       <w:lvlText w:val="●"/>
@@ -3717,7 +3922,7 @@
         <w:ind w:left="5040" w:hanging="360"/>
       </w:pPr>
     </w:lvl>
-    <w:lvl w:ilvl="7" w:tplc="F634B164">
+    <w:lvl w:ilvl="7" w:tplc="D47AFBFE">
       <w:start w:val="1"/>
       <w:numFmt w:val="bullet"/>
       <w:lvlText w:val="●"/>
@@ -3726,7 +3931,7 @@
         <w:ind w:left="5760" w:hanging="360"/>
       </w:pPr>
     </w:lvl>
-    <w:lvl w:ilvl="8" w:tplc="B6C6503C">
+    <w:lvl w:ilvl="8" w:tplc="F39092C2">
       <w:start w:val="1"/>
       <w:numFmt w:val="bullet"/>
       <w:lvlText w:val="●"/>
@@ -3736,7 +3941,7 @@
       </w:pPr>
     </w:lvl>
   </w:abstractNum>
-  <w:num w:numId="1" w16cid:durableId="1612204621">
+  <w:num w:numId="1" w16cid:durableId="189299293">
     <w:abstractNumId w:val="1"/>
     <w:lvlOverride w:ilvl="0">
       <w:startOverride w:val="1"/>

</xml_diff>

<commit_message>
chore: Proje klasöründeki geçici scriptler temizlendi ve Raporlar (İsim/Numara) son haline getirildi
</commit_message>
<xml_diff>
--- a/docs/IoTGuard_Rapor_TR.docx
+++ b/docs/IoTGuard_Rapor_TR.docx
@@ -1,6 +1,6 @@
 
 <file path=word/document.xml><?xml version="1.0" encoding="utf-8"?>
-<w:document xmlns:wpc="http://schemas.microsoft.com/office/word/2010/wordprocessingCanvas" xmlns:cx="http://schemas.microsoft.com/office/drawing/2014/chartex" xmlns:cx1="http://schemas.microsoft.com/office/drawing/2015/9/8/chartex" xmlns:cx2="http://schemas.microsoft.com/office/drawing/2015/10/21/chartex" xmlns:cx3="http://schemas.microsoft.com/office/drawing/2016/5/9/chartex" xmlns:cx4="http://schemas.microsoft.com/office/drawing/2016/5/10/chartex" xmlns:cx5="http://schemas.microsoft.com/office/drawing/2016/5/11/chartex" xmlns:cx6="http://schemas.microsoft.com/office/drawing/2016/5/12/chartex" xmlns:cx7="http://schemas.microsoft.com/office/drawing/2016/5/13/chartex" xmlns:cx8="http://schemas.microsoft.com/office/drawing/2016/5/14/chartex" xmlns:mc="http://schemas.openxmlformats.org/markup-compatibility/2006" xmlns:aink="http://schemas.microsoft.com/office/drawing/2016/ink" xmlns:am3d="http://schemas.microsoft.com/office/drawing/2017/model3d" xmlns:o="urn:schemas-microsoft-com:office:office" xmlns:oel="http://schemas.microsoft.com/office/2019/extlst" xmlns:r="http://schemas.openxmlformats.org/officeDocument/2006/relationships" xmlns:m="http://schemas.openxmlformats.org/officeDocument/2006/math" xmlns:v="urn:schemas-microsoft-com:vml" xmlns:wp14="http://schemas.microsoft.com/office/word/2010/wordprocessingDrawing" xmlns:wp="http://schemas.openxmlformats.org/drawingml/2006/wordprocessingDrawing" xmlns:w10="urn:schemas-microsoft-com:office:word" xmlns:w="http://schemas.openxmlformats.org/wordprocessingml/2006/main" xmlns:w14="http://schemas.microsoft.com/office/word/2010/wordml" xmlns:w15="http://schemas.microsoft.com/office/word/2012/wordml" xmlns:w16cex="http://schemas.microsoft.com/office/word/2018/wordml/cex" xmlns:w16cid="http://schemas.microsoft.com/office/word/2016/wordml/cid" xmlns:w16="http://schemas.microsoft.com/office/word/2018/wordml" xmlns:w16du="http://schemas.microsoft.com/office/word/2023/wordml/word16du" xmlns:w16sdtdh="http://schemas.microsoft.com/office/word/2020/wordml/sdtdatahash" xmlns:w16sdtfl="http://schemas.microsoft.com/office/word/2024/wordml/sdtformatlock" xmlns:w16se="http://schemas.microsoft.com/office/word/2015/wordml/symex" xmlns:wpg="http://schemas.microsoft.com/office/word/2010/wordprocessingGroup" xmlns:wpi="http://schemas.microsoft.com/office/word/2010/wordprocessingInk" xmlns:wne="http://schemas.microsoft.com/office/word/2006/wordml" xmlns:wps="http://schemas.microsoft.com/office/word/2010/wordprocessingShape" mc:Ignorable="w14 w15 w16se w16cid w16 w16cex w16sdtdh w16sdtfl w16du wp14">
+<w:document xmlns:wpc="http://schemas.microsoft.com/office/word/2010/wordprocessingCanvas" xmlns:mc="http://schemas.openxmlformats.org/markup-compatibility/2006" xmlns:o="urn:schemas-microsoft-com:office:office" xmlns:r="http://schemas.openxmlformats.org/officeDocument/2006/relationships" xmlns:m="http://schemas.openxmlformats.org/officeDocument/2006/math" xmlns:v="urn:schemas-microsoft-com:vml" xmlns:wp14="http://schemas.microsoft.com/office/word/2010/wordprocessingDrawing" xmlns:wp="http://schemas.openxmlformats.org/drawingml/2006/wordprocessingDrawing" xmlns:w="http://schemas.openxmlformats.org/wordprocessingml/2006/main" xmlns:w14="http://schemas.microsoft.com/office/word/2010/wordml" xmlns:w10="urn:schemas-microsoft-com:office:word" xmlns:w15="http://schemas.microsoft.com/office/word/2012/wordml" xmlns:wpg="http://schemas.microsoft.com/office/word/2010/wordprocessingGroup" xmlns:wpi="http://schemas.microsoft.com/office/word/2010/wordprocessingInk" xmlns:wne="http://schemas.microsoft.com/office/word/2006/wordml" xmlns:wps="http://schemas.microsoft.com/office/word/2010/wordprocessingShape" xmlns:wpsCustomData="http://www.wps.cn/officeDocument/2013/wpsCustomData" mc:Ignorable="w14 w15 wp14">
   <w:body>
     <w:p>
       <w:pPr>
@@ -19,40 +19,54 @@
     </w:p>
     <w:tbl>
       <w:tblPr>
+        <w:tblStyle w:val="9"/>
         <w:tblW w:w="5000" w:type="pct"/>
+        <w:tblInd w:w="0" w:type="dxa"/>
         <w:tblBorders>
-          <w:top w:val="single" w:sz="4" w:space="0" w:color="auto"/>
-          <w:left w:val="single" w:sz="4" w:space="0" w:color="auto"/>
-          <w:bottom w:val="single" w:sz="4" w:space="0" w:color="auto"/>
-          <w:right w:val="single" w:sz="4" w:space="0" w:color="auto"/>
-          <w:insideH w:val="single" w:sz="4" w:space="0" w:color="auto"/>
-          <w:insideV w:val="single" w:sz="4" w:space="0" w:color="auto"/>
+          <w:top w:val="single" w:color="auto" w:sz="4" w:space="0"/>
+          <w:left w:val="single" w:color="auto" w:sz="4" w:space="0"/>
+          <w:bottom w:val="single" w:color="auto" w:sz="4" w:space="0"/>
+          <w:right w:val="single" w:color="auto" w:sz="4" w:space="0"/>
+          <w:insideH w:val="single" w:color="auto" w:sz="4" w:space="0"/>
+          <w:insideV w:val="single" w:color="auto" w:sz="4" w:space="0"/>
         </w:tblBorders>
+        <w:tblLayout w:type="autofit"/>
         <w:tblCellMar>
+          <w:top w:w="0" w:type="dxa"/>
           <w:left w:w="10" w:type="dxa"/>
+          <w:bottom w:w="0" w:type="dxa"/>
           <w:right w:w="10" w:type="dxa"/>
         </w:tblCellMar>
-        <w:tblLook w:val="04A0" w:firstRow="1" w:lastRow="0" w:firstColumn="1" w:lastColumn="0" w:noHBand="0" w:noVBand="1"/>
       </w:tblPr>
       <w:tblGrid>
         <w:gridCol w:w="2465"/>
-        <w:gridCol w:w="1855"/>
+        <w:gridCol w:w="1875"/>
       </w:tblGrid>
       <w:tr>
         <w:tblPrEx>
+          <w:tblBorders>
+            <w:top w:val="single" w:color="auto" w:sz="4" w:space="0"/>
+            <w:left w:val="single" w:color="auto" w:sz="4" w:space="0"/>
+            <w:bottom w:val="single" w:color="auto" w:sz="4" w:space="0"/>
+            <w:right w:val="single" w:color="auto" w:sz="4" w:space="0"/>
+            <w:insideH w:val="single" w:color="auto" w:sz="4" w:space="0"/>
+            <w:insideV w:val="single" w:color="auto" w:sz="4" w:space="0"/>
+          </w:tblBorders>
           <w:tblCellMar>
             <w:top w:w="0" w:type="dxa"/>
+            <w:left w:w="10" w:type="dxa"/>
             <w:bottom w:w="0" w:type="dxa"/>
+            <w:right w:w="10" w:type="dxa"/>
           </w:tblCellMar>
         </w:tblPrEx>
         <w:tc>
           <w:tcPr>
             <w:tcW w:w="2500" w:type="pct"/>
             <w:tcBorders>
-              <w:top w:val="none" w:sz="0" w:space="0" w:color="FFFFFF"/>
-              <w:left w:val="none" w:sz="0" w:space="0" w:color="FFFFFF"/>
-              <w:bottom w:val="none" w:sz="0" w:space="0" w:color="FFFFFF"/>
-              <w:right w:val="none" w:sz="0" w:space="0" w:color="FFFFFF"/>
+              <w:top w:val="nil"/>
+              <w:left w:val="nil"/>
+              <w:bottom w:val="nil"/>
+              <w:right w:val="nil"/>
             </w:tcBorders>
           </w:tcPr>
           <w:p>
@@ -100,10 +114,10 @@
           <w:tcPr>
             <w:tcW w:w="2500" w:type="pct"/>
             <w:tcBorders>
-              <w:top w:val="none" w:sz="0" w:space="0" w:color="FFFFFF"/>
-              <w:left w:val="none" w:sz="0" w:space="0" w:color="FFFFFF"/>
-              <w:bottom w:val="none" w:sz="0" w:space="0" w:color="FFFFFF"/>
-              <w:right w:val="none" w:sz="0" w:space="0" w:color="FFFFFF"/>
+              <w:top w:val="nil"/>
+              <w:left w:val="nil"/>
+              <w:bottom w:val="nil"/>
+              <w:right w:val="nil"/>
             </w:tcBorders>
           </w:tcPr>
           <w:p>
@@ -119,13 +133,7 @@
               <w:jc w:val="center"/>
             </w:pPr>
             <w:r>
-              <w:t xml:space="preserve">Programlama Dili: </w:t>
-            </w:r>
-            <w:r>
-              <w:t>C++</w:t>
-            </w:r>
-            <w:r>
-              <w:t xml:space="preserve"> SE</w:t>
+              <w:t>Programlama Dili: C++ SE</w:t>
             </w:r>
           </w:p>
           <w:p>
@@ -167,16 +175,7 @@
         <w:t>Özet</w:t>
       </w:r>
       <w:r>
-        <w:t xml:space="preserve">—Bu çalışmada, </w:t>
-      </w:r>
-      <w:r>
-        <w:t>C++</w:t>
-      </w:r>
-      <w:r>
-        <w:t xml:space="preserve"> SE dili kullanılarak geliştirilmiş IoTGuard adlı bir gömülü cihaz güvenlik monitörü sistemi sunulmaktadır. Sistem; güvenlik kamerası, internet yönlendiricisi ve akıllı kapı kilidi gibi IoT cihazlarını merkezi bir yapı üzerinden izlemekte, çoklu iş parçacığı (multi-threading) ile eşzamanlı güvenlik taramaları gerçekleştirmekte, olası siber tehditleri ve donanım arızalarını tespit ederek hem konsola hem de dosyaya raporlamaktadır. Proje; kalıtım, çok biçimlilik, soyutlama, arayüz ve kapsülleme gibi temel OOP</w:t>
-      </w:r>
-      <w:r>
-        <w:t xml:space="preserve"> prensiplerini kapsamlı biçimde uygulamaktadır.</w:t>
+        <w:t>—Bu çalışmada, C++ SE dili kullanılarak geliştirilmiş IoTGuard adlı bir gömülü cihaz güvenlik monitörü sistemi sunulmaktadır. Sistem; güvenlik kamerası, internet yönlendiricisi ve akıllı kapı kilidi gibi IoT cihazlarını merkezi bir yapı üzerinden izlemekte, çoklu iş parçacığı (multi-threading) ile eşzamanlı güvenlik taramaları gerçekleştirmekte, olası siber tehditleri ve donanım arızalarını tespit ederek hem konsola hem de dosyaya raporlamaktadır. Proje; kalıtım, çok biçimlilik, soyutlama, arayüz ve kapsülleme gibi temel OOP prensiplerini kapsamlı biçimde uygulamaktadır.</w:t>
       </w:r>
     </w:p>
     <w:p>
@@ -194,13 +193,7 @@
         <w:t>Anahtar Kelimeler</w:t>
       </w:r>
       <w:r>
-        <w:t xml:space="preserve">—IoT güvenliği, </w:t>
-      </w:r>
-      <w:r>
-        <w:t>C++</w:t>
-      </w:r>
-      <w:r>
-        <w:t xml:space="preserve"> SE, nesne yönelimli programlama, çoklu iş parçacığı, özel istisna yönetimi, dosya giriş/çıkış, güvenlik monitörü</w:t>
+        <w:t>—IoT güvenliği, C++ SE, nesne yönelimli programlama, çoklu iş parçacığı, özel istisna yönetimi, dosya giriş/çıkış, güvenlik monitörü</w:t>
       </w:r>
     </w:p>
     <w:p>
@@ -225,13 +218,7 @@
         <w:jc w:val="both"/>
       </w:pPr>
       <w:r>
-        <w:t xml:space="preserve">IoTGuard, </w:t>
-      </w:r>
-      <w:r>
-        <w:t>C++</w:t>
-      </w:r>
-      <w:r>
-        <w:t xml:space="preserve"> SE dili kullanılarak geliştirilmiş, Nesnelerin İnterneti (IoT) cihazlarını merkezi bir güvenlik izleme sistemine entegre eden kapsamlı bir simülasyon projesidir. Proje, Nesne Yönelimli Programlama (OOP) dersinin dönem projesi olarak hazırlanmış olup gerçek dünya IoT güvenlik senaryolarını yazılım mühendisliği perspektifinden modellemektedir.</w:t>
+        <w:t>IoTGuard, C++ SE dili kullanılarak geliştirilmiş, Nesnelerin İnterneti (IoT) cihazlarını merkezi bir güvenlik izleme sistemine entegre eden kapsamlı bir simülasyon projesidir. Proje, Nesne Yönelimli Programlama (OOP) dersinin dönem projesi olarak hazırlanmış olup gerçek dünya IoT güvenlik senaryolarını yazılım mühendisliği perspektifinden modellemektedir.</w:t>
       </w:r>
     </w:p>
     <w:p>
@@ -251,19 +238,7 @@
         <w:jc w:val="both"/>
       </w:pPr>
       <w:r>
-        <w:t xml:space="preserve">Proje; kalıtım, çok biçimlilik, soyutlama, arayüz ve kapsülleme olmak üzere beş temel OOP prensibini uygularken; çoklu iş parçacığı, özel istisna yönetimi ve dosya giriş/çıkış gibi ileri düzey </w:t>
-      </w:r>
-      <w:r>
-        <w:t>C++</w:t>
-      </w:r>
-      <w:r>
-        <w:t xml:space="preserve"> özelliklerini de entegre etmektedir. Sistem 11 </w:t>
-      </w:r>
-      <w:r>
-        <w:t>C++</w:t>
-      </w:r>
-      <w:r>
-        <w:t xml:space="preserve"> dosyasından oluşmakta olup üç ana pakete ayrılmıştır: iotguard.core, iotguard.devices ve iotguard.events.</w:t>
+        <w:t>Proje; kalıtım, çok biçimlilik, soyutlama, arayüz ve kapsülleme olmak üzere beş temel OOP prensibini uygularken; çoklu iş parçacığı, özel istisna yönetimi ve dosya giriş/çıkış gibi ileri düzey C++ özelliklerini de entegre etmektedir. Sistem 11 C++ dosyasından oluşmakta olup üç ana pakete ayrılmıştır: iotguard.core, iotguard.devices ve iotguard.events.</w:t>
       </w:r>
     </w:p>
     <w:p>
@@ -302,13 +277,7 @@
         <w:jc w:val="both"/>
       </w:pPr>
       <w:r>
-        <w:t xml:space="preserve">Proje, sorumlulukları net biçimde ayıran üç katmanlı bir paket mimarisi üzerine inşa edilmiştir. iotguard.core paketi sistemin çekirdeğini oluşturan Monitorable arayüzü, SecurityMonitor ve LogManager sınıflarını barındırmaktadır. iotguard.devices paketi soyut Device sınıfını ve buna türeyen Camera, Router, SmartLock somut sınıflarını içermektedir. iotguard.events paketi ise SecurityEvent, EventSeverity ve </w:t>
-      </w:r>
-      <w:r>
-        <w:t>DeviceFailureException</w:t>
-      </w:r>
-      <w:r>
-        <w:t xml:space="preserve"> bileşenlerini kapsamaktadır.</w:t>
+        <w:t>Proje, sorumlulukları net biçimde ayıran üç katmanlı bir paket mimarisi üzerine inşa edilmiştir. iotguard.core paketi sistemin çekirdeğini oluşturan Monitorable arayüzü, SecurityMonitor ve LogManager sınıflarını barındırmaktadır. iotguard.devices paketi soyut Device sınıfını ve buna türeyen Camera, Router, SmartLock somut sınıflarını içermektedir. iotguard.events paketi ise SecurityEvent, EventSeverity ve DeviceFailureException bileşenlerini kapsamaktadır.</w:t>
       </w:r>
     </w:p>
     <w:p>
@@ -347,32 +316,46 @@
     </w:p>
     <w:tbl>
       <w:tblPr>
+        <w:tblStyle w:val="9"/>
         <w:tblW w:w="5000" w:type="pct"/>
+        <w:tblInd w:w="0" w:type="dxa"/>
         <w:tblBorders>
-          <w:top w:val="single" w:sz="4" w:space="0" w:color="auto"/>
-          <w:left w:val="single" w:sz="4" w:space="0" w:color="auto"/>
-          <w:bottom w:val="single" w:sz="4" w:space="0" w:color="auto"/>
-          <w:right w:val="single" w:sz="4" w:space="0" w:color="auto"/>
-          <w:insideH w:val="single" w:sz="4" w:space="0" w:color="auto"/>
-          <w:insideV w:val="single" w:sz="4" w:space="0" w:color="auto"/>
+          <w:top w:val="single" w:color="auto" w:sz="4" w:space="0"/>
+          <w:left w:val="single" w:color="auto" w:sz="4" w:space="0"/>
+          <w:bottom w:val="single" w:color="auto" w:sz="4" w:space="0"/>
+          <w:right w:val="single" w:color="auto" w:sz="4" w:space="0"/>
+          <w:insideH w:val="single" w:color="auto" w:sz="4" w:space="0"/>
+          <w:insideV w:val="single" w:color="auto" w:sz="4" w:space="0"/>
         </w:tblBorders>
+        <w:tblLayout w:type="autofit"/>
         <w:tblCellMar>
+          <w:top w:w="0" w:type="dxa"/>
           <w:left w:w="10" w:type="dxa"/>
+          <w:bottom w:w="0" w:type="dxa"/>
           <w:right w:w="10" w:type="dxa"/>
         </w:tblCellMar>
-        <w:tblLook w:val="04A0" w:firstRow="1" w:lastRow="0" w:firstColumn="1" w:lastColumn="0" w:noHBand="0" w:noVBand="1"/>
       </w:tblPr>
       <w:tblGrid>
-        <w:gridCol w:w="1620"/>
-        <w:gridCol w:w="621"/>
-        <w:gridCol w:w="1019"/>
-        <w:gridCol w:w="1050"/>
+        <w:gridCol w:w="1704"/>
+        <w:gridCol w:w="647"/>
+        <w:gridCol w:w="1068"/>
+        <w:gridCol w:w="1101"/>
       </w:tblGrid>
       <w:tr>
         <w:tblPrEx>
+          <w:tblBorders>
+            <w:top w:val="single" w:color="auto" w:sz="4" w:space="0"/>
+            <w:left w:val="single" w:color="auto" w:sz="4" w:space="0"/>
+            <w:bottom w:val="single" w:color="auto" w:sz="4" w:space="0"/>
+            <w:right w:val="single" w:color="auto" w:sz="4" w:space="0"/>
+            <w:insideH w:val="single" w:color="auto" w:sz="4" w:space="0"/>
+            <w:insideV w:val="single" w:color="auto" w:sz="4" w:space="0"/>
+          </w:tblBorders>
           <w:tblCellMar>
             <w:top w:w="0" w:type="dxa"/>
+            <w:left w:w="10" w:type="dxa"/>
             <w:bottom w:w="0" w:type="dxa"/>
+            <w:right w:w="10" w:type="dxa"/>
           </w:tblCellMar>
         </w:tblPrEx>
         <w:trPr>
@@ -382,10 +365,10 @@
           <w:tcPr>
             <w:tcW w:w="1205" w:type="pct"/>
             <w:tcBorders>
-              <w:top w:val="single" w:sz="4" w:space="0" w:color="000000"/>
-              <w:left w:val="single" w:sz="4" w:space="0" w:color="000000"/>
-              <w:bottom w:val="single" w:sz="4" w:space="0" w:color="000000"/>
-              <w:right w:val="single" w:sz="4" w:space="0" w:color="000000"/>
+              <w:top w:val="single" w:color="000000" w:sz="4" w:space="0"/>
+              <w:left w:val="single" w:color="000000" w:sz="4" w:space="0"/>
+              <w:bottom w:val="single" w:color="000000" w:sz="4" w:space="0"/>
+              <w:right w:val="single" w:color="000000" w:sz="4" w:space="0"/>
             </w:tcBorders>
             <w:shd w:val="clear" w:color="auto" w:fill="D0D0D0"/>
             <w:tcMar>
@@ -411,10 +394,10 @@
           <w:tcPr>
             <w:tcW w:w="617" w:type="pct"/>
             <w:tcBorders>
-              <w:top w:val="single" w:sz="4" w:space="0" w:color="000000"/>
-              <w:left w:val="single" w:sz="4" w:space="0" w:color="000000"/>
-              <w:bottom w:val="single" w:sz="4" w:space="0" w:color="000000"/>
-              <w:right w:val="single" w:sz="4" w:space="0" w:color="000000"/>
+              <w:top w:val="single" w:color="000000" w:sz="4" w:space="0"/>
+              <w:left w:val="single" w:color="000000" w:sz="4" w:space="0"/>
+              <w:bottom w:val="single" w:color="000000" w:sz="4" w:space="0"/>
+              <w:right w:val="single" w:color="000000" w:sz="4" w:space="0"/>
             </w:tcBorders>
             <w:shd w:val="clear" w:color="auto" w:fill="D0D0D0"/>
             <w:tcMar>
@@ -440,10 +423,10 @@
           <w:tcPr>
             <w:tcW w:w="841" w:type="pct"/>
             <w:tcBorders>
-              <w:top w:val="single" w:sz="4" w:space="0" w:color="000000"/>
-              <w:left w:val="single" w:sz="4" w:space="0" w:color="000000"/>
-              <w:bottom w:val="single" w:sz="4" w:space="0" w:color="000000"/>
-              <w:right w:val="single" w:sz="4" w:space="0" w:color="000000"/>
+              <w:top w:val="single" w:color="000000" w:sz="4" w:space="0"/>
+              <w:left w:val="single" w:color="000000" w:sz="4" w:space="0"/>
+              <w:bottom w:val="single" w:color="000000" w:sz="4" w:space="0"/>
+              <w:right w:val="single" w:color="000000" w:sz="4" w:space="0"/>
             </w:tcBorders>
             <w:shd w:val="clear" w:color="auto" w:fill="D0D0D0"/>
             <w:tcMar>
@@ -469,10 +452,10 @@
           <w:tcPr>
             <w:tcW w:w="2337" w:type="pct"/>
             <w:tcBorders>
-              <w:top w:val="single" w:sz="4" w:space="0" w:color="000000"/>
-              <w:left w:val="single" w:sz="4" w:space="0" w:color="000000"/>
-              <w:bottom w:val="single" w:sz="4" w:space="0" w:color="000000"/>
-              <w:right w:val="single" w:sz="4" w:space="0" w:color="000000"/>
+              <w:top w:val="single" w:color="000000" w:sz="4" w:space="0"/>
+              <w:left w:val="single" w:color="000000" w:sz="4" w:space="0"/>
+              <w:bottom w:val="single" w:color="000000" w:sz="4" w:space="0"/>
+              <w:right w:val="single" w:color="000000" w:sz="4" w:space="0"/>
             </w:tcBorders>
             <w:shd w:val="clear" w:color="auto" w:fill="D0D0D0"/>
             <w:tcMar>
@@ -497,42 +480,45 @@
       </w:tr>
       <w:tr>
         <w:tblPrEx>
+          <w:tblBorders>
+            <w:top w:val="single" w:color="auto" w:sz="4" w:space="0"/>
+            <w:left w:val="single" w:color="auto" w:sz="4" w:space="0"/>
+            <w:bottom w:val="single" w:color="auto" w:sz="4" w:space="0"/>
+            <w:right w:val="single" w:color="auto" w:sz="4" w:space="0"/>
+            <w:insideH w:val="single" w:color="auto" w:sz="4" w:space="0"/>
+            <w:insideV w:val="single" w:color="auto" w:sz="4" w:space="0"/>
+          </w:tblBorders>
           <w:tblCellMar>
             <w:top w:w="0" w:type="dxa"/>
+            <w:left w:w="10" w:type="dxa"/>
             <w:bottom w:w="0" w:type="dxa"/>
+            <w:right w:w="10" w:type="dxa"/>
           </w:tblCellMar>
         </w:tblPrEx>
         <w:tc>
           <w:tcPr>
             <w:tcW w:w="1205" w:type="pct"/>
             <w:tcBorders>
-              <w:top w:val="single" w:sz="4" w:space="0" w:color="000000"/>
-              <w:left w:val="single" w:sz="4" w:space="0" w:color="000000"/>
-              <w:bottom w:val="single" w:sz="4" w:space="0" w:color="000000"/>
-              <w:right w:val="single" w:sz="4" w:space="0" w:color="000000"/>
-            </w:tcBorders>
-            <w:shd w:val="clear" w:color="auto" w:fill="FFFFFF"/>
-            <w:tcMar>
-              <w:top w:w="60" w:type="dxa"/>
-              <w:left w:w="100" w:type="dxa"/>
-              <w:bottom w:w="60" w:type="dxa"/>
-              <w:right w:w="100" w:type="dxa"/>
-            </w:tcMar>
-          </w:tcPr>
-          <w:p>
-            <w:r>
-              <w:rPr>
-                <w:sz w:val="18"/>
-                <w:szCs w:val="18"/>
-              </w:rPr>
-              <w:t>Monitorable</w:t>
-            </w:r>
-            <w:r>
-              <w:rPr>
-                <w:sz w:val="18"/>
-                <w:szCs w:val="18"/>
-              </w:rPr>
-              <w:t>.cpp</w:t>
+              <w:top w:val="single" w:color="000000" w:sz="4" w:space="0"/>
+              <w:left w:val="single" w:color="000000" w:sz="4" w:space="0"/>
+              <w:bottom w:val="single" w:color="000000" w:sz="4" w:space="0"/>
+              <w:right w:val="single" w:color="000000" w:sz="4" w:space="0"/>
+            </w:tcBorders>
+            <w:shd w:val="clear" w:color="auto" w:fill="FFFFFF"/>
+            <w:tcMar>
+              <w:top w:w="60" w:type="dxa"/>
+              <w:left w:w="100" w:type="dxa"/>
+              <w:bottom w:w="60" w:type="dxa"/>
+              <w:right w:w="100" w:type="dxa"/>
+            </w:tcMar>
+          </w:tcPr>
+          <w:p>
+            <w:r>
+              <w:rPr>
+                <w:sz w:val="18"/>
+                <w:szCs w:val="18"/>
+              </w:rPr>
+              <w:t>Monitorable.cpp</w:t>
             </w:r>
           </w:p>
         </w:tc>
@@ -540,10 +526,10 @@
           <w:tcPr>
             <w:tcW w:w="617" w:type="pct"/>
             <w:tcBorders>
-              <w:top w:val="single" w:sz="4" w:space="0" w:color="000000"/>
-              <w:left w:val="single" w:sz="4" w:space="0" w:color="000000"/>
-              <w:bottom w:val="single" w:sz="4" w:space="0" w:color="000000"/>
-              <w:right w:val="single" w:sz="4" w:space="0" w:color="000000"/>
+              <w:top w:val="single" w:color="000000" w:sz="4" w:space="0"/>
+              <w:left w:val="single" w:color="000000" w:sz="4" w:space="0"/>
+              <w:bottom w:val="single" w:color="000000" w:sz="4" w:space="0"/>
+              <w:right w:val="single" w:color="000000" w:sz="4" w:space="0"/>
             </w:tcBorders>
             <w:shd w:val="clear" w:color="auto" w:fill="FFFFFF"/>
             <w:tcMar>
@@ -567,10 +553,10 @@
           <w:tcPr>
             <w:tcW w:w="841" w:type="pct"/>
             <w:tcBorders>
-              <w:top w:val="single" w:sz="4" w:space="0" w:color="000000"/>
-              <w:left w:val="single" w:sz="4" w:space="0" w:color="000000"/>
-              <w:bottom w:val="single" w:sz="4" w:space="0" w:color="000000"/>
-              <w:right w:val="single" w:sz="4" w:space="0" w:color="000000"/>
+              <w:top w:val="single" w:color="000000" w:sz="4" w:space="0"/>
+              <w:left w:val="single" w:color="000000" w:sz="4" w:space="0"/>
+              <w:bottom w:val="single" w:color="000000" w:sz="4" w:space="0"/>
+              <w:right w:val="single" w:color="000000" w:sz="4" w:space="0"/>
             </w:tcBorders>
             <w:shd w:val="clear" w:color="auto" w:fill="FFFFFF"/>
             <w:tcMar>
@@ -594,10 +580,10 @@
           <w:tcPr>
             <w:tcW w:w="2337" w:type="pct"/>
             <w:tcBorders>
-              <w:top w:val="single" w:sz="4" w:space="0" w:color="000000"/>
-              <w:left w:val="single" w:sz="4" w:space="0" w:color="000000"/>
-              <w:bottom w:val="single" w:sz="4" w:space="0" w:color="000000"/>
-              <w:right w:val="single" w:sz="4" w:space="0" w:color="000000"/>
+              <w:top w:val="single" w:color="000000" w:sz="4" w:space="0"/>
+              <w:left w:val="single" w:color="000000" w:sz="4" w:space="0"/>
+              <w:bottom w:val="single" w:color="000000" w:sz="4" w:space="0"/>
+              <w:right w:val="single" w:color="000000" w:sz="4" w:space="0"/>
             </w:tcBorders>
             <w:shd w:val="clear" w:color="auto" w:fill="FFFFFF"/>
             <w:tcMar>
@@ -620,42 +606,45 @@
       </w:tr>
       <w:tr>
         <w:tblPrEx>
+          <w:tblBorders>
+            <w:top w:val="single" w:color="auto" w:sz="4" w:space="0"/>
+            <w:left w:val="single" w:color="auto" w:sz="4" w:space="0"/>
+            <w:bottom w:val="single" w:color="auto" w:sz="4" w:space="0"/>
+            <w:right w:val="single" w:color="auto" w:sz="4" w:space="0"/>
+            <w:insideH w:val="single" w:color="auto" w:sz="4" w:space="0"/>
+            <w:insideV w:val="single" w:color="auto" w:sz="4" w:space="0"/>
+          </w:tblBorders>
           <w:tblCellMar>
             <w:top w:w="0" w:type="dxa"/>
+            <w:left w:w="10" w:type="dxa"/>
             <w:bottom w:w="0" w:type="dxa"/>
+            <w:right w:w="10" w:type="dxa"/>
           </w:tblCellMar>
         </w:tblPrEx>
         <w:tc>
           <w:tcPr>
             <w:tcW w:w="1205" w:type="pct"/>
             <w:tcBorders>
-              <w:top w:val="single" w:sz="4" w:space="0" w:color="000000"/>
-              <w:left w:val="single" w:sz="4" w:space="0" w:color="000000"/>
-              <w:bottom w:val="single" w:sz="4" w:space="0" w:color="000000"/>
-              <w:right w:val="single" w:sz="4" w:space="0" w:color="000000"/>
-            </w:tcBorders>
-            <w:shd w:val="clear" w:color="auto" w:fill="FFFFFF"/>
-            <w:tcMar>
-              <w:top w:w="60" w:type="dxa"/>
-              <w:left w:w="100" w:type="dxa"/>
-              <w:bottom w:w="60" w:type="dxa"/>
-              <w:right w:w="100" w:type="dxa"/>
-            </w:tcMar>
-          </w:tcPr>
-          <w:p>
-            <w:r>
-              <w:rPr>
-                <w:sz w:val="18"/>
-                <w:szCs w:val="18"/>
-              </w:rPr>
-              <w:t>Device</w:t>
-            </w:r>
-            <w:r>
-              <w:rPr>
-                <w:sz w:val="18"/>
-                <w:szCs w:val="18"/>
-              </w:rPr>
-              <w:t>.cpp</w:t>
+              <w:top w:val="single" w:color="000000" w:sz="4" w:space="0"/>
+              <w:left w:val="single" w:color="000000" w:sz="4" w:space="0"/>
+              <w:bottom w:val="single" w:color="000000" w:sz="4" w:space="0"/>
+              <w:right w:val="single" w:color="000000" w:sz="4" w:space="0"/>
+            </w:tcBorders>
+            <w:shd w:val="clear" w:color="auto" w:fill="FFFFFF"/>
+            <w:tcMar>
+              <w:top w:w="60" w:type="dxa"/>
+              <w:left w:w="100" w:type="dxa"/>
+              <w:bottom w:w="60" w:type="dxa"/>
+              <w:right w:w="100" w:type="dxa"/>
+            </w:tcMar>
+          </w:tcPr>
+          <w:p>
+            <w:r>
+              <w:rPr>
+                <w:sz w:val="18"/>
+                <w:szCs w:val="18"/>
+              </w:rPr>
+              <w:t>Device.cpp</w:t>
             </w:r>
           </w:p>
         </w:tc>
@@ -663,10 +652,10 @@
           <w:tcPr>
             <w:tcW w:w="617" w:type="pct"/>
             <w:tcBorders>
-              <w:top w:val="single" w:sz="4" w:space="0" w:color="000000"/>
-              <w:left w:val="single" w:sz="4" w:space="0" w:color="000000"/>
-              <w:bottom w:val="single" w:sz="4" w:space="0" w:color="000000"/>
-              <w:right w:val="single" w:sz="4" w:space="0" w:color="000000"/>
+              <w:top w:val="single" w:color="000000" w:sz="4" w:space="0"/>
+              <w:left w:val="single" w:color="000000" w:sz="4" w:space="0"/>
+              <w:bottom w:val="single" w:color="000000" w:sz="4" w:space="0"/>
+              <w:right w:val="single" w:color="000000" w:sz="4" w:space="0"/>
             </w:tcBorders>
             <w:shd w:val="clear" w:color="auto" w:fill="FFFFFF"/>
             <w:tcMar>
@@ -690,10 +679,10 @@
           <w:tcPr>
             <w:tcW w:w="841" w:type="pct"/>
             <w:tcBorders>
-              <w:top w:val="single" w:sz="4" w:space="0" w:color="000000"/>
-              <w:left w:val="single" w:sz="4" w:space="0" w:color="000000"/>
-              <w:bottom w:val="single" w:sz="4" w:space="0" w:color="000000"/>
-              <w:right w:val="single" w:sz="4" w:space="0" w:color="000000"/>
+              <w:top w:val="single" w:color="000000" w:sz="4" w:space="0"/>
+              <w:left w:val="single" w:color="000000" w:sz="4" w:space="0"/>
+              <w:bottom w:val="single" w:color="000000" w:sz="4" w:space="0"/>
+              <w:right w:val="single" w:color="000000" w:sz="4" w:space="0"/>
             </w:tcBorders>
             <w:shd w:val="clear" w:color="auto" w:fill="FFFFFF"/>
             <w:tcMar>
@@ -717,10 +706,10 @@
           <w:tcPr>
             <w:tcW w:w="2337" w:type="pct"/>
             <w:tcBorders>
-              <w:top w:val="single" w:sz="4" w:space="0" w:color="000000"/>
-              <w:left w:val="single" w:sz="4" w:space="0" w:color="000000"/>
-              <w:bottom w:val="single" w:sz="4" w:space="0" w:color="000000"/>
-              <w:right w:val="single" w:sz="4" w:space="0" w:color="000000"/>
+              <w:top w:val="single" w:color="000000" w:sz="4" w:space="0"/>
+              <w:left w:val="single" w:color="000000" w:sz="4" w:space="0"/>
+              <w:bottom w:val="single" w:color="000000" w:sz="4" w:space="0"/>
+              <w:right w:val="single" w:color="000000" w:sz="4" w:space="0"/>
             </w:tcBorders>
             <w:shd w:val="clear" w:color="auto" w:fill="FFFFFF"/>
             <w:tcMar>
@@ -743,42 +732,45 @@
       </w:tr>
       <w:tr>
         <w:tblPrEx>
+          <w:tblBorders>
+            <w:top w:val="single" w:color="auto" w:sz="4" w:space="0"/>
+            <w:left w:val="single" w:color="auto" w:sz="4" w:space="0"/>
+            <w:bottom w:val="single" w:color="auto" w:sz="4" w:space="0"/>
+            <w:right w:val="single" w:color="auto" w:sz="4" w:space="0"/>
+            <w:insideH w:val="single" w:color="auto" w:sz="4" w:space="0"/>
+            <w:insideV w:val="single" w:color="auto" w:sz="4" w:space="0"/>
+          </w:tblBorders>
           <w:tblCellMar>
             <w:top w:w="0" w:type="dxa"/>
+            <w:left w:w="10" w:type="dxa"/>
             <w:bottom w:w="0" w:type="dxa"/>
+            <w:right w:w="10" w:type="dxa"/>
           </w:tblCellMar>
         </w:tblPrEx>
         <w:tc>
           <w:tcPr>
             <w:tcW w:w="1205" w:type="pct"/>
             <w:tcBorders>
-              <w:top w:val="single" w:sz="4" w:space="0" w:color="000000"/>
-              <w:left w:val="single" w:sz="4" w:space="0" w:color="000000"/>
-              <w:bottom w:val="single" w:sz="4" w:space="0" w:color="000000"/>
-              <w:right w:val="single" w:sz="4" w:space="0" w:color="000000"/>
-            </w:tcBorders>
-            <w:shd w:val="clear" w:color="auto" w:fill="FFFFFF"/>
-            <w:tcMar>
-              <w:top w:w="60" w:type="dxa"/>
-              <w:left w:w="100" w:type="dxa"/>
-              <w:bottom w:w="60" w:type="dxa"/>
-              <w:right w:w="100" w:type="dxa"/>
-            </w:tcMar>
-          </w:tcPr>
-          <w:p>
-            <w:r>
-              <w:rPr>
-                <w:sz w:val="18"/>
-                <w:szCs w:val="18"/>
-              </w:rPr>
-              <w:t>Camera</w:t>
-            </w:r>
-            <w:r>
-              <w:rPr>
-                <w:sz w:val="18"/>
-                <w:szCs w:val="18"/>
-              </w:rPr>
-              <w:t>.cpp</w:t>
+              <w:top w:val="single" w:color="000000" w:sz="4" w:space="0"/>
+              <w:left w:val="single" w:color="000000" w:sz="4" w:space="0"/>
+              <w:bottom w:val="single" w:color="000000" w:sz="4" w:space="0"/>
+              <w:right w:val="single" w:color="000000" w:sz="4" w:space="0"/>
+            </w:tcBorders>
+            <w:shd w:val="clear" w:color="auto" w:fill="FFFFFF"/>
+            <w:tcMar>
+              <w:top w:w="60" w:type="dxa"/>
+              <w:left w:w="100" w:type="dxa"/>
+              <w:bottom w:w="60" w:type="dxa"/>
+              <w:right w:w="100" w:type="dxa"/>
+            </w:tcMar>
+          </w:tcPr>
+          <w:p>
+            <w:r>
+              <w:rPr>
+                <w:sz w:val="18"/>
+                <w:szCs w:val="18"/>
+              </w:rPr>
+              <w:t>Camera.cpp</w:t>
             </w:r>
           </w:p>
         </w:tc>
@@ -786,10 +778,10 @@
           <w:tcPr>
             <w:tcW w:w="617" w:type="pct"/>
             <w:tcBorders>
-              <w:top w:val="single" w:sz="4" w:space="0" w:color="000000"/>
-              <w:left w:val="single" w:sz="4" w:space="0" w:color="000000"/>
-              <w:bottom w:val="single" w:sz="4" w:space="0" w:color="000000"/>
-              <w:right w:val="single" w:sz="4" w:space="0" w:color="000000"/>
+              <w:top w:val="single" w:color="000000" w:sz="4" w:space="0"/>
+              <w:left w:val="single" w:color="000000" w:sz="4" w:space="0"/>
+              <w:bottom w:val="single" w:color="000000" w:sz="4" w:space="0"/>
+              <w:right w:val="single" w:color="000000" w:sz="4" w:space="0"/>
             </w:tcBorders>
             <w:shd w:val="clear" w:color="auto" w:fill="FFFFFF"/>
             <w:tcMar>
@@ -813,10 +805,10 @@
           <w:tcPr>
             <w:tcW w:w="841" w:type="pct"/>
             <w:tcBorders>
-              <w:top w:val="single" w:sz="4" w:space="0" w:color="000000"/>
-              <w:left w:val="single" w:sz="4" w:space="0" w:color="000000"/>
-              <w:bottom w:val="single" w:sz="4" w:space="0" w:color="000000"/>
-              <w:right w:val="single" w:sz="4" w:space="0" w:color="000000"/>
+              <w:top w:val="single" w:color="000000" w:sz="4" w:space="0"/>
+              <w:left w:val="single" w:color="000000" w:sz="4" w:space="0"/>
+              <w:bottom w:val="single" w:color="000000" w:sz="4" w:space="0"/>
+              <w:right w:val="single" w:color="000000" w:sz="4" w:space="0"/>
             </w:tcBorders>
             <w:shd w:val="clear" w:color="auto" w:fill="FFFFFF"/>
             <w:tcMar>
@@ -840,10 +832,10 @@
           <w:tcPr>
             <w:tcW w:w="2337" w:type="pct"/>
             <w:tcBorders>
-              <w:top w:val="single" w:sz="4" w:space="0" w:color="000000"/>
-              <w:left w:val="single" w:sz="4" w:space="0" w:color="000000"/>
-              <w:bottom w:val="single" w:sz="4" w:space="0" w:color="000000"/>
-              <w:right w:val="single" w:sz="4" w:space="0" w:color="000000"/>
+              <w:top w:val="single" w:color="000000" w:sz="4" w:space="0"/>
+              <w:left w:val="single" w:color="000000" w:sz="4" w:space="0"/>
+              <w:bottom w:val="single" w:color="000000" w:sz="4" w:space="0"/>
+              <w:right w:val="single" w:color="000000" w:sz="4" w:space="0"/>
             </w:tcBorders>
             <w:shd w:val="clear" w:color="auto" w:fill="FFFFFF"/>
             <w:tcMar>
@@ -866,43 +858,45 @@
       </w:tr>
       <w:tr>
         <w:tblPrEx>
+          <w:tblBorders>
+            <w:top w:val="single" w:color="auto" w:sz="4" w:space="0"/>
+            <w:left w:val="single" w:color="auto" w:sz="4" w:space="0"/>
+            <w:bottom w:val="single" w:color="auto" w:sz="4" w:space="0"/>
+            <w:right w:val="single" w:color="auto" w:sz="4" w:space="0"/>
+            <w:insideH w:val="single" w:color="auto" w:sz="4" w:space="0"/>
+            <w:insideV w:val="single" w:color="auto" w:sz="4" w:space="0"/>
+          </w:tblBorders>
           <w:tblCellMar>
             <w:top w:w="0" w:type="dxa"/>
+            <w:left w:w="10" w:type="dxa"/>
             <w:bottom w:w="0" w:type="dxa"/>
+            <w:right w:w="10" w:type="dxa"/>
           </w:tblCellMar>
         </w:tblPrEx>
         <w:tc>
           <w:tcPr>
             <w:tcW w:w="1205" w:type="pct"/>
             <w:tcBorders>
-              <w:top w:val="single" w:sz="4" w:space="0" w:color="000000"/>
-              <w:left w:val="single" w:sz="4" w:space="0" w:color="000000"/>
-              <w:bottom w:val="single" w:sz="4" w:space="0" w:color="000000"/>
-              <w:right w:val="single" w:sz="4" w:space="0" w:color="000000"/>
-            </w:tcBorders>
-            <w:shd w:val="clear" w:color="auto" w:fill="FFFFFF"/>
-            <w:tcMar>
-              <w:top w:w="60" w:type="dxa"/>
-              <w:left w:w="100" w:type="dxa"/>
-              <w:bottom w:w="60" w:type="dxa"/>
-              <w:right w:w="100" w:type="dxa"/>
-            </w:tcMar>
-          </w:tcPr>
-          <w:p>
-            <w:r>
-              <w:rPr>
-                <w:sz w:val="18"/>
-                <w:szCs w:val="18"/>
-              </w:rPr>
-              <w:lastRenderedPageBreak/>
-              <w:t>Router</w:t>
-            </w:r>
-            <w:r>
-              <w:rPr>
-                <w:sz w:val="18"/>
-                <w:szCs w:val="18"/>
-              </w:rPr>
-              <w:t>.cpp</w:t>
+              <w:top w:val="single" w:color="000000" w:sz="4" w:space="0"/>
+              <w:left w:val="single" w:color="000000" w:sz="4" w:space="0"/>
+              <w:bottom w:val="single" w:color="000000" w:sz="4" w:space="0"/>
+              <w:right w:val="single" w:color="000000" w:sz="4" w:space="0"/>
+            </w:tcBorders>
+            <w:shd w:val="clear" w:color="auto" w:fill="FFFFFF"/>
+            <w:tcMar>
+              <w:top w:w="60" w:type="dxa"/>
+              <w:left w:w="100" w:type="dxa"/>
+              <w:bottom w:w="60" w:type="dxa"/>
+              <w:right w:w="100" w:type="dxa"/>
+            </w:tcMar>
+          </w:tcPr>
+          <w:p>
+            <w:r>
+              <w:rPr>
+                <w:sz w:val="18"/>
+                <w:szCs w:val="18"/>
+              </w:rPr>
+              <w:t>Router.cpp</w:t>
             </w:r>
           </w:p>
         </w:tc>
@@ -910,10 +904,10 @@
           <w:tcPr>
             <w:tcW w:w="617" w:type="pct"/>
             <w:tcBorders>
-              <w:top w:val="single" w:sz="4" w:space="0" w:color="000000"/>
-              <w:left w:val="single" w:sz="4" w:space="0" w:color="000000"/>
-              <w:bottom w:val="single" w:sz="4" w:space="0" w:color="000000"/>
-              <w:right w:val="single" w:sz="4" w:space="0" w:color="000000"/>
+              <w:top w:val="single" w:color="000000" w:sz="4" w:space="0"/>
+              <w:left w:val="single" w:color="000000" w:sz="4" w:space="0"/>
+              <w:bottom w:val="single" w:color="000000" w:sz="4" w:space="0"/>
+              <w:right w:val="single" w:color="000000" w:sz="4" w:space="0"/>
             </w:tcBorders>
             <w:shd w:val="clear" w:color="auto" w:fill="FFFFFF"/>
             <w:tcMar>
@@ -937,10 +931,10 @@
           <w:tcPr>
             <w:tcW w:w="841" w:type="pct"/>
             <w:tcBorders>
-              <w:top w:val="single" w:sz="4" w:space="0" w:color="000000"/>
-              <w:left w:val="single" w:sz="4" w:space="0" w:color="000000"/>
-              <w:bottom w:val="single" w:sz="4" w:space="0" w:color="000000"/>
-              <w:right w:val="single" w:sz="4" w:space="0" w:color="000000"/>
+              <w:top w:val="single" w:color="000000" w:sz="4" w:space="0"/>
+              <w:left w:val="single" w:color="000000" w:sz="4" w:space="0"/>
+              <w:bottom w:val="single" w:color="000000" w:sz="4" w:space="0"/>
+              <w:right w:val="single" w:color="000000" w:sz="4" w:space="0"/>
             </w:tcBorders>
             <w:shd w:val="clear" w:color="auto" w:fill="FFFFFF"/>
             <w:tcMar>
@@ -964,10 +958,10 @@
           <w:tcPr>
             <w:tcW w:w="2337" w:type="pct"/>
             <w:tcBorders>
-              <w:top w:val="single" w:sz="4" w:space="0" w:color="000000"/>
-              <w:left w:val="single" w:sz="4" w:space="0" w:color="000000"/>
-              <w:bottom w:val="single" w:sz="4" w:space="0" w:color="000000"/>
-              <w:right w:val="single" w:sz="4" w:space="0" w:color="000000"/>
+              <w:top w:val="single" w:color="000000" w:sz="4" w:space="0"/>
+              <w:left w:val="single" w:color="000000" w:sz="4" w:space="0"/>
+              <w:bottom w:val="single" w:color="000000" w:sz="4" w:space="0"/>
+              <w:right w:val="single" w:color="000000" w:sz="4" w:space="0"/>
             </w:tcBorders>
             <w:shd w:val="clear" w:color="auto" w:fill="FFFFFF"/>
             <w:tcMar>
@@ -990,42 +984,45 @@
       </w:tr>
       <w:tr>
         <w:tblPrEx>
+          <w:tblBorders>
+            <w:top w:val="single" w:color="auto" w:sz="4" w:space="0"/>
+            <w:left w:val="single" w:color="auto" w:sz="4" w:space="0"/>
+            <w:bottom w:val="single" w:color="auto" w:sz="4" w:space="0"/>
+            <w:right w:val="single" w:color="auto" w:sz="4" w:space="0"/>
+            <w:insideH w:val="single" w:color="auto" w:sz="4" w:space="0"/>
+            <w:insideV w:val="single" w:color="auto" w:sz="4" w:space="0"/>
+          </w:tblBorders>
           <w:tblCellMar>
             <w:top w:w="0" w:type="dxa"/>
+            <w:left w:w="10" w:type="dxa"/>
             <w:bottom w:w="0" w:type="dxa"/>
+            <w:right w:w="10" w:type="dxa"/>
           </w:tblCellMar>
         </w:tblPrEx>
         <w:tc>
           <w:tcPr>
             <w:tcW w:w="1205" w:type="pct"/>
             <w:tcBorders>
-              <w:top w:val="single" w:sz="4" w:space="0" w:color="000000"/>
-              <w:left w:val="single" w:sz="4" w:space="0" w:color="000000"/>
-              <w:bottom w:val="single" w:sz="4" w:space="0" w:color="000000"/>
-              <w:right w:val="single" w:sz="4" w:space="0" w:color="000000"/>
-            </w:tcBorders>
-            <w:shd w:val="clear" w:color="auto" w:fill="FFFFFF"/>
-            <w:tcMar>
-              <w:top w:w="60" w:type="dxa"/>
-              <w:left w:w="100" w:type="dxa"/>
-              <w:bottom w:w="60" w:type="dxa"/>
-              <w:right w:w="100" w:type="dxa"/>
-            </w:tcMar>
-          </w:tcPr>
-          <w:p>
-            <w:r>
-              <w:rPr>
-                <w:sz w:val="18"/>
-                <w:szCs w:val="18"/>
-              </w:rPr>
-              <w:t>SmartLock</w:t>
-            </w:r>
-            <w:r>
-              <w:rPr>
-                <w:sz w:val="18"/>
-                <w:szCs w:val="18"/>
-              </w:rPr>
-              <w:t>.cpp</w:t>
+              <w:top w:val="single" w:color="000000" w:sz="4" w:space="0"/>
+              <w:left w:val="single" w:color="000000" w:sz="4" w:space="0"/>
+              <w:bottom w:val="single" w:color="000000" w:sz="4" w:space="0"/>
+              <w:right w:val="single" w:color="000000" w:sz="4" w:space="0"/>
+            </w:tcBorders>
+            <w:shd w:val="clear" w:color="auto" w:fill="FFFFFF"/>
+            <w:tcMar>
+              <w:top w:w="60" w:type="dxa"/>
+              <w:left w:w="100" w:type="dxa"/>
+              <w:bottom w:w="60" w:type="dxa"/>
+              <w:right w:w="100" w:type="dxa"/>
+            </w:tcMar>
+          </w:tcPr>
+          <w:p>
+            <w:r>
+              <w:rPr>
+                <w:sz w:val="18"/>
+                <w:szCs w:val="18"/>
+              </w:rPr>
+              <w:t>SmartLock.cpp</w:t>
             </w:r>
           </w:p>
         </w:tc>
@@ -1033,10 +1030,10 @@
           <w:tcPr>
             <w:tcW w:w="617" w:type="pct"/>
             <w:tcBorders>
-              <w:top w:val="single" w:sz="4" w:space="0" w:color="000000"/>
-              <w:left w:val="single" w:sz="4" w:space="0" w:color="000000"/>
-              <w:bottom w:val="single" w:sz="4" w:space="0" w:color="000000"/>
-              <w:right w:val="single" w:sz="4" w:space="0" w:color="000000"/>
+              <w:top w:val="single" w:color="000000" w:sz="4" w:space="0"/>
+              <w:left w:val="single" w:color="000000" w:sz="4" w:space="0"/>
+              <w:bottom w:val="single" w:color="000000" w:sz="4" w:space="0"/>
+              <w:right w:val="single" w:color="000000" w:sz="4" w:space="0"/>
             </w:tcBorders>
             <w:shd w:val="clear" w:color="auto" w:fill="FFFFFF"/>
             <w:tcMar>
@@ -1060,10 +1057,10 @@
           <w:tcPr>
             <w:tcW w:w="841" w:type="pct"/>
             <w:tcBorders>
-              <w:top w:val="single" w:sz="4" w:space="0" w:color="000000"/>
-              <w:left w:val="single" w:sz="4" w:space="0" w:color="000000"/>
-              <w:bottom w:val="single" w:sz="4" w:space="0" w:color="000000"/>
-              <w:right w:val="single" w:sz="4" w:space="0" w:color="000000"/>
+              <w:top w:val="single" w:color="000000" w:sz="4" w:space="0"/>
+              <w:left w:val="single" w:color="000000" w:sz="4" w:space="0"/>
+              <w:bottom w:val="single" w:color="000000" w:sz="4" w:space="0"/>
+              <w:right w:val="single" w:color="000000" w:sz="4" w:space="0"/>
             </w:tcBorders>
             <w:shd w:val="clear" w:color="auto" w:fill="FFFFFF"/>
             <w:tcMar>
@@ -1087,10 +1084,10 @@
           <w:tcPr>
             <w:tcW w:w="2337" w:type="pct"/>
             <w:tcBorders>
-              <w:top w:val="single" w:sz="4" w:space="0" w:color="000000"/>
-              <w:left w:val="single" w:sz="4" w:space="0" w:color="000000"/>
-              <w:bottom w:val="single" w:sz="4" w:space="0" w:color="000000"/>
-              <w:right w:val="single" w:sz="4" w:space="0" w:color="000000"/>
+              <w:top w:val="single" w:color="000000" w:sz="4" w:space="0"/>
+              <w:left w:val="single" w:color="000000" w:sz="4" w:space="0"/>
+              <w:bottom w:val="single" w:color="000000" w:sz="4" w:space="0"/>
+              <w:right w:val="single" w:color="000000" w:sz="4" w:space="0"/>
             </w:tcBorders>
             <w:shd w:val="clear" w:color="auto" w:fill="FFFFFF"/>
             <w:tcMar>
@@ -1113,42 +1110,45 @@
       </w:tr>
       <w:tr>
         <w:tblPrEx>
+          <w:tblBorders>
+            <w:top w:val="single" w:color="auto" w:sz="4" w:space="0"/>
+            <w:left w:val="single" w:color="auto" w:sz="4" w:space="0"/>
+            <w:bottom w:val="single" w:color="auto" w:sz="4" w:space="0"/>
+            <w:right w:val="single" w:color="auto" w:sz="4" w:space="0"/>
+            <w:insideH w:val="single" w:color="auto" w:sz="4" w:space="0"/>
+            <w:insideV w:val="single" w:color="auto" w:sz="4" w:space="0"/>
+          </w:tblBorders>
           <w:tblCellMar>
             <w:top w:w="0" w:type="dxa"/>
+            <w:left w:w="10" w:type="dxa"/>
             <w:bottom w:w="0" w:type="dxa"/>
+            <w:right w:w="10" w:type="dxa"/>
           </w:tblCellMar>
         </w:tblPrEx>
         <w:tc>
           <w:tcPr>
             <w:tcW w:w="1205" w:type="pct"/>
             <w:tcBorders>
-              <w:top w:val="single" w:sz="4" w:space="0" w:color="000000"/>
-              <w:left w:val="single" w:sz="4" w:space="0" w:color="000000"/>
-              <w:bottom w:val="single" w:sz="4" w:space="0" w:color="000000"/>
-              <w:right w:val="single" w:sz="4" w:space="0" w:color="000000"/>
-            </w:tcBorders>
-            <w:shd w:val="clear" w:color="auto" w:fill="FFFFFF"/>
-            <w:tcMar>
-              <w:top w:w="60" w:type="dxa"/>
-              <w:left w:w="100" w:type="dxa"/>
-              <w:bottom w:w="60" w:type="dxa"/>
-              <w:right w:w="100" w:type="dxa"/>
-            </w:tcMar>
-          </w:tcPr>
-          <w:p>
-            <w:r>
-              <w:rPr>
-                <w:sz w:val="18"/>
-                <w:szCs w:val="18"/>
-              </w:rPr>
-              <w:t>SecurityEvent</w:t>
-            </w:r>
-            <w:r>
-              <w:rPr>
-                <w:sz w:val="18"/>
-                <w:szCs w:val="18"/>
-              </w:rPr>
-              <w:t>.cpp</w:t>
+              <w:top w:val="single" w:color="000000" w:sz="4" w:space="0"/>
+              <w:left w:val="single" w:color="000000" w:sz="4" w:space="0"/>
+              <w:bottom w:val="single" w:color="000000" w:sz="4" w:space="0"/>
+              <w:right w:val="single" w:color="000000" w:sz="4" w:space="0"/>
+            </w:tcBorders>
+            <w:shd w:val="clear" w:color="auto" w:fill="FFFFFF"/>
+            <w:tcMar>
+              <w:top w:w="60" w:type="dxa"/>
+              <w:left w:w="100" w:type="dxa"/>
+              <w:bottom w:w="60" w:type="dxa"/>
+              <w:right w:w="100" w:type="dxa"/>
+            </w:tcMar>
+          </w:tcPr>
+          <w:p>
+            <w:r>
+              <w:rPr>
+                <w:sz w:val="18"/>
+                <w:szCs w:val="18"/>
+              </w:rPr>
+              <w:t>SecurityEvent.cpp</w:t>
             </w:r>
           </w:p>
         </w:tc>
@@ -1156,10 +1156,10 @@
           <w:tcPr>
             <w:tcW w:w="617" w:type="pct"/>
             <w:tcBorders>
-              <w:top w:val="single" w:sz="4" w:space="0" w:color="000000"/>
-              <w:left w:val="single" w:sz="4" w:space="0" w:color="000000"/>
-              <w:bottom w:val="single" w:sz="4" w:space="0" w:color="000000"/>
-              <w:right w:val="single" w:sz="4" w:space="0" w:color="000000"/>
+              <w:top w:val="single" w:color="000000" w:sz="4" w:space="0"/>
+              <w:left w:val="single" w:color="000000" w:sz="4" w:space="0"/>
+              <w:bottom w:val="single" w:color="000000" w:sz="4" w:space="0"/>
+              <w:right w:val="single" w:color="000000" w:sz="4" w:space="0"/>
             </w:tcBorders>
             <w:shd w:val="clear" w:color="auto" w:fill="FFFFFF"/>
             <w:tcMar>
@@ -1183,10 +1183,10 @@
           <w:tcPr>
             <w:tcW w:w="841" w:type="pct"/>
             <w:tcBorders>
-              <w:top w:val="single" w:sz="4" w:space="0" w:color="000000"/>
-              <w:left w:val="single" w:sz="4" w:space="0" w:color="000000"/>
-              <w:bottom w:val="single" w:sz="4" w:space="0" w:color="000000"/>
-              <w:right w:val="single" w:sz="4" w:space="0" w:color="000000"/>
+              <w:top w:val="single" w:color="000000" w:sz="4" w:space="0"/>
+              <w:left w:val="single" w:color="000000" w:sz="4" w:space="0"/>
+              <w:bottom w:val="single" w:color="000000" w:sz="4" w:space="0"/>
+              <w:right w:val="single" w:color="000000" w:sz="4" w:space="0"/>
             </w:tcBorders>
             <w:shd w:val="clear" w:color="auto" w:fill="FFFFFF"/>
             <w:tcMar>
@@ -1210,10 +1210,10 @@
           <w:tcPr>
             <w:tcW w:w="2337" w:type="pct"/>
             <w:tcBorders>
-              <w:top w:val="single" w:sz="4" w:space="0" w:color="000000"/>
-              <w:left w:val="single" w:sz="4" w:space="0" w:color="000000"/>
-              <w:bottom w:val="single" w:sz="4" w:space="0" w:color="000000"/>
-              <w:right w:val="single" w:sz="4" w:space="0" w:color="000000"/>
+              <w:top w:val="single" w:color="000000" w:sz="4" w:space="0"/>
+              <w:left w:val="single" w:color="000000" w:sz="4" w:space="0"/>
+              <w:bottom w:val="single" w:color="000000" w:sz="4" w:space="0"/>
+              <w:right w:val="single" w:color="000000" w:sz="4" w:space="0"/>
             </w:tcBorders>
             <w:shd w:val="clear" w:color="auto" w:fill="FFFFFF"/>
             <w:tcMar>
@@ -1236,42 +1236,45 @@
       </w:tr>
       <w:tr>
         <w:tblPrEx>
+          <w:tblBorders>
+            <w:top w:val="single" w:color="auto" w:sz="4" w:space="0"/>
+            <w:left w:val="single" w:color="auto" w:sz="4" w:space="0"/>
+            <w:bottom w:val="single" w:color="auto" w:sz="4" w:space="0"/>
+            <w:right w:val="single" w:color="auto" w:sz="4" w:space="0"/>
+            <w:insideH w:val="single" w:color="auto" w:sz="4" w:space="0"/>
+            <w:insideV w:val="single" w:color="auto" w:sz="4" w:space="0"/>
+          </w:tblBorders>
           <w:tblCellMar>
             <w:top w:w="0" w:type="dxa"/>
+            <w:left w:w="10" w:type="dxa"/>
             <w:bottom w:w="0" w:type="dxa"/>
+            <w:right w:w="10" w:type="dxa"/>
           </w:tblCellMar>
         </w:tblPrEx>
         <w:tc>
           <w:tcPr>
             <w:tcW w:w="1205" w:type="pct"/>
             <w:tcBorders>
-              <w:top w:val="single" w:sz="4" w:space="0" w:color="000000"/>
-              <w:left w:val="single" w:sz="4" w:space="0" w:color="000000"/>
-              <w:bottom w:val="single" w:sz="4" w:space="0" w:color="000000"/>
-              <w:right w:val="single" w:sz="4" w:space="0" w:color="000000"/>
-            </w:tcBorders>
-            <w:shd w:val="clear" w:color="auto" w:fill="FFFFFF"/>
-            <w:tcMar>
-              <w:top w:w="60" w:type="dxa"/>
-              <w:left w:w="100" w:type="dxa"/>
-              <w:bottom w:w="60" w:type="dxa"/>
-              <w:right w:w="100" w:type="dxa"/>
-            </w:tcMar>
-          </w:tcPr>
-          <w:p>
-            <w:r>
-              <w:rPr>
-                <w:sz w:val="18"/>
-                <w:szCs w:val="18"/>
-              </w:rPr>
-              <w:t>EventSeverity</w:t>
-            </w:r>
-            <w:r>
-              <w:rPr>
-                <w:sz w:val="18"/>
-                <w:szCs w:val="18"/>
-              </w:rPr>
-              <w:t>.cpp</w:t>
+              <w:top w:val="single" w:color="000000" w:sz="4" w:space="0"/>
+              <w:left w:val="single" w:color="000000" w:sz="4" w:space="0"/>
+              <w:bottom w:val="single" w:color="000000" w:sz="4" w:space="0"/>
+              <w:right w:val="single" w:color="000000" w:sz="4" w:space="0"/>
+            </w:tcBorders>
+            <w:shd w:val="clear" w:color="auto" w:fill="FFFFFF"/>
+            <w:tcMar>
+              <w:top w:w="60" w:type="dxa"/>
+              <w:left w:w="100" w:type="dxa"/>
+              <w:bottom w:w="60" w:type="dxa"/>
+              <w:right w:w="100" w:type="dxa"/>
+            </w:tcMar>
+          </w:tcPr>
+          <w:p>
+            <w:r>
+              <w:rPr>
+                <w:sz w:val="18"/>
+                <w:szCs w:val="18"/>
+              </w:rPr>
+              <w:t>EventSeverity.cpp</w:t>
             </w:r>
           </w:p>
         </w:tc>
@@ -1279,10 +1282,10 @@
           <w:tcPr>
             <w:tcW w:w="617" w:type="pct"/>
             <w:tcBorders>
-              <w:top w:val="single" w:sz="4" w:space="0" w:color="000000"/>
-              <w:left w:val="single" w:sz="4" w:space="0" w:color="000000"/>
-              <w:bottom w:val="single" w:sz="4" w:space="0" w:color="000000"/>
-              <w:right w:val="single" w:sz="4" w:space="0" w:color="000000"/>
+              <w:top w:val="single" w:color="000000" w:sz="4" w:space="0"/>
+              <w:left w:val="single" w:color="000000" w:sz="4" w:space="0"/>
+              <w:bottom w:val="single" w:color="000000" w:sz="4" w:space="0"/>
+              <w:right w:val="single" w:color="000000" w:sz="4" w:space="0"/>
             </w:tcBorders>
             <w:shd w:val="clear" w:color="auto" w:fill="FFFFFF"/>
             <w:tcMar>
@@ -1306,10 +1309,10 @@
           <w:tcPr>
             <w:tcW w:w="841" w:type="pct"/>
             <w:tcBorders>
-              <w:top w:val="single" w:sz="4" w:space="0" w:color="000000"/>
-              <w:left w:val="single" w:sz="4" w:space="0" w:color="000000"/>
-              <w:bottom w:val="single" w:sz="4" w:space="0" w:color="000000"/>
-              <w:right w:val="single" w:sz="4" w:space="0" w:color="000000"/>
+              <w:top w:val="single" w:color="000000" w:sz="4" w:space="0"/>
+              <w:left w:val="single" w:color="000000" w:sz="4" w:space="0"/>
+              <w:bottom w:val="single" w:color="000000" w:sz="4" w:space="0"/>
+              <w:right w:val="single" w:color="000000" w:sz="4" w:space="0"/>
             </w:tcBorders>
             <w:shd w:val="clear" w:color="auto" w:fill="FFFFFF"/>
             <w:tcMar>
@@ -1333,10 +1336,10 @@
           <w:tcPr>
             <w:tcW w:w="2337" w:type="pct"/>
             <w:tcBorders>
-              <w:top w:val="single" w:sz="4" w:space="0" w:color="000000"/>
-              <w:left w:val="single" w:sz="4" w:space="0" w:color="000000"/>
-              <w:bottom w:val="single" w:sz="4" w:space="0" w:color="000000"/>
-              <w:right w:val="single" w:sz="4" w:space="0" w:color="000000"/>
+              <w:top w:val="single" w:color="000000" w:sz="4" w:space="0"/>
+              <w:left w:val="single" w:color="000000" w:sz="4" w:space="0"/>
+              <w:bottom w:val="single" w:color="000000" w:sz="4" w:space="0"/>
+              <w:right w:val="single" w:color="000000" w:sz="4" w:space="0"/>
             </w:tcBorders>
             <w:shd w:val="clear" w:color="auto" w:fill="FFFFFF"/>
             <w:tcMar>
@@ -1359,19 +1362,29 @@
       </w:tr>
       <w:tr>
         <w:tblPrEx>
+          <w:tblBorders>
+            <w:top w:val="single" w:color="auto" w:sz="4" w:space="0"/>
+            <w:left w:val="single" w:color="auto" w:sz="4" w:space="0"/>
+            <w:bottom w:val="single" w:color="auto" w:sz="4" w:space="0"/>
+            <w:right w:val="single" w:color="auto" w:sz="4" w:space="0"/>
+            <w:insideH w:val="single" w:color="auto" w:sz="4" w:space="0"/>
+            <w:insideV w:val="single" w:color="auto" w:sz="4" w:space="0"/>
+          </w:tblBorders>
           <w:tblCellMar>
             <w:top w:w="0" w:type="dxa"/>
+            <w:left w:w="10" w:type="dxa"/>
             <w:bottom w:w="0" w:type="dxa"/>
+            <w:right w:w="10" w:type="dxa"/>
           </w:tblCellMar>
         </w:tblPrEx>
         <w:tc>
           <w:tcPr>
             <w:tcW w:w="1205" w:type="pct"/>
             <w:tcBorders>
-              <w:top w:val="single" w:sz="4" w:space="0" w:color="000000"/>
-              <w:left w:val="single" w:sz="4" w:space="0" w:color="000000"/>
-              <w:bottom w:val="single" w:sz="4" w:space="0" w:color="000000"/>
-              <w:right w:val="single" w:sz="4" w:space="0" w:color="000000"/>
+              <w:top w:val="single" w:color="000000" w:sz="4" w:space="0"/>
+              <w:left w:val="single" w:color="000000" w:sz="4" w:space="0"/>
+              <w:bottom w:val="single" w:color="000000" w:sz="4" w:space="0"/>
+              <w:right w:val="single" w:color="000000" w:sz="4" w:space="0"/>
             </w:tcBorders>
             <w:shd w:val="clear" w:color="auto" w:fill="FFFFFF"/>
             <w:tcMar>
@@ -1395,10 +1408,10 @@
           <w:tcPr>
             <w:tcW w:w="617" w:type="pct"/>
             <w:tcBorders>
-              <w:top w:val="single" w:sz="4" w:space="0" w:color="000000"/>
-              <w:left w:val="single" w:sz="4" w:space="0" w:color="000000"/>
-              <w:bottom w:val="single" w:sz="4" w:space="0" w:color="000000"/>
-              <w:right w:val="single" w:sz="4" w:space="0" w:color="000000"/>
+              <w:top w:val="single" w:color="000000" w:sz="4" w:space="0"/>
+              <w:left w:val="single" w:color="000000" w:sz="4" w:space="0"/>
+              <w:bottom w:val="single" w:color="000000" w:sz="4" w:space="0"/>
+              <w:right w:val="single" w:color="000000" w:sz="4" w:space="0"/>
             </w:tcBorders>
             <w:shd w:val="clear" w:color="auto" w:fill="FFFFFF"/>
             <w:tcMar>
@@ -1422,10 +1435,10 @@
           <w:tcPr>
             <w:tcW w:w="841" w:type="pct"/>
             <w:tcBorders>
-              <w:top w:val="single" w:sz="4" w:space="0" w:color="000000"/>
-              <w:left w:val="single" w:sz="4" w:space="0" w:color="000000"/>
-              <w:bottom w:val="single" w:sz="4" w:space="0" w:color="000000"/>
-              <w:right w:val="single" w:sz="4" w:space="0" w:color="000000"/>
+              <w:top w:val="single" w:color="000000" w:sz="4" w:space="0"/>
+              <w:left w:val="single" w:color="000000" w:sz="4" w:space="0"/>
+              <w:bottom w:val="single" w:color="000000" w:sz="4" w:space="0"/>
+              <w:right w:val="single" w:color="000000" w:sz="4" w:space="0"/>
             </w:tcBorders>
             <w:shd w:val="clear" w:color="auto" w:fill="FFFFFF"/>
             <w:tcMar>
@@ -1449,10 +1462,10 @@
           <w:tcPr>
             <w:tcW w:w="2337" w:type="pct"/>
             <w:tcBorders>
-              <w:top w:val="single" w:sz="4" w:space="0" w:color="000000"/>
-              <w:left w:val="single" w:sz="4" w:space="0" w:color="000000"/>
-              <w:bottom w:val="single" w:sz="4" w:space="0" w:color="000000"/>
-              <w:right w:val="single" w:sz="4" w:space="0" w:color="000000"/>
+              <w:top w:val="single" w:color="000000" w:sz="4" w:space="0"/>
+              <w:left w:val="single" w:color="000000" w:sz="4" w:space="0"/>
+              <w:bottom w:val="single" w:color="000000" w:sz="4" w:space="0"/>
+              <w:right w:val="single" w:color="000000" w:sz="4" w:space="0"/>
             </w:tcBorders>
             <w:shd w:val="clear" w:color="auto" w:fill="FFFFFF"/>
             <w:tcMar>
@@ -1475,42 +1488,45 @@
       </w:tr>
       <w:tr>
         <w:tblPrEx>
+          <w:tblBorders>
+            <w:top w:val="single" w:color="auto" w:sz="4" w:space="0"/>
+            <w:left w:val="single" w:color="auto" w:sz="4" w:space="0"/>
+            <w:bottom w:val="single" w:color="auto" w:sz="4" w:space="0"/>
+            <w:right w:val="single" w:color="auto" w:sz="4" w:space="0"/>
+            <w:insideH w:val="single" w:color="auto" w:sz="4" w:space="0"/>
+            <w:insideV w:val="single" w:color="auto" w:sz="4" w:space="0"/>
+          </w:tblBorders>
           <w:tblCellMar>
             <w:top w:w="0" w:type="dxa"/>
+            <w:left w:w="10" w:type="dxa"/>
             <w:bottom w:w="0" w:type="dxa"/>
+            <w:right w:w="10" w:type="dxa"/>
           </w:tblCellMar>
         </w:tblPrEx>
         <w:tc>
           <w:tcPr>
             <w:tcW w:w="1205" w:type="pct"/>
             <w:tcBorders>
-              <w:top w:val="single" w:sz="4" w:space="0" w:color="000000"/>
-              <w:left w:val="single" w:sz="4" w:space="0" w:color="000000"/>
-              <w:bottom w:val="single" w:sz="4" w:space="0" w:color="000000"/>
-              <w:right w:val="single" w:sz="4" w:space="0" w:color="000000"/>
-            </w:tcBorders>
-            <w:shd w:val="clear" w:color="auto" w:fill="FFFFFF"/>
-            <w:tcMar>
-              <w:top w:w="60" w:type="dxa"/>
-              <w:left w:w="100" w:type="dxa"/>
-              <w:bottom w:w="60" w:type="dxa"/>
-              <w:right w:w="100" w:type="dxa"/>
-            </w:tcMar>
-          </w:tcPr>
-          <w:p>
-            <w:r>
-              <w:rPr>
-                <w:sz w:val="18"/>
-                <w:szCs w:val="18"/>
-              </w:rPr>
-              <w:t>SecurityMonitor</w:t>
-            </w:r>
-            <w:r>
-              <w:rPr>
-                <w:sz w:val="18"/>
-                <w:szCs w:val="18"/>
-              </w:rPr>
-              <w:t>.cpp</w:t>
+              <w:top w:val="single" w:color="000000" w:sz="4" w:space="0"/>
+              <w:left w:val="single" w:color="000000" w:sz="4" w:space="0"/>
+              <w:bottom w:val="single" w:color="000000" w:sz="4" w:space="0"/>
+              <w:right w:val="single" w:color="000000" w:sz="4" w:space="0"/>
+            </w:tcBorders>
+            <w:shd w:val="clear" w:color="auto" w:fill="FFFFFF"/>
+            <w:tcMar>
+              <w:top w:w="60" w:type="dxa"/>
+              <w:left w:w="100" w:type="dxa"/>
+              <w:bottom w:w="60" w:type="dxa"/>
+              <w:right w:w="100" w:type="dxa"/>
+            </w:tcMar>
+          </w:tcPr>
+          <w:p>
+            <w:r>
+              <w:rPr>
+                <w:sz w:val="18"/>
+                <w:szCs w:val="18"/>
+              </w:rPr>
+              <w:t>SecurityMonitor.cpp</w:t>
             </w:r>
           </w:p>
         </w:tc>
@@ -1518,10 +1534,10 @@
           <w:tcPr>
             <w:tcW w:w="617" w:type="pct"/>
             <w:tcBorders>
-              <w:top w:val="single" w:sz="4" w:space="0" w:color="000000"/>
-              <w:left w:val="single" w:sz="4" w:space="0" w:color="000000"/>
-              <w:bottom w:val="single" w:sz="4" w:space="0" w:color="000000"/>
-              <w:right w:val="single" w:sz="4" w:space="0" w:color="000000"/>
+              <w:top w:val="single" w:color="000000" w:sz="4" w:space="0"/>
+              <w:left w:val="single" w:color="000000" w:sz="4" w:space="0"/>
+              <w:bottom w:val="single" w:color="000000" w:sz="4" w:space="0"/>
+              <w:right w:val="single" w:color="000000" w:sz="4" w:space="0"/>
             </w:tcBorders>
             <w:shd w:val="clear" w:color="auto" w:fill="FFFFFF"/>
             <w:tcMar>
@@ -1545,10 +1561,10 @@
           <w:tcPr>
             <w:tcW w:w="841" w:type="pct"/>
             <w:tcBorders>
-              <w:top w:val="single" w:sz="4" w:space="0" w:color="000000"/>
-              <w:left w:val="single" w:sz="4" w:space="0" w:color="000000"/>
-              <w:bottom w:val="single" w:sz="4" w:space="0" w:color="000000"/>
-              <w:right w:val="single" w:sz="4" w:space="0" w:color="000000"/>
+              <w:top w:val="single" w:color="000000" w:sz="4" w:space="0"/>
+              <w:left w:val="single" w:color="000000" w:sz="4" w:space="0"/>
+              <w:bottom w:val="single" w:color="000000" w:sz="4" w:space="0"/>
+              <w:right w:val="single" w:color="000000" w:sz="4" w:space="0"/>
             </w:tcBorders>
             <w:shd w:val="clear" w:color="auto" w:fill="FFFFFF"/>
             <w:tcMar>
@@ -1572,75 +1588,71 @@
           <w:tcPr>
             <w:tcW w:w="2337" w:type="pct"/>
             <w:tcBorders>
-              <w:top w:val="single" w:sz="4" w:space="0" w:color="000000"/>
-              <w:left w:val="single" w:sz="4" w:space="0" w:color="000000"/>
-              <w:bottom w:val="single" w:sz="4" w:space="0" w:color="000000"/>
-              <w:right w:val="single" w:sz="4" w:space="0" w:color="000000"/>
-            </w:tcBorders>
-            <w:shd w:val="clear" w:color="auto" w:fill="FFFFFF"/>
-            <w:tcMar>
-              <w:top w:w="60" w:type="dxa"/>
-              <w:left w:w="100" w:type="dxa"/>
-              <w:bottom w:w="60" w:type="dxa"/>
-              <w:right w:w="100" w:type="dxa"/>
-            </w:tcMar>
-          </w:tcPr>
-          <w:p>
-            <w:r>
-              <w:rPr>
-                <w:sz w:val="18"/>
-                <w:szCs w:val="18"/>
-              </w:rPr>
-              <w:t xml:space="preserve">Sistemin merkezi </w:t>
-            </w:r>
-            <w:r>
-              <w:rPr>
-                <w:sz w:val="18"/>
-                <w:szCs w:val="18"/>
-              </w:rPr>
-              <w:t>beyin; cihaz kaydı, thread tabanlı eşzamanlı tarama, thread-safe olay kaydetme ve log görüntüleme.</w:t>
+              <w:top w:val="single" w:color="000000" w:sz="4" w:space="0"/>
+              <w:left w:val="single" w:color="000000" w:sz="4" w:space="0"/>
+              <w:bottom w:val="single" w:color="000000" w:sz="4" w:space="0"/>
+              <w:right w:val="single" w:color="000000" w:sz="4" w:space="0"/>
+            </w:tcBorders>
+            <w:shd w:val="clear" w:color="auto" w:fill="FFFFFF"/>
+            <w:tcMar>
+              <w:top w:w="60" w:type="dxa"/>
+              <w:left w:w="100" w:type="dxa"/>
+              <w:bottom w:w="60" w:type="dxa"/>
+              <w:right w:w="100" w:type="dxa"/>
+            </w:tcMar>
+          </w:tcPr>
+          <w:p>
+            <w:r>
+              <w:rPr>
+                <w:sz w:val="18"/>
+                <w:szCs w:val="18"/>
+              </w:rPr>
+              <w:t>Sistemin merkezi beyin; cihaz kaydı, thread tabanlı eşzamanlı tarama, thread-safe olay kaydetme ve log görüntüleme.</w:t>
             </w:r>
           </w:p>
         </w:tc>
       </w:tr>
       <w:tr>
         <w:tblPrEx>
+          <w:tblBorders>
+            <w:top w:val="single" w:color="auto" w:sz="4" w:space="0"/>
+            <w:left w:val="single" w:color="auto" w:sz="4" w:space="0"/>
+            <w:bottom w:val="single" w:color="auto" w:sz="4" w:space="0"/>
+            <w:right w:val="single" w:color="auto" w:sz="4" w:space="0"/>
+            <w:insideH w:val="single" w:color="auto" w:sz="4" w:space="0"/>
+            <w:insideV w:val="single" w:color="auto" w:sz="4" w:space="0"/>
+          </w:tblBorders>
           <w:tblCellMar>
             <w:top w:w="0" w:type="dxa"/>
+            <w:left w:w="10" w:type="dxa"/>
             <w:bottom w:w="0" w:type="dxa"/>
+            <w:right w:w="10" w:type="dxa"/>
           </w:tblCellMar>
         </w:tblPrEx>
         <w:tc>
           <w:tcPr>
             <w:tcW w:w="1205" w:type="pct"/>
             <w:tcBorders>
-              <w:top w:val="single" w:sz="4" w:space="0" w:color="000000"/>
-              <w:left w:val="single" w:sz="4" w:space="0" w:color="000000"/>
-              <w:bottom w:val="single" w:sz="4" w:space="0" w:color="000000"/>
-              <w:right w:val="single" w:sz="4" w:space="0" w:color="000000"/>
-            </w:tcBorders>
-            <w:shd w:val="clear" w:color="auto" w:fill="FFFFFF"/>
-            <w:tcMar>
-              <w:top w:w="60" w:type="dxa"/>
-              <w:left w:w="100" w:type="dxa"/>
-              <w:bottom w:w="60" w:type="dxa"/>
-              <w:right w:w="100" w:type="dxa"/>
-            </w:tcMar>
-          </w:tcPr>
-          <w:p>
-            <w:r>
-              <w:rPr>
-                <w:sz w:val="18"/>
-                <w:szCs w:val="18"/>
-              </w:rPr>
-              <w:t>LogManager</w:t>
-            </w:r>
-            <w:r>
-              <w:rPr>
-                <w:sz w:val="18"/>
-                <w:szCs w:val="18"/>
-              </w:rPr>
-              <w:t>.cpp</w:t>
+              <w:top w:val="single" w:color="000000" w:sz="4" w:space="0"/>
+              <w:left w:val="single" w:color="000000" w:sz="4" w:space="0"/>
+              <w:bottom w:val="single" w:color="000000" w:sz="4" w:space="0"/>
+              <w:right w:val="single" w:color="000000" w:sz="4" w:space="0"/>
+            </w:tcBorders>
+            <w:shd w:val="clear" w:color="auto" w:fill="FFFFFF"/>
+            <w:tcMar>
+              <w:top w:w="60" w:type="dxa"/>
+              <w:left w:w="100" w:type="dxa"/>
+              <w:bottom w:w="60" w:type="dxa"/>
+              <w:right w:w="100" w:type="dxa"/>
+            </w:tcMar>
+          </w:tcPr>
+          <w:p>
+            <w:r>
+              <w:rPr>
+                <w:sz w:val="18"/>
+                <w:szCs w:val="18"/>
+              </w:rPr>
+              <w:t>LogManager.cpp</w:t>
             </w:r>
           </w:p>
         </w:tc>
@@ -1648,10 +1660,10 @@
           <w:tcPr>
             <w:tcW w:w="617" w:type="pct"/>
             <w:tcBorders>
-              <w:top w:val="single" w:sz="4" w:space="0" w:color="000000"/>
-              <w:left w:val="single" w:sz="4" w:space="0" w:color="000000"/>
-              <w:bottom w:val="single" w:sz="4" w:space="0" w:color="000000"/>
-              <w:right w:val="single" w:sz="4" w:space="0" w:color="000000"/>
+              <w:top w:val="single" w:color="000000" w:sz="4" w:space="0"/>
+              <w:left w:val="single" w:color="000000" w:sz="4" w:space="0"/>
+              <w:bottom w:val="single" w:color="000000" w:sz="4" w:space="0"/>
+              <w:right w:val="single" w:color="000000" w:sz="4" w:space="0"/>
             </w:tcBorders>
             <w:shd w:val="clear" w:color="auto" w:fill="FFFFFF"/>
             <w:tcMar>
@@ -1675,10 +1687,10 @@
           <w:tcPr>
             <w:tcW w:w="841" w:type="pct"/>
             <w:tcBorders>
-              <w:top w:val="single" w:sz="4" w:space="0" w:color="000000"/>
-              <w:left w:val="single" w:sz="4" w:space="0" w:color="000000"/>
-              <w:bottom w:val="single" w:sz="4" w:space="0" w:color="000000"/>
-              <w:right w:val="single" w:sz="4" w:space="0" w:color="000000"/>
+              <w:top w:val="single" w:color="000000" w:sz="4" w:space="0"/>
+              <w:left w:val="single" w:color="000000" w:sz="4" w:space="0"/>
+              <w:bottom w:val="single" w:color="000000" w:sz="4" w:space="0"/>
+              <w:right w:val="single" w:color="000000" w:sz="4" w:space="0"/>
             </w:tcBorders>
             <w:shd w:val="clear" w:color="auto" w:fill="FFFFFF"/>
             <w:tcMar>
@@ -1702,75 +1714,71 @@
           <w:tcPr>
             <w:tcW w:w="2337" w:type="pct"/>
             <w:tcBorders>
-              <w:top w:val="single" w:sz="4" w:space="0" w:color="000000"/>
-              <w:left w:val="single" w:sz="4" w:space="0" w:color="000000"/>
-              <w:bottom w:val="single" w:sz="4" w:space="0" w:color="000000"/>
-              <w:right w:val="single" w:sz="4" w:space="0" w:color="000000"/>
-            </w:tcBorders>
-            <w:shd w:val="clear" w:color="auto" w:fill="FFFFFF"/>
-            <w:tcMar>
-              <w:top w:w="60" w:type="dxa"/>
-              <w:left w:w="100" w:type="dxa"/>
-              <w:bottom w:w="60" w:type="dxa"/>
-              <w:right w:w="100" w:type="dxa"/>
-            </w:tcMar>
-          </w:tcPr>
-          <w:p>
-            <w:r>
-              <w:rPr>
-                <w:sz w:val="18"/>
-                <w:szCs w:val="18"/>
-              </w:rPr>
-              <w:t>Std::ofstream</w:t>
-            </w:r>
-            <w:r>
-              <w:rPr>
-                <w:sz w:val="18"/>
-                <w:szCs w:val="18"/>
-              </w:rPr>
-              <w:t xml:space="preserve"> ile güvenlik olaylarını security_logs.txt dosyasına kalıcı olarak kaydeder.</w:t>
+              <w:top w:val="single" w:color="000000" w:sz="4" w:space="0"/>
+              <w:left w:val="single" w:color="000000" w:sz="4" w:space="0"/>
+              <w:bottom w:val="single" w:color="000000" w:sz="4" w:space="0"/>
+              <w:right w:val="single" w:color="000000" w:sz="4" w:space="0"/>
+            </w:tcBorders>
+            <w:shd w:val="clear" w:color="auto" w:fill="FFFFFF"/>
+            <w:tcMar>
+              <w:top w:w="60" w:type="dxa"/>
+              <w:left w:w="100" w:type="dxa"/>
+              <w:bottom w:w="60" w:type="dxa"/>
+              <w:right w:w="100" w:type="dxa"/>
+            </w:tcMar>
+          </w:tcPr>
+          <w:p>
+            <w:r>
+              <w:rPr>
+                <w:sz w:val="18"/>
+                <w:szCs w:val="18"/>
+              </w:rPr>
+              <w:t>Std::ofstream ile güvenlik olaylarını security_logs.txt dosyasına kalıcı olarak kaydeder.</w:t>
             </w:r>
           </w:p>
         </w:tc>
       </w:tr>
       <w:tr>
         <w:tblPrEx>
+          <w:tblBorders>
+            <w:top w:val="single" w:color="auto" w:sz="4" w:space="0"/>
+            <w:left w:val="single" w:color="auto" w:sz="4" w:space="0"/>
+            <w:bottom w:val="single" w:color="auto" w:sz="4" w:space="0"/>
+            <w:right w:val="single" w:color="auto" w:sz="4" w:space="0"/>
+            <w:insideH w:val="single" w:color="auto" w:sz="4" w:space="0"/>
+            <w:insideV w:val="single" w:color="auto" w:sz="4" w:space="0"/>
+          </w:tblBorders>
           <w:tblCellMar>
             <w:top w:w="0" w:type="dxa"/>
+            <w:left w:w="10" w:type="dxa"/>
             <w:bottom w:w="0" w:type="dxa"/>
+            <w:right w:w="10" w:type="dxa"/>
           </w:tblCellMar>
         </w:tblPrEx>
         <w:tc>
           <w:tcPr>
             <w:tcW w:w="1205" w:type="pct"/>
             <w:tcBorders>
-              <w:top w:val="single" w:sz="4" w:space="0" w:color="000000"/>
-              <w:left w:val="single" w:sz="4" w:space="0" w:color="000000"/>
-              <w:bottom w:val="single" w:sz="4" w:space="0" w:color="000000"/>
-              <w:right w:val="single" w:sz="4" w:space="0" w:color="000000"/>
-            </w:tcBorders>
-            <w:shd w:val="clear" w:color="auto" w:fill="FFFFFF"/>
-            <w:tcMar>
-              <w:top w:w="60" w:type="dxa"/>
-              <w:left w:w="100" w:type="dxa"/>
-              <w:bottom w:w="60" w:type="dxa"/>
-              <w:right w:w="100" w:type="dxa"/>
-            </w:tcMar>
-          </w:tcPr>
-          <w:p>
-            <w:r>
-              <w:rPr>
-                <w:sz w:val="18"/>
-                <w:szCs w:val="18"/>
-              </w:rPr>
-              <w:t>Main</w:t>
-            </w:r>
-            <w:r>
-              <w:rPr>
-                <w:sz w:val="18"/>
-                <w:szCs w:val="18"/>
-              </w:rPr>
-              <w:t>.cpp</w:t>
+              <w:top w:val="single" w:color="000000" w:sz="4" w:space="0"/>
+              <w:left w:val="single" w:color="000000" w:sz="4" w:space="0"/>
+              <w:bottom w:val="single" w:color="000000" w:sz="4" w:space="0"/>
+              <w:right w:val="single" w:color="000000" w:sz="4" w:space="0"/>
+            </w:tcBorders>
+            <w:shd w:val="clear" w:color="auto" w:fill="FFFFFF"/>
+            <w:tcMar>
+              <w:top w:w="60" w:type="dxa"/>
+              <w:left w:w="100" w:type="dxa"/>
+              <w:bottom w:w="60" w:type="dxa"/>
+              <w:right w:w="100" w:type="dxa"/>
+            </w:tcMar>
+          </w:tcPr>
+          <w:p>
+            <w:r>
+              <w:rPr>
+                <w:sz w:val="18"/>
+                <w:szCs w:val="18"/>
+              </w:rPr>
+              <w:t>Main.cpp</w:t>
             </w:r>
           </w:p>
         </w:tc>
@@ -1778,10 +1786,10 @@
           <w:tcPr>
             <w:tcW w:w="617" w:type="pct"/>
             <w:tcBorders>
-              <w:top w:val="single" w:sz="4" w:space="0" w:color="000000"/>
-              <w:left w:val="single" w:sz="4" w:space="0" w:color="000000"/>
-              <w:bottom w:val="single" w:sz="4" w:space="0" w:color="000000"/>
-              <w:right w:val="single" w:sz="4" w:space="0" w:color="000000"/>
+              <w:top w:val="single" w:color="000000" w:sz="4" w:space="0"/>
+              <w:left w:val="single" w:color="000000" w:sz="4" w:space="0"/>
+              <w:bottom w:val="single" w:color="000000" w:sz="4" w:space="0"/>
+              <w:right w:val="single" w:color="000000" w:sz="4" w:space="0"/>
             </w:tcBorders>
             <w:shd w:val="clear" w:color="auto" w:fill="FFFFFF"/>
             <w:tcMar>
@@ -1805,10 +1813,10 @@
           <w:tcPr>
             <w:tcW w:w="841" w:type="pct"/>
             <w:tcBorders>
-              <w:top w:val="single" w:sz="4" w:space="0" w:color="000000"/>
-              <w:left w:val="single" w:sz="4" w:space="0" w:color="000000"/>
-              <w:bottom w:val="single" w:sz="4" w:space="0" w:color="000000"/>
-              <w:right w:val="single" w:sz="4" w:space="0" w:color="000000"/>
+              <w:top w:val="single" w:color="000000" w:sz="4" w:space="0"/>
+              <w:left w:val="single" w:color="000000" w:sz="4" w:space="0"/>
+              <w:bottom w:val="single" w:color="000000" w:sz="4" w:space="0"/>
+              <w:right w:val="single" w:color="000000" w:sz="4" w:space="0"/>
             </w:tcBorders>
             <w:shd w:val="clear" w:color="auto" w:fill="FFFFFF"/>
             <w:tcMar>
@@ -1832,10 +1840,10 @@
           <w:tcPr>
             <w:tcW w:w="2337" w:type="pct"/>
             <w:tcBorders>
-              <w:top w:val="single" w:sz="4" w:space="0" w:color="000000"/>
-              <w:left w:val="single" w:sz="4" w:space="0" w:color="000000"/>
-              <w:bottom w:val="single" w:sz="4" w:space="0" w:color="000000"/>
-              <w:right w:val="single" w:sz="4" w:space="0" w:color="000000"/>
+              <w:top w:val="single" w:color="000000" w:sz="4" w:space="0"/>
+              <w:left w:val="single" w:color="000000" w:sz="4" w:space="0"/>
+              <w:bottom w:val="single" w:color="000000" w:sz="4" w:space="0"/>
+              <w:right w:val="single" w:color="000000" w:sz="4" w:space="0"/>
             </w:tcBorders>
             <w:shd w:val="clear" w:color="auto" w:fill="FFFFFF"/>
             <w:tcMar>
@@ -1909,31 +1917,45 @@
     </w:p>
     <w:tbl>
       <w:tblPr>
+        <w:tblStyle w:val="9"/>
         <w:tblW w:w="5000" w:type="pct"/>
+        <w:tblInd w:w="0" w:type="dxa"/>
         <w:tblBorders>
-          <w:top w:val="single" w:sz="4" w:space="0" w:color="auto"/>
-          <w:left w:val="single" w:sz="4" w:space="0" w:color="auto"/>
-          <w:bottom w:val="single" w:sz="4" w:space="0" w:color="auto"/>
-          <w:right w:val="single" w:sz="4" w:space="0" w:color="auto"/>
-          <w:insideH w:val="single" w:sz="4" w:space="0" w:color="auto"/>
-          <w:insideV w:val="single" w:sz="4" w:space="0" w:color="auto"/>
+          <w:top w:val="single" w:color="auto" w:sz="4" w:space="0"/>
+          <w:left w:val="single" w:color="auto" w:sz="4" w:space="0"/>
+          <w:bottom w:val="single" w:color="auto" w:sz="4" w:space="0"/>
+          <w:right w:val="single" w:color="auto" w:sz="4" w:space="0"/>
+          <w:insideH w:val="single" w:color="auto" w:sz="4" w:space="0"/>
+          <w:insideV w:val="single" w:color="auto" w:sz="4" w:space="0"/>
         </w:tblBorders>
+        <w:tblLayout w:type="autofit"/>
         <w:tblCellMar>
+          <w:top w:w="0" w:type="dxa"/>
           <w:left w:w="10" w:type="dxa"/>
+          <w:bottom w:w="0" w:type="dxa"/>
           <w:right w:w="10" w:type="dxa"/>
         </w:tblCellMar>
-        <w:tblLook w:val="04A0" w:firstRow="1" w:lastRow="0" w:firstColumn="1" w:lastColumn="0" w:noHBand="0" w:noVBand="1"/>
       </w:tblPr>
       <w:tblGrid>
-        <w:gridCol w:w="1128"/>
-        <w:gridCol w:w="1591"/>
-        <w:gridCol w:w="1591"/>
+        <w:gridCol w:w="1180"/>
+        <w:gridCol w:w="1670"/>
+        <w:gridCol w:w="1670"/>
       </w:tblGrid>
       <w:tr>
         <w:tblPrEx>
+          <w:tblBorders>
+            <w:top w:val="single" w:color="auto" w:sz="4" w:space="0"/>
+            <w:left w:val="single" w:color="auto" w:sz="4" w:space="0"/>
+            <w:bottom w:val="single" w:color="auto" w:sz="4" w:space="0"/>
+            <w:right w:val="single" w:color="auto" w:sz="4" w:space="0"/>
+            <w:insideH w:val="single" w:color="auto" w:sz="4" w:space="0"/>
+            <w:insideV w:val="single" w:color="auto" w:sz="4" w:space="0"/>
+          </w:tblBorders>
           <w:tblCellMar>
             <w:top w:w="0" w:type="dxa"/>
+            <w:left w:w="10" w:type="dxa"/>
             <w:bottom w:w="0" w:type="dxa"/>
+            <w:right w:w="10" w:type="dxa"/>
           </w:tblCellMar>
         </w:tblPrEx>
         <w:trPr>
@@ -1943,10 +1965,10 @@
           <w:tcPr>
             <w:tcW w:w="1175" w:type="pct"/>
             <w:tcBorders>
-              <w:top w:val="single" w:sz="4" w:space="0" w:color="000000"/>
-              <w:left w:val="single" w:sz="4" w:space="0" w:color="000000"/>
-              <w:bottom w:val="single" w:sz="4" w:space="0" w:color="000000"/>
-              <w:right w:val="single" w:sz="4" w:space="0" w:color="000000"/>
+              <w:top w:val="single" w:color="000000" w:sz="4" w:space="0"/>
+              <w:left w:val="single" w:color="000000" w:sz="4" w:space="0"/>
+              <w:bottom w:val="single" w:color="000000" w:sz="4" w:space="0"/>
+              <w:right w:val="single" w:color="000000" w:sz="4" w:space="0"/>
             </w:tcBorders>
             <w:shd w:val="clear" w:color="auto" w:fill="D0D0D0"/>
             <w:tcMar>
@@ -1972,10 +1994,10 @@
           <w:tcPr>
             <w:tcW w:w="1474" w:type="pct"/>
             <w:tcBorders>
-              <w:top w:val="single" w:sz="4" w:space="0" w:color="000000"/>
-              <w:left w:val="single" w:sz="4" w:space="0" w:color="000000"/>
-              <w:bottom w:val="single" w:sz="4" w:space="0" w:color="000000"/>
-              <w:right w:val="single" w:sz="4" w:space="0" w:color="000000"/>
+              <w:top w:val="single" w:color="000000" w:sz="4" w:space="0"/>
+              <w:left w:val="single" w:color="000000" w:sz="4" w:space="0"/>
+              <w:bottom w:val="single" w:color="000000" w:sz="4" w:space="0"/>
+              <w:right w:val="single" w:color="000000" w:sz="4" w:space="0"/>
             </w:tcBorders>
             <w:shd w:val="clear" w:color="auto" w:fill="D0D0D0"/>
             <w:tcMar>
@@ -2001,10 +2023,10 @@
           <w:tcPr>
             <w:tcW w:w="2350" w:type="pct"/>
             <w:tcBorders>
-              <w:top w:val="single" w:sz="4" w:space="0" w:color="000000"/>
-              <w:left w:val="single" w:sz="4" w:space="0" w:color="000000"/>
-              <w:bottom w:val="single" w:sz="4" w:space="0" w:color="000000"/>
-              <w:right w:val="single" w:sz="4" w:space="0" w:color="000000"/>
+              <w:top w:val="single" w:color="000000" w:sz="4" w:space="0"/>
+              <w:left w:val="single" w:color="000000" w:sz="4" w:space="0"/>
+              <w:bottom w:val="single" w:color="000000" w:sz="4" w:space="0"/>
+              <w:right w:val="single" w:color="000000" w:sz="4" w:space="0"/>
             </w:tcBorders>
             <w:shd w:val="clear" w:color="auto" w:fill="D0D0D0"/>
             <w:tcMar>
@@ -2029,19 +2051,29 @@
       </w:tr>
       <w:tr>
         <w:tblPrEx>
+          <w:tblBorders>
+            <w:top w:val="single" w:color="auto" w:sz="4" w:space="0"/>
+            <w:left w:val="single" w:color="auto" w:sz="4" w:space="0"/>
+            <w:bottom w:val="single" w:color="auto" w:sz="4" w:space="0"/>
+            <w:right w:val="single" w:color="auto" w:sz="4" w:space="0"/>
+            <w:insideH w:val="single" w:color="auto" w:sz="4" w:space="0"/>
+            <w:insideV w:val="single" w:color="auto" w:sz="4" w:space="0"/>
+          </w:tblBorders>
           <w:tblCellMar>
             <w:top w:w="0" w:type="dxa"/>
+            <w:left w:w="10" w:type="dxa"/>
             <w:bottom w:w="0" w:type="dxa"/>
+            <w:right w:w="10" w:type="dxa"/>
           </w:tblCellMar>
         </w:tblPrEx>
         <w:tc>
           <w:tcPr>
             <w:tcW w:w="1175" w:type="pct"/>
             <w:tcBorders>
-              <w:top w:val="single" w:sz="4" w:space="0" w:color="000000"/>
-              <w:left w:val="single" w:sz="4" w:space="0" w:color="000000"/>
-              <w:bottom w:val="single" w:sz="4" w:space="0" w:color="000000"/>
-              <w:right w:val="single" w:sz="4" w:space="0" w:color="000000"/>
+              <w:top w:val="single" w:color="000000" w:sz="4" w:space="0"/>
+              <w:left w:val="single" w:color="000000" w:sz="4" w:space="0"/>
+              <w:bottom w:val="single" w:color="000000" w:sz="4" w:space="0"/>
+              <w:right w:val="single" w:color="000000" w:sz="4" w:space="0"/>
             </w:tcBorders>
             <w:shd w:val="clear" w:color="auto" w:fill="FFFFFF"/>
             <w:tcMar>
@@ -2065,10 +2097,10 @@
           <w:tcPr>
             <w:tcW w:w="1474" w:type="pct"/>
             <w:tcBorders>
-              <w:top w:val="single" w:sz="4" w:space="0" w:color="000000"/>
-              <w:left w:val="single" w:sz="4" w:space="0" w:color="000000"/>
-              <w:bottom w:val="single" w:sz="4" w:space="0" w:color="000000"/>
-              <w:right w:val="single" w:sz="4" w:space="0" w:color="000000"/>
+              <w:top w:val="single" w:color="000000" w:sz="4" w:space="0"/>
+              <w:left w:val="single" w:color="000000" w:sz="4" w:space="0"/>
+              <w:bottom w:val="single" w:color="000000" w:sz="4" w:space="0"/>
+              <w:right w:val="single" w:color="000000" w:sz="4" w:space="0"/>
             </w:tcBorders>
             <w:shd w:val="clear" w:color="auto" w:fill="FFFFFF"/>
             <w:tcMar>
@@ -2092,10 +2124,10 @@
           <w:tcPr>
             <w:tcW w:w="2350" w:type="pct"/>
             <w:tcBorders>
-              <w:top w:val="single" w:sz="4" w:space="0" w:color="000000"/>
-              <w:left w:val="single" w:sz="4" w:space="0" w:color="000000"/>
-              <w:bottom w:val="single" w:sz="4" w:space="0" w:color="000000"/>
-              <w:right w:val="single" w:sz="4" w:space="0" w:color="000000"/>
+              <w:top w:val="single" w:color="000000" w:sz="4" w:space="0"/>
+              <w:left w:val="single" w:color="000000" w:sz="4" w:space="0"/>
+              <w:bottom w:val="single" w:color="000000" w:sz="4" w:space="0"/>
+              <w:right w:val="single" w:color="000000" w:sz="4" w:space="0"/>
             </w:tcBorders>
             <w:shd w:val="clear" w:color="auto" w:fill="FFFFFF"/>
             <w:tcMar>
@@ -2118,35 +2150,44 @@
       </w:tr>
       <w:tr>
         <w:tblPrEx>
+          <w:tblBorders>
+            <w:top w:val="single" w:color="auto" w:sz="4" w:space="0"/>
+            <w:left w:val="single" w:color="auto" w:sz="4" w:space="0"/>
+            <w:bottom w:val="single" w:color="auto" w:sz="4" w:space="0"/>
+            <w:right w:val="single" w:color="auto" w:sz="4" w:space="0"/>
+            <w:insideH w:val="single" w:color="auto" w:sz="4" w:space="0"/>
+            <w:insideV w:val="single" w:color="auto" w:sz="4" w:space="0"/>
+          </w:tblBorders>
           <w:tblCellMar>
             <w:top w:w="0" w:type="dxa"/>
+            <w:left w:w="10" w:type="dxa"/>
             <w:bottom w:w="0" w:type="dxa"/>
+            <w:right w:w="10" w:type="dxa"/>
           </w:tblCellMar>
         </w:tblPrEx>
         <w:tc>
           <w:tcPr>
             <w:tcW w:w="1175" w:type="pct"/>
             <w:tcBorders>
-              <w:top w:val="single" w:sz="4" w:space="0" w:color="000000"/>
-              <w:left w:val="single" w:sz="4" w:space="0" w:color="000000"/>
-              <w:bottom w:val="single" w:sz="4" w:space="0" w:color="000000"/>
-              <w:right w:val="single" w:sz="4" w:space="0" w:color="000000"/>
-            </w:tcBorders>
-            <w:shd w:val="clear" w:color="auto" w:fill="FFFFFF"/>
-            <w:tcMar>
-              <w:top w:w="60" w:type="dxa"/>
-              <w:left w:w="100" w:type="dxa"/>
-              <w:bottom w:w="60" w:type="dxa"/>
-              <w:right w:w="100" w:type="dxa"/>
-            </w:tcMar>
-          </w:tcPr>
-          <w:p>
-            <w:r>
-              <w:rPr>
-                <w:sz w:val="18"/>
-                <w:szCs w:val="18"/>
-              </w:rPr>
-              <w:lastRenderedPageBreak/>
+              <w:top w:val="single" w:color="000000" w:sz="4" w:space="0"/>
+              <w:left w:val="single" w:color="000000" w:sz="4" w:space="0"/>
+              <w:bottom w:val="single" w:color="000000" w:sz="4" w:space="0"/>
+              <w:right w:val="single" w:color="000000" w:sz="4" w:space="0"/>
+            </w:tcBorders>
+            <w:shd w:val="clear" w:color="auto" w:fill="FFFFFF"/>
+            <w:tcMar>
+              <w:top w:w="60" w:type="dxa"/>
+              <w:left w:w="100" w:type="dxa"/>
+              <w:bottom w:w="60" w:type="dxa"/>
+              <w:right w:w="100" w:type="dxa"/>
+            </w:tcMar>
+          </w:tcPr>
+          <w:p>
+            <w:r>
+              <w:rPr>
+                <w:sz w:val="18"/>
+                <w:szCs w:val="18"/>
+              </w:rPr>
               <w:t>Çok Biçimlilik (Polymorphism)</w:t>
             </w:r>
           </w:p>
@@ -2155,10 +2196,10 @@
           <w:tcPr>
             <w:tcW w:w="1474" w:type="pct"/>
             <w:tcBorders>
-              <w:top w:val="single" w:sz="4" w:space="0" w:color="000000"/>
-              <w:left w:val="single" w:sz="4" w:space="0" w:color="000000"/>
-              <w:bottom w:val="single" w:sz="4" w:space="0" w:color="000000"/>
-              <w:right w:val="single" w:sz="4" w:space="0" w:color="000000"/>
+              <w:top w:val="single" w:color="000000" w:sz="4" w:space="0"/>
+              <w:left w:val="single" w:color="000000" w:sz="4" w:space="0"/>
+              <w:bottom w:val="single" w:color="000000" w:sz="4" w:space="0"/>
+              <w:right w:val="single" w:color="000000" w:sz="4" w:space="0"/>
             </w:tcBorders>
             <w:shd w:val="clear" w:color="auto" w:fill="FFFFFF"/>
             <w:tcMar>
@@ -2182,10 +2223,10 @@
           <w:tcPr>
             <w:tcW w:w="2350" w:type="pct"/>
             <w:tcBorders>
-              <w:top w:val="single" w:sz="4" w:space="0" w:color="000000"/>
-              <w:left w:val="single" w:sz="4" w:space="0" w:color="000000"/>
-              <w:bottom w:val="single" w:sz="4" w:space="0" w:color="000000"/>
-              <w:right w:val="single" w:sz="4" w:space="0" w:color="000000"/>
+              <w:top w:val="single" w:color="000000" w:sz="4" w:space="0"/>
+              <w:left w:val="single" w:color="000000" w:sz="4" w:space="0"/>
+              <w:bottom w:val="single" w:color="000000" w:sz="4" w:space="0"/>
+              <w:right w:val="single" w:color="000000" w:sz="4" w:space="0"/>
             </w:tcBorders>
             <w:shd w:val="clear" w:color="auto" w:fill="FFFFFF"/>
             <w:tcMar>
@@ -2208,19 +2249,29 @@
       </w:tr>
       <w:tr>
         <w:tblPrEx>
+          <w:tblBorders>
+            <w:top w:val="single" w:color="auto" w:sz="4" w:space="0"/>
+            <w:left w:val="single" w:color="auto" w:sz="4" w:space="0"/>
+            <w:bottom w:val="single" w:color="auto" w:sz="4" w:space="0"/>
+            <w:right w:val="single" w:color="auto" w:sz="4" w:space="0"/>
+            <w:insideH w:val="single" w:color="auto" w:sz="4" w:space="0"/>
+            <w:insideV w:val="single" w:color="auto" w:sz="4" w:space="0"/>
+          </w:tblBorders>
           <w:tblCellMar>
             <w:top w:w="0" w:type="dxa"/>
+            <w:left w:w="10" w:type="dxa"/>
             <w:bottom w:w="0" w:type="dxa"/>
+            <w:right w:w="10" w:type="dxa"/>
           </w:tblCellMar>
         </w:tblPrEx>
         <w:tc>
           <w:tcPr>
             <w:tcW w:w="1175" w:type="pct"/>
             <w:tcBorders>
-              <w:top w:val="single" w:sz="4" w:space="0" w:color="000000"/>
-              <w:left w:val="single" w:sz="4" w:space="0" w:color="000000"/>
-              <w:bottom w:val="single" w:sz="4" w:space="0" w:color="000000"/>
-              <w:right w:val="single" w:sz="4" w:space="0" w:color="000000"/>
+              <w:top w:val="single" w:color="000000" w:sz="4" w:space="0"/>
+              <w:left w:val="single" w:color="000000" w:sz="4" w:space="0"/>
+              <w:bottom w:val="single" w:color="000000" w:sz="4" w:space="0"/>
+              <w:right w:val="single" w:color="000000" w:sz="4" w:space="0"/>
             </w:tcBorders>
             <w:shd w:val="clear" w:color="auto" w:fill="FFFFFF"/>
             <w:tcMar>
@@ -2244,10 +2295,10 @@
           <w:tcPr>
             <w:tcW w:w="1474" w:type="pct"/>
             <w:tcBorders>
-              <w:top w:val="single" w:sz="4" w:space="0" w:color="000000"/>
-              <w:left w:val="single" w:sz="4" w:space="0" w:color="000000"/>
-              <w:bottom w:val="single" w:sz="4" w:space="0" w:color="000000"/>
-              <w:right w:val="single" w:sz="4" w:space="0" w:color="000000"/>
+              <w:top w:val="single" w:color="000000" w:sz="4" w:space="0"/>
+              <w:left w:val="single" w:color="000000" w:sz="4" w:space="0"/>
+              <w:bottom w:val="single" w:color="000000" w:sz="4" w:space="0"/>
+              <w:right w:val="single" w:color="000000" w:sz="4" w:space="0"/>
             </w:tcBorders>
             <w:shd w:val="clear" w:color="auto" w:fill="FFFFFF"/>
             <w:tcMar>
@@ -2271,10 +2322,10 @@
           <w:tcPr>
             <w:tcW w:w="2350" w:type="pct"/>
             <w:tcBorders>
-              <w:top w:val="single" w:sz="4" w:space="0" w:color="000000"/>
-              <w:left w:val="single" w:sz="4" w:space="0" w:color="000000"/>
-              <w:bottom w:val="single" w:sz="4" w:space="0" w:color="000000"/>
-              <w:right w:val="single" w:sz="4" w:space="0" w:color="000000"/>
+              <w:top w:val="single" w:color="000000" w:sz="4" w:space="0"/>
+              <w:left w:val="single" w:color="000000" w:sz="4" w:space="0"/>
+              <w:bottom w:val="single" w:color="000000" w:sz="4" w:space="0"/>
+              <w:right w:val="single" w:color="000000" w:sz="4" w:space="0"/>
             </w:tcBorders>
             <w:shd w:val="clear" w:color="auto" w:fill="FFFFFF"/>
             <w:tcMar>
@@ -2297,49 +2348,45 @@
       </w:tr>
       <w:tr>
         <w:tblPrEx>
+          <w:tblBorders>
+            <w:top w:val="single" w:color="auto" w:sz="4" w:space="0"/>
+            <w:left w:val="single" w:color="auto" w:sz="4" w:space="0"/>
+            <w:bottom w:val="single" w:color="auto" w:sz="4" w:space="0"/>
+            <w:right w:val="single" w:color="auto" w:sz="4" w:space="0"/>
+            <w:insideH w:val="single" w:color="auto" w:sz="4" w:space="0"/>
+            <w:insideV w:val="single" w:color="auto" w:sz="4" w:space="0"/>
+          </w:tblBorders>
           <w:tblCellMar>
             <w:top w:w="0" w:type="dxa"/>
+            <w:left w:w="10" w:type="dxa"/>
             <w:bottom w:w="0" w:type="dxa"/>
+            <w:right w:w="10" w:type="dxa"/>
           </w:tblCellMar>
         </w:tblPrEx>
         <w:tc>
           <w:tcPr>
             <w:tcW w:w="1175" w:type="pct"/>
             <w:tcBorders>
-              <w:top w:val="single" w:sz="4" w:space="0" w:color="000000"/>
-              <w:left w:val="single" w:sz="4" w:space="0" w:color="000000"/>
-              <w:bottom w:val="single" w:sz="4" w:space="0" w:color="000000"/>
-              <w:right w:val="single" w:sz="4" w:space="0" w:color="000000"/>
-            </w:tcBorders>
-            <w:shd w:val="clear" w:color="auto" w:fill="FFFFFF"/>
-            <w:tcMar>
-              <w:top w:w="60" w:type="dxa"/>
-              <w:left w:w="100" w:type="dxa"/>
-              <w:bottom w:w="60" w:type="dxa"/>
-              <w:right w:w="100" w:type="dxa"/>
-            </w:tcMar>
-          </w:tcPr>
-          <w:p>
-            <w:r>
-              <w:rPr>
-                <w:sz w:val="18"/>
-                <w:szCs w:val="18"/>
-              </w:rPr>
-              <w:t>Arayüz (</w:t>
-            </w:r>
-            <w:r>
-              <w:rPr>
-                <w:sz w:val="18"/>
-                <w:szCs w:val="18"/>
-              </w:rPr>
-              <w:t>Saf Sanal</w:t>
-            </w:r>
-            <w:r>
-              <w:rPr>
-                <w:sz w:val="18"/>
-                <w:szCs w:val="18"/>
-              </w:rPr>
-              <w:t>)</w:t>
+              <w:top w:val="single" w:color="000000" w:sz="4" w:space="0"/>
+              <w:left w:val="single" w:color="000000" w:sz="4" w:space="0"/>
+              <w:bottom w:val="single" w:color="000000" w:sz="4" w:space="0"/>
+              <w:right w:val="single" w:color="000000" w:sz="4" w:space="0"/>
+            </w:tcBorders>
+            <w:shd w:val="clear" w:color="auto" w:fill="FFFFFF"/>
+            <w:tcMar>
+              <w:top w:w="60" w:type="dxa"/>
+              <w:left w:w="100" w:type="dxa"/>
+              <w:bottom w:w="60" w:type="dxa"/>
+              <w:right w:w="100" w:type="dxa"/>
+            </w:tcMar>
+          </w:tcPr>
+          <w:p>
+            <w:r>
+              <w:rPr>
+                <w:sz w:val="18"/>
+                <w:szCs w:val="18"/>
+              </w:rPr>
+              <w:t>Arayüz (Saf Sanal)</w:t>
             </w:r>
           </w:p>
         </w:tc>
@@ -2347,10 +2394,10 @@
           <w:tcPr>
             <w:tcW w:w="1474" w:type="pct"/>
             <w:tcBorders>
-              <w:top w:val="single" w:sz="4" w:space="0" w:color="000000"/>
-              <w:left w:val="single" w:sz="4" w:space="0" w:color="000000"/>
-              <w:bottom w:val="single" w:sz="4" w:space="0" w:color="000000"/>
-              <w:right w:val="single" w:sz="4" w:space="0" w:color="000000"/>
+              <w:top w:val="single" w:color="000000" w:sz="4" w:space="0"/>
+              <w:left w:val="single" w:color="000000" w:sz="4" w:space="0"/>
+              <w:bottom w:val="single" w:color="000000" w:sz="4" w:space="0"/>
+              <w:right w:val="single" w:color="000000" w:sz="4" w:space="0"/>
             </w:tcBorders>
             <w:shd w:val="clear" w:color="auto" w:fill="FFFFFF"/>
             <w:tcMar>
@@ -2374,10 +2421,10 @@
           <w:tcPr>
             <w:tcW w:w="2350" w:type="pct"/>
             <w:tcBorders>
-              <w:top w:val="single" w:sz="4" w:space="0" w:color="000000"/>
-              <w:left w:val="single" w:sz="4" w:space="0" w:color="000000"/>
-              <w:bottom w:val="single" w:sz="4" w:space="0" w:color="000000"/>
-              <w:right w:val="single" w:sz="4" w:space="0" w:color="000000"/>
+              <w:top w:val="single" w:color="000000" w:sz="4" w:space="0"/>
+              <w:left w:val="single" w:color="000000" w:sz="4" w:space="0"/>
+              <w:bottom w:val="single" w:color="000000" w:sz="4" w:space="0"/>
+              <w:right w:val="single" w:color="000000" w:sz="4" w:space="0"/>
             </w:tcBorders>
             <w:shd w:val="clear" w:color="auto" w:fill="FFFFFF"/>
             <w:tcMar>
@@ -2400,19 +2447,29 @@
       </w:tr>
       <w:tr>
         <w:tblPrEx>
+          <w:tblBorders>
+            <w:top w:val="single" w:color="auto" w:sz="4" w:space="0"/>
+            <w:left w:val="single" w:color="auto" w:sz="4" w:space="0"/>
+            <w:bottom w:val="single" w:color="auto" w:sz="4" w:space="0"/>
+            <w:right w:val="single" w:color="auto" w:sz="4" w:space="0"/>
+            <w:insideH w:val="single" w:color="auto" w:sz="4" w:space="0"/>
+            <w:insideV w:val="single" w:color="auto" w:sz="4" w:space="0"/>
+          </w:tblBorders>
           <w:tblCellMar>
             <w:top w:w="0" w:type="dxa"/>
+            <w:left w:w="10" w:type="dxa"/>
             <w:bottom w:w="0" w:type="dxa"/>
+            <w:right w:w="10" w:type="dxa"/>
           </w:tblCellMar>
         </w:tblPrEx>
         <w:tc>
           <w:tcPr>
             <w:tcW w:w="1175" w:type="pct"/>
             <w:tcBorders>
-              <w:top w:val="single" w:sz="4" w:space="0" w:color="000000"/>
-              <w:left w:val="single" w:sz="4" w:space="0" w:color="000000"/>
-              <w:bottom w:val="single" w:sz="4" w:space="0" w:color="000000"/>
-              <w:right w:val="single" w:sz="4" w:space="0" w:color="000000"/>
+              <w:top w:val="single" w:color="000000" w:sz="4" w:space="0"/>
+              <w:left w:val="single" w:color="000000" w:sz="4" w:space="0"/>
+              <w:bottom w:val="single" w:color="000000" w:sz="4" w:space="0"/>
+              <w:right w:val="single" w:color="000000" w:sz="4" w:space="0"/>
             </w:tcBorders>
             <w:shd w:val="clear" w:color="auto" w:fill="FFFFFF"/>
             <w:tcMar>
@@ -2436,10 +2493,10 @@
           <w:tcPr>
             <w:tcW w:w="1474" w:type="pct"/>
             <w:tcBorders>
-              <w:top w:val="single" w:sz="4" w:space="0" w:color="000000"/>
-              <w:left w:val="single" w:sz="4" w:space="0" w:color="000000"/>
-              <w:bottom w:val="single" w:sz="4" w:space="0" w:color="000000"/>
-              <w:right w:val="single" w:sz="4" w:space="0" w:color="000000"/>
+              <w:top w:val="single" w:color="000000" w:sz="4" w:space="0"/>
+              <w:left w:val="single" w:color="000000" w:sz="4" w:space="0"/>
+              <w:bottom w:val="single" w:color="000000" w:sz="4" w:space="0"/>
+              <w:right w:val="single" w:color="000000" w:sz="4" w:space="0"/>
             </w:tcBorders>
             <w:shd w:val="clear" w:color="auto" w:fill="FFFFFF"/>
             <w:tcMar>
@@ -2463,10 +2520,10 @@
           <w:tcPr>
             <w:tcW w:w="2350" w:type="pct"/>
             <w:tcBorders>
-              <w:top w:val="single" w:sz="4" w:space="0" w:color="000000"/>
-              <w:left w:val="single" w:sz="4" w:space="0" w:color="000000"/>
-              <w:bottom w:val="single" w:sz="4" w:space="0" w:color="000000"/>
-              <w:right w:val="single" w:sz="4" w:space="0" w:color="000000"/>
+              <w:top w:val="single" w:color="000000" w:sz="4" w:space="0"/>
+              <w:left w:val="single" w:color="000000" w:sz="4" w:space="0"/>
+              <w:bottom w:val="single" w:color="000000" w:sz="4" w:space="0"/>
+              <w:right w:val="single" w:color="000000" w:sz="4" w:space="0"/>
             </w:tcBorders>
             <w:shd w:val="clear" w:color="auto" w:fill="FFFFFF"/>
             <w:tcMar>
@@ -2587,13 +2644,7 @@
         <w:jc w:val="both"/>
       </w:pPr>
       <w:r>
-        <w:t xml:space="preserve">Proje, temel OOP prensiplerinin ötesinde bir dizi ileri düzey </w:t>
-      </w:r>
-      <w:r>
-        <w:t>C++</w:t>
-      </w:r>
-      <w:r>
-        <w:t xml:space="preserve"> özelliğini işlevsel biçimde entegre etmektedir. Bu özellikler sistemin gerçekçiliğini ve mühendislik kalitesini önemli ölçüde artırmaktadır.</w:t>
+        <w:t>Proje, temel OOP prensiplerinin ötesinde bir dizi ileri düzey C++ özelliğini işlevsel biçimde entegre etmektedir. Bu özellikler sistemin gerçekçiliğini ve mühendislik kalitesini önemli ölçüde artırmaktadır.</w:t>
       </w:r>
     </w:p>
     <w:p>
@@ -2618,31 +2669,45 @@
     </w:p>
     <w:tbl>
       <w:tblPr>
+        <w:tblStyle w:val="9"/>
         <w:tblW w:w="5000" w:type="pct"/>
+        <w:tblInd w:w="0" w:type="dxa"/>
         <w:tblBorders>
-          <w:top w:val="single" w:sz="4" w:space="0" w:color="auto"/>
-          <w:left w:val="single" w:sz="4" w:space="0" w:color="auto"/>
-          <w:bottom w:val="single" w:sz="4" w:space="0" w:color="auto"/>
-          <w:right w:val="single" w:sz="4" w:space="0" w:color="auto"/>
-          <w:insideH w:val="single" w:sz="4" w:space="0" w:color="auto"/>
-          <w:insideV w:val="single" w:sz="4" w:space="0" w:color="auto"/>
+          <w:top w:val="single" w:color="auto" w:sz="4" w:space="0"/>
+          <w:left w:val="single" w:color="auto" w:sz="4" w:space="0"/>
+          <w:bottom w:val="single" w:color="auto" w:sz="4" w:space="0"/>
+          <w:right w:val="single" w:color="auto" w:sz="4" w:space="0"/>
+          <w:insideH w:val="single" w:color="auto" w:sz="4" w:space="0"/>
+          <w:insideV w:val="single" w:color="auto" w:sz="4" w:space="0"/>
         </w:tblBorders>
+        <w:tblLayout w:type="autofit"/>
         <w:tblCellMar>
+          <w:top w:w="0" w:type="dxa"/>
           <w:left w:w="10" w:type="dxa"/>
+          <w:bottom w:w="0" w:type="dxa"/>
           <w:right w:w="10" w:type="dxa"/>
         </w:tblCellMar>
-        <w:tblLook w:val="04A0" w:firstRow="1" w:lastRow="0" w:firstColumn="1" w:lastColumn="0" w:noHBand="0" w:noVBand="1"/>
       </w:tblPr>
       <w:tblGrid>
-        <w:gridCol w:w="887"/>
-        <w:gridCol w:w="2113"/>
-        <w:gridCol w:w="1310"/>
+        <w:gridCol w:w="926"/>
+        <w:gridCol w:w="2221"/>
+        <w:gridCol w:w="1373"/>
       </w:tblGrid>
       <w:tr>
         <w:tblPrEx>
+          <w:tblBorders>
+            <w:top w:val="single" w:color="auto" w:sz="4" w:space="0"/>
+            <w:left w:val="single" w:color="auto" w:sz="4" w:space="0"/>
+            <w:bottom w:val="single" w:color="auto" w:sz="4" w:space="0"/>
+            <w:right w:val="single" w:color="auto" w:sz="4" w:space="0"/>
+            <w:insideH w:val="single" w:color="auto" w:sz="4" w:space="0"/>
+            <w:insideV w:val="single" w:color="auto" w:sz="4" w:space="0"/>
+          </w:tblBorders>
           <w:tblCellMar>
             <w:top w:w="0" w:type="dxa"/>
+            <w:left w:w="10" w:type="dxa"/>
             <w:bottom w:w="0" w:type="dxa"/>
+            <w:right w:w="10" w:type="dxa"/>
           </w:tblCellMar>
         </w:tblPrEx>
         <w:trPr>
@@ -2652,10 +2717,10 @@
           <w:tcPr>
             <w:tcW w:w="1068" w:type="pct"/>
             <w:tcBorders>
-              <w:top w:val="single" w:sz="4" w:space="0" w:color="000000"/>
-              <w:left w:val="single" w:sz="4" w:space="0" w:color="000000"/>
-              <w:bottom w:val="single" w:sz="4" w:space="0" w:color="000000"/>
-              <w:right w:val="single" w:sz="4" w:space="0" w:color="000000"/>
+              <w:top w:val="single" w:color="000000" w:sz="4" w:space="0"/>
+              <w:left w:val="single" w:color="000000" w:sz="4" w:space="0"/>
+              <w:bottom w:val="single" w:color="000000" w:sz="4" w:space="0"/>
+              <w:right w:val="single" w:color="000000" w:sz="4" w:space="0"/>
             </w:tcBorders>
             <w:shd w:val="clear" w:color="auto" w:fill="D0D0D0"/>
             <w:tcMar>
@@ -2681,10 +2746,10 @@
           <w:tcPr>
             <w:tcW w:w="1496" w:type="pct"/>
             <w:tcBorders>
-              <w:top w:val="single" w:sz="4" w:space="0" w:color="000000"/>
-              <w:left w:val="single" w:sz="4" w:space="0" w:color="000000"/>
-              <w:bottom w:val="single" w:sz="4" w:space="0" w:color="000000"/>
-              <w:right w:val="single" w:sz="4" w:space="0" w:color="000000"/>
+              <w:top w:val="single" w:color="000000" w:sz="4" w:space="0"/>
+              <w:left w:val="single" w:color="000000" w:sz="4" w:space="0"/>
+              <w:bottom w:val="single" w:color="000000" w:sz="4" w:space="0"/>
+              <w:right w:val="single" w:color="000000" w:sz="4" w:space="0"/>
             </w:tcBorders>
             <w:shd w:val="clear" w:color="auto" w:fill="D0D0D0"/>
             <w:tcMar>
@@ -2710,10 +2775,10 @@
           <w:tcPr>
             <w:tcW w:w="2436" w:type="pct"/>
             <w:tcBorders>
-              <w:top w:val="single" w:sz="4" w:space="0" w:color="000000"/>
-              <w:left w:val="single" w:sz="4" w:space="0" w:color="000000"/>
-              <w:bottom w:val="single" w:sz="4" w:space="0" w:color="000000"/>
-              <w:right w:val="single" w:sz="4" w:space="0" w:color="000000"/>
+              <w:top w:val="single" w:color="000000" w:sz="4" w:space="0"/>
+              <w:left w:val="single" w:color="000000" w:sz="4" w:space="0"/>
+              <w:bottom w:val="single" w:color="000000" w:sz="4" w:space="0"/>
+              <w:right w:val="single" w:color="000000" w:sz="4" w:space="0"/>
             </w:tcBorders>
             <w:shd w:val="clear" w:color="auto" w:fill="D0D0D0"/>
             <w:tcMar>
@@ -2738,19 +2803,29 @@
       </w:tr>
       <w:tr>
         <w:tblPrEx>
+          <w:tblBorders>
+            <w:top w:val="single" w:color="auto" w:sz="4" w:space="0"/>
+            <w:left w:val="single" w:color="auto" w:sz="4" w:space="0"/>
+            <w:bottom w:val="single" w:color="auto" w:sz="4" w:space="0"/>
+            <w:right w:val="single" w:color="auto" w:sz="4" w:space="0"/>
+            <w:insideH w:val="single" w:color="auto" w:sz="4" w:space="0"/>
+            <w:insideV w:val="single" w:color="auto" w:sz="4" w:space="0"/>
+          </w:tblBorders>
           <w:tblCellMar>
             <w:top w:w="0" w:type="dxa"/>
+            <w:left w:w="10" w:type="dxa"/>
             <w:bottom w:w="0" w:type="dxa"/>
+            <w:right w:w="10" w:type="dxa"/>
           </w:tblCellMar>
         </w:tblPrEx>
         <w:tc>
           <w:tcPr>
             <w:tcW w:w="1068" w:type="pct"/>
             <w:tcBorders>
-              <w:top w:val="single" w:sz="4" w:space="0" w:color="000000"/>
-              <w:left w:val="single" w:sz="4" w:space="0" w:color="000000"/>
-              <w:bottom w:val="single" w:sz="4" w:space="0" w:color="000000"/>
-              <w:right w:val="single" w:sz="4" w:space="0" w:color="000000"/>
+              <w:top w:val="single" w:color="000000" w:sz="4" w:space="0"/>
+              <w:left w:val="single" w:color="000000" w:sz="4" w:space="0"/>
+              <w:bottom w:val="single" w:color="000000" w:sz="4" w:space="0"/>
+              <w:right w:val="single" w:color="000000" w:sz="4" w:space="0"/>
             </w:tcBorders>
             <w:shd w:val="clear" w:color="auto" w:fill="FFFFFF"/>
             <w:tcMar>
@@ -2774,33 +2849,26 @@
           <w:tcPr>
             <w:tcW w:w="1496" w:type="pct"/>
             <w:tcBorders>
-              <w:top w:val="single" w:sz="4" w:space="0" w:color="000000"/>
-              <w:left w:val="single" w:sz="4" w:space="0" w:color="000000"/>
-              <w:bottom w:val="single" w:sz="4" w:space="0" w:color="000000"/>
-              <w:right w:val="single" w:sz="4" w:space="0" w:color="000000"/>
-            </w:tcBorders>
-            <w:shd w:val="clear" w:color="auto" w:fill="FFFFFF"/>
-            <w:tcMar>
-              <w:top w:w="60" w:type="dxa"/>
-              <w:left w:w="100" w:type="dxa"/>
-              <w:bottom w:w="60" w:type="dxa"/>
-              <w:right w:w="100" w:type="dxa"/>
-            </w:tcMar>
-          </w:tcPr>
-          <w:p>
-            <w:r>
-              <w:rPr>
-                <w:sz w:val="18"/>
-                <w:szCs w:val="18"/>
-              </w:rPr>
-              <w:t>C++</w:t>
-            </w:r>
-            <w:r>
-              <w:rPr>
-                <w:sz w:val="18"/>
-                <w:szCs w:val="18"/>
-              </w:rPr>
-              <w:t>.lang.Thread, Lambda</w:t>
+              <w:top w:val="single" w:color="000000" w:sz="4" w:space="0"/>
+              <w:left w:val="single" w:color="000000" w:sz="4" w:space="0"/>
+              <w:bottom w:val="single" w:color="000000" w:sz="4" w:space="0"/>
+              <w:right w:val="single" w:color="000000" w:sz="4" w:space="0"/>
+            </w:tcBorders>
+            <w:shd w:val="clear" w:color="auto" w:fill="FFFFFF"/>
+            <w:tcMar>
+              <w:top w:w="60" w:type="dxa"/>
+              <w:left w:w="100" w:type="dxa"/>
+              <w:bottom w:w="60" w:type="dxa"/>
+              <w:right w:w="100" w:type="dxa"/>
+            </w:tcMar>
+          </w:tcPr>
+          <w:p>
+            <w:r>
+              <w:rPr>
+                <w:sz w:val="18"/>
+                <w:szCs w:val="18"/>
+              </w:rPr>
+              <w:t>C++.lang.Thread, Lambda</w:t>
             </w:r>
           </w:p>
         </w:tc>
@@ -2808,10 +2876,10 @@
           <w:tcPr>
             <w:tcW w:w="2436" w:type="pct"/>
             <w:tcBorders>
-              <w:top w:val="single" w:sz="4" w:space="0" w:color="000000"/>
-              <w:left w:val="single" w:sz="4" w:space="0" w:color="000000"/>
-              <w:bottom w:val="single" w:sz="4" w:space="0" w:color="000000"/>
-              <w:right w:val="single" w:sz="4" w:space="0" w:color="000000"/>
+              <w:top w:val="single" w:color="000000" w:sz="4" w:space="0"/>
+              <w:left w:val="single" w:color="000000" w:sz="4" w:space="0"/>
+              <w:bottom w:val="single" w:color="000000" w:sz="4" w:space="0"/>
+              <w:right w:val="single" w:color="000000" w:sz="4" w:space="0"/>
             </w:tcBorders>
             <w:shd w:val="clear" w:color="auto" w:fill="FFFFFF"/>
             <w:tcMar>
@@ -2834,19 +2902,29 @@
       </w:tr>
       <w:tr>
         <w:tblPrEx>
+          <w:tblBorders>
+            <w:top w:val="single" w:color="auto" w:sz="4" w:space="0"/>
+            <w:left w:val="single" w:color="auto" w:sz="4" w:space="0"/>
+            <w:bottom w:val="single" w:color="auto" w:sz="4" w:space="0"/>
+            <w:right w:val="single" w:color="auto" w:sz="4" w:space="0"/>
+            <w:insideH w:val="single" w:color="auto" w:sz="4" w:space="0"/>
+            <w:insideV w:val="single" w:color="auto" w:sz="4" w:space="0"/>
+          </w:tblBorders>
           <w:tblCellMar>
             <w:top w:w="0" w:type="dxa"/>
+            <w:left w:w="10" w:type="dxa"/>
             <w:bottom w:w="0" w:type="dxa"/>
+            <w:right w:w="10" w:type="dxa"/>
           </w:tblCellMar>
         </w:tblPrEx>
         <w:tc>
           <w:tcPr>
             <w:tcW w:w="1068" w:type="pct"/>
             <w:tcBorders>
-              <w:top w:val="single" w:sz="4" w:space="0" w:color="000000"/>
-              <w:left w:val="single" w:sz="4" w:space="0" w:color="000000"/>
-              <w:bottom w:val="single" w:sz="4" w:space="0" w:color="000000"/>
-              <w:right w:val="single" w:sz="4" w:space="0" w:color="000000"/>
+              <w:top w:val="single" w:color="000000" w:sz="4" w:space="0"/>
+              <w:left w:val="single" w:color="000000" w:sz="4" w:space="0"/>
+              <w:bottom w:val="single" w:color="000000" w:sz="4" w:space="0"/>
+              <w:right w:val="single" w:color="000000" w:sz="4" w:space="0"/>
             </w:tcBorders>
             <w:shd w:val="clear" w:color="auto" w:fill="FFFFFF"/>
             <w:tcMar>
@@ -2870,33 +2948,26 @@
           <w:tcPr>
             <w:tcW w:w="1496" w:type="pct"/>
             <w:tcBorders>
-              <w:top w:val="single" w:sz="4" w:space="0" w:color="000000"/>
-              <w:left w:val="single" w:sz="4" w:space="0" w:color="000000"/>
-              <w:bottom w:val="single" w:sz="4" w:space="0" w:color="000000"/>
-              <w:right w:val="single" w:sz="4" w:space="0" w:color="000000"/>
-            </w:tcBorders>
-            <w:shd w:val="clear" w:color="auto" w:fill="FFFFFF"/>
-            <w:tcMar>
-              <w:top w:w="60" w:type="dxa"/>
-              <w:left w:w="100" w:type="dxa"/>
-              <w:bottom w:w="60" w:type="dxa"/>
-              <w:right w:w="100" w:type="dxa"/>
-            </w:tcMar>
-          </w:tcPr>
-          <w:p>
-            <w:r>
-              <w:rPr>
-                <w:sz w:val="18"/>
-                <w:szCs w:val="18"/>
-              </w:rPr>
-              <w:t>DeviceFailure</w:t>
-            </w:r>
-            <w:r>
-              <w:rPr>
-                <w:sz w:val="18"/>
-                <w:szCs w:val="18"/>
-              </w:rPr>
-              <w:t>Std::exception</w:t>
+              <w:top w:val="single" w:color="000000" w:sz="4" w:space="0"/>
+              <w:left w:val="single" w:color="000000" w:sz="4" w:space="0"/>
+              <w:bottom w:val="single" w:color="000000" w:sz="4" w:space="0"/>
+              <w:right w:val="single" w:color="000000" w:sz="4" w:space="0"/>
+            </w:tcBorders>
+            <w:shd w:val="clear" w:color="auto" w:fill="FFFFFF"/>
+            <w:tcMar>
+              <w:top w:w="60" w:type="dxa"/>
+              <w:left w:w="100" w:type="dxa"/>
+              <w:bottom w:w="60" w:type="dxa"/>
+              <w:right w:w="100" w:type="dxa"/>
+            </w:tcMar>
+          </w:tcPr>
+          <w:p>
+            <w:r>
+              <w:rPr>
+                <w:sz w:val="18"/>
+                <w:szCs w:val="18"/>
+              </w:rPr>
+              <w:t>DeviceFailureStd::exception</w:t>
             </w:r>
           </w:p>
         </w:tc>
@@ -2904,10 +2975,10 @@
           <w:tcPr>
             <w:tcW w:w="2436" w:type="pct"/>
             <w:tcBorders>
-              <w:top w:val="single" w:sz="4" w:space="0" w:color="000000"/>
-              <w:left w:val="single" w:sz="4" w:space="0" w:color="000000"/>
-              <w:bottom w:val="single" w:sz="4" w:space="0" w:color="000000"/>
-              <w:right w:val="single" w:sz="4" w:space="0" w:color="000000"/>
+              <w:top w:val="single" w:color="000000" w:sz="4" w:space="0"/>
+              <w:left w:val="single" w:color="000000" w:sz="4" w:space="0"/>
+              <w:bottom w:val="single" w:color="000000" w:sz="4" w:space="0"/>
+              <w:right w:val="single" w:color="000000" w:sz="4" w:space="0"/>
             </w:tcBorders>
             <w:shd w:val="clear" w:color="auto" w:fill="FFFFFF"/>
             <w:tcMar>
@@ -2930,19 +3001,29 @@
       </w:tr>
       <w:tr>
         <w:tblPrEx>
+          <w:tblBorders>
+            <w:top w:val="single" w:color="auto" w:sz="4" w:space="0"/>
+            <w:left w:val="single" w:color="auto" w:sz="4" w:space="0"/>
+            <w:bottom w:val="single" w:color="auto" w:sz="4" w:space="0"/>
+            <w:right w:val="single" w:color="auto" w:sz="4" w:space="0"/>
+            <w:insideH w:val="single" w:color="auto" w:sz="4" w:space="0"/>
+            <w:insideV w:val="single" w:color="auto" w:sz="4" w:space="0"/>
+          </w:tblBorders>
           <w:tblCellMar>
             <w:top w:w="0" w:type="dxa"/>
+            <w:left w:w="10" w:type="dxa"/>
             <w:bottom w:w="0" w:type="dxa"/>
+            <w:right w:w="10" w:type="dxa"/>
           </w:tblCellMar>
         </w:tblPrEx>
         <w:tc>
           <w:tcPr>
             <w:tcW w:w="1068" w:type="pct"/>
             <w:tcBorders>
-              <w:top w:val="single" w:sz="4" w:space="0" w:color="000000"/>
-              <w:left w:val="single" w:sz="4" w:space="0" w:color="000000"/>
-              <w:bottom w:val="single" w:sz="4" w:space="0" w:color="000000"/>
-              <w:right w:val="single" w:sz="4" w:space="0" w:color="000000"/>
+              <w:top w:val="single" w:color="000000" w:sz="4" w:space="0"/>
+              <w:left w:val="single" w:color="000000" w:sz="4" w:space="0"/>
+              <w:bottom w:val="single" w:color="000000" w:sz="4" w:space="0"/>
+              <w:right w:val="single" w:color="000000" w:sz="4" w:space="0"/>
             </w:tcBorders>
             <w:shd w:val="clear" w:color="auto" w:fill="FFFFFF"/>
             <w:tcMar>
@@ -2966,54 +3047,26 @@
           <w:tcPr>
             <w:tcW w:w="1496" w:type="pct"/>
             <w:tcBorders>
-              <w:top w:val="single" w:sz="4" w:space="0" w:color="000000"/>
-              <w:left w:val="single" w:sz="4" w:space="0" w:color="000000"/>
-              <w:bottom w:val="single" w:sz="4" w:space="0" w:color="000000"/>
-              <w:right w:val="single" w:sz="4" w:space="0" w:color="000000"/>
-            </w:tcBorders>
-            <w:shd w:val="clear" w:color="auto" w:fill="FFFFFF"/>
-            <w:tcMar>
-              <w:top w:w="60" w:type="dxa"/>
-              <w:left w:w="100" w:type="dxa"/>
-              <w:bottom w:w="60" w:type="dxa"/>
-              <w:right w:w="100" w:type="dxa"/>
-            </w:tcMar>
-          </w:tcPr>
-          <w:p>
-            <w:r>
-              <w:rPr>
-                <w:sz w:val="18"/>
-                <w:szCs w:val="18"/>
-              </w:rPr>
-              <w:t>Std::ofstream</w:t>
-            </w:r>
-            <w:r>
-              <w:rPr>
-                <w:sz w:val="18"/>
-                <w:szCs w:val="18"/>
-              </w:rPr>
-              <w:t xml:space="preserve">, </w:t>
-            </w:r>
-            <w:r>
-              <w:rPr>
-                <w:sz w:val="18"/>
-                <w:szCs w:val="18"/>
-              </w:rPr>
-              <w:t>Std::ofstream</w:t>
-            </w:r>
-            <w:r>
-              <w:rPr>
-                <w:sz w:val="18"/>
-                <w:szCs w:val="18"/>
-              </w:rPr>
-              <w:t xml:space="preserve">, </w:t>
-            </w:r>
-            <w:r>
-              <w:rPr>
-                <w:sz w:val="18"/>
-                <w:szCs w:val="18"/>
-              </w:rPr>
-              <w:t>RAII / lock_guard</w:t>
+              <w:top w:val="single" w:color="000000" w:sz="4" w:space="0"/>
+              <w:left w:val="single" w:color="000000" w:sz="4" w:space="0"/>
+              <w:bottom w:val="single" w:color="000000" w:sz="4" w:space="0"/>
+              <w:right w:val="single" w:color="000000" w:sz="4" w:space="0"/>
+            </w:tcBorders>
+            <w:shd w:val="clear" w:color="auto" w:fill="FFFFFF"/>
+            <w:tcMar>
+              <w:top w:w="60" w:type="dxa"/>
+              <w:left w:w="100" w:type="dxa"/>
+              <w:bottom w:w="60" w:type="dxa"/>
+              <w:right w:w="100" w:type="dxa"/>
+            </w:tcMar>
+          </w:tcPr>
+          <w:p>
+            <w:r>
+              <w:rPr>
+                <w:sz w:val="18"/>
+                <w:szCs w:val="18"/>
+              </w:rPr>
+              <w:t>Std::ofstream, Std::ofstream, RAII / lock_guard</w:t>
             </w:r>
           </w:p>
         </w:tc>
@@ -3021,10 +3074,10 @@
           <w:tcPr>
             <w:tcW w:w="2436" w:type="pct"/>
             <w:tcBorders>
-              <w:top w:val="single" w:sz="4" w:space="0" w:color="000000"/>
-              <w:left w:val="single" w:sz="4" w:space="0" w:color="000000"/>
-              <w:bottom w:val="single" w:sz="4" w:space="0" w:color="000000"/>
-              <w:right w:val="single" w:sz="4" w:space="0" w:color="000000"/>
+              <w:top w:val="single" w:color="000000" w:sz="4" w:space="0"/>
+              <w:left w:val="single" w:color="000000" w:sz="4" w:space="0"/>
+              <w:bottom w:val="single" w:color="000000" w:sz="4" w:space="0"/>
+              <w:right w:val="single" w:color="000000" w:sz="4" w:space="0"/>
             </w:tcBorders>
             <w:shd w:val="clear" w:color="auto" w:fill="FFFFFF"/>
             <w:tcMar>
@@ -3047,19 +3100,29 @@
       </w:tr>
       <w:tr>
         <w:tblPrEx>
+          <w:tblBorders>
+            <w:top w:val="single" w:color="auto" w:sz="4" w:space="0"/>
+            <w:left w:val="single" w:color="auto" w:sz="4" w:space="0"/>
+            <w:bottom w:val="single" w:color="auto" w:sz="4" w:space="0"/>
+            <w:right w:val="single" w:color="auto" w:sz="4" w:space="0"/>
+            <w:insideH w:val="single" w:color="auto" w:sz="4" w:space="0"/>
+            <w:insideV w:val="single" w:color="auto" w:sz="4" w:space="0"/>
+          </w:tblBorders>
           <w:tblCellMar>
             <w:top w:w="0" w:type="dxa"/>
+            <w:left w:w="10" w:type="dxa"/>
             <w:bottom w:w="0" w:type="dxa"/>
+            <w:right w:w="10" w:type="dxa"/>
           </w:tblCellMar>
         </w:tblPrEx>
         <w:tc>
           <w:tcPr>
             <w:tcW w:w="1068" w:type="pct"/>
             <w:tcBorders>
-              <w:top w:val="single" w:sz="4" w:space="0" w:color="000000"/>
-              <w:left w:val="single" w:sz="4" w:space="0" w:color="000000"/>
-              <w:bottom w:val="single" w:sz="4" w:space="0" w:color="000000"/>
-              <w:right w:val="single" w:sz="4" w:space="0" w:color="000000"/>
+              <w:top w:val="single" w:color="000000" w:sz="4" w:space="0"/>
+              <w:left w:val="single" w:color="000000" w:sz="4" w:space="0"/>
+              <w:bottom w:val="single" w:color="000000" w:sz="4" w:space="0"/>
+              <w:right w:val="single" w:color="000000" w:sz="4" w:space="0"/>
             </w:tcBorders>
             <w:shd w:val="clear" w:color="auto" w:fill="FFFFFF"/>
             <w:tcMar>
@@ -3083,10 +3146,10 @@
           <w:tcPr>
             <w:tcW w:w="1496" w:type="pct"/>
             <w:tcBorders>
-              <w:top w:val="single" w:sz="4" w:space="0" w:color="000000"/>
-              <w:left w:val="single" w:sz="4" w:space="0" w:color="000000"/>
-              <w:bottom w:val="single" w:sz="4" w:space="0" w:color="000000"/>
-              <w:right w:val="single" w:sz="4" w:space="0" w:color="000000"/>
+              <w:top w:val="single" w:color="000000" w:sz="4" w:space="0"/>
+              <w:left w:val="single" w:color="000000" w:sz="4" w:space="0"/>
+              <w:bottom w:val="single" w:color="000000" w:sz="4" w:space="0"/>
+              <w:right w:val="single" w:color="000000" w:sz="4" w:space="0"/>
             </w:tcBorders>
             <w:shd w:val="clear" w:color="auto" w:fill="FFFFFF"/>
             <w:tcMar>
@@ -3110,10 +3173,10 @@
           <w:tcPr>
             <w:tcW w:w="2436" w:type="pct"/>
             <w:tcBorders>
-              <w:top w:val="single" w:sz="4" w:space="0" w:color="000000"/>
-              <w:left w:val="single" w:sz="4" w:space="0" w:color="000000"/>
-              <w:bottom w:val="single" w:sz="4" w:space="0" w:color="000000"/>
-              <w:right w:val="single" w:sz="4" w:space="0" w:color="000000"/>
+              <w:top w:val="single" w:color="000000" w:sz="4" w:space="0"/>
+              <w:left w:val="single" w:color="000000" w:sz="4" w:space="0"/>
+              <w:bottom w:val="single" w:color="000000" w:sz="4" w:space="0"/>
+              <w:right w:val="single" w:color="000000" w:sz="4" w:space="0"/>
             </w:tcBorders>
             <w:shd w:val="clear" w:color="auto" w:fill="FFFFFF"/>
             <w:tcMar>
@@ -3136,19 +3199,29 @@
       </w:tr>
       <w:tr>
         <w:tblPrEx>
+          <w:tblBorders>
+            <w:top w:val="single" w:color="auto" w:sz="4" w:space="0"/>
+            <w:left w:val="single" w:color="auto" w:sz="4" w:space="0"/>
+            <w:bottom w:val="single" w:color="auto" w:sz="4" w:space="0"/>
+            <w:right w:val="single" w:color="auto" w:sz="4" w:space="0"/>
+            <w:insideH w:val="single" w:color="auto" w:sz="4" w:space="0"/>
+            <w:insideV w:val="single" w:color="auto" w:sz="4" w:space="0"/>
+          </w:tblBorders>
           <w:tblCellMar>
             <w:top w:w="0" w:type="dxa"/>
+            <w:left w:w="10" w:type="dxa"/>
             <w:bottom w:w="0" w:type="dxa"/>
+            <w:right w:w="10" w:type="dxa"/>
           </w:tblCellMar>
         </w:tblPrEx>
         <w:tc>
           <w:tcPr>
             <w:tcW w:w="1068" w:type="pct"/>
             <w:tcBorders>
-              <w:top w:val="single" w:sz="4" w:space="0" w:color="000000"/>
-              <w:left w:val="single" w:sz="4" w:space="0" w:color="000000"/>
-              <w:bottom w:val="single" w:sz="4" w:space="0" w:color="000000"/>
-              <w:right w:val="single" w:sz="4" w:space="0" w:color="000000"/>
+              <w:top w:val="single" w:color="000000" w:sz="4" w:space="0"/>
+              <w:left w:val="single" w:color="000000" w:sz="4" w:space="0"/>
+              <w:bottom w:val="single" w:color="000000" w:sz="4" w:space="0"/>
+              <w:right w:val="single" w:color="000000" w:sz="4" w:space="0"/>
             </w:tcBorders>
             <w:shd w:val="clear" w:color="auto" w:fill="FFFFFF"/>
             <w:tcMar>
@@ -3172,33 +3245,26 @@
           <w:tcPr>
             <w:tcW w:w="1496" w:type="pct"/>
             <w:tcBorders>
-              <w:top w:val="single" w:sz="4" w:space="0" w:color="000000"/>
-              <w:left w:val="single" w:sz="4" w:space="0" w:color="000000"/>
-              <w:bottom w:val="single" w:sz="4" w:space="0" w:color="000000"/>
-              <w:right w:val="single" w:sz="4" w:space="0" w:color="000000"/>
-            </w:tcBorders>
-            <w:shd w:val="clear" w:color="auto" w:fill="FFFFFF"/>
-            <w:tcMar>
-              <w:top w:w="60" w:type="dxa"/>
-              <w:left w:w="100" w:type="dxa"/>
-              <w:bottom w:w="60" w:type="dxa"/>
-              <w:right w:w="100" w:type="dxa"/>
-            </w:tcMar>
-          </w:tcPr>
-          <w:p>
-            <w:r>
-              <w:rPr>
-                <w:sz w:val="18"/>
-                <w:szCs w:val="18"/>
-              </w:rPr>
-              <w:t>Std::thread</w:t>
-            </w:r>
-            <w:r>
-              <w:rPr>
-                <w:sz w:val="18"/>
-                <w:szCs w:val="18"/>
-              </w:rPr>
-              <w:t xml:space="preserve"> (Thread)</w:t>
+              <w:top w:val="single" w:color="000000" w:sz="4" w:space="0"/>
+              <w:left w:val="single" w:color="000000" w:sz="4" w:space="0"/>
+              <w:bottom w:val="single" w:color="000000" w:sz="4" w:space="0"/>
+              <w:right w:val="single" w:color="000000" w:sz="4" w:space="0"/>
+            </w:tcBorders>
+            <w:shd w:val="clear" w:color="auto" w:fill="FFFFFF"/>
+            <w:tcMar>
+              <w:top w:w="60" w:type="dxa"/>
+              <w:left w:w="100" w:type="dxa"/>
+              <w:bottom w:w="60" w:type="dxa"/>
+              <w:right w:w="100" w:type="dxa"/>
+            </w:tcMar>
+          </w:tcPr>
+          <w:p>
+            <w:r>
+              <w:rPr>
+                <w:sz w:val="18"/>
+                <w:szCs w:val="18"/>
+              </w:rPr>
+              <w:t>Std::thread (Thread)</w:t>
             </w:r>
           </w:p>
         </w:tc>
@@ -3206,34 +3272,26 @@
           <w:tcPr>
             <w:tcW w:w="2436" w:type="pct"/>
             <w:tcBorders>
-              <w:top w:val="single" w:sz="4" w:space="0" w:color="000000"/>
-              <w:left w:val="single" w:sz="4" w:space="0" w:color="000000"/>
-              <w:bottom w:val="single" w:sz="4" w:space="0" w:color="000000"/>
-              <w:right w:val="single" w:sz="4" w:space="0" w:color="000000"/>
-            </w:tcBorders>
-            <w:shd w:val="clear" w:color="auto" w:fill="FFFFFF"/>
-            <w:tcMar>
-              <w:top w:w="60" w:type="dxa"/>
-              <w:left w:w="100" w:type="dxa"/>
-              <w:bottom w:w="60" w:type="dxa"/>
-              <w:right w:w="100" w:type="dxa"/>
-            </w:tcMar>
-          </w:tcPr>
-          <w:p>
-            <w:r>
-              <w:rPr>
-                <w:sz w:val="18"/>
-                <w:szCs w:val="18"/>
-              </w:rPr>
-              <w:t xml:space="preserve">Anonim sınıf yerine lambda ile kısa ve </w:t>
-            </w:r>
-            <w:r>
-              <w:rPr>
-                <w:sz w:val="18"/>
-                <w:szCs w:val="18"/>
-              </w:rPr>
-              <w:lastRenderedPageBreak/>
-              <w:t>okunabilir thread tanımları.</w:t>
+              <w:top w:val="single" w:color="000000" w:sz="4" w:space="0"/>
+              <w:left w:val="single" w:color="000000" w:sz="4" w:space="0"/>
+              <w:bottom w:val="single" w:color="000000" w:sz="4" w:space="0"/>
+              <w:right w:val="single" w:color="000000" w:sz="4" w:space="0"/>
+            </w:tcBorders>
+            <w:shd w:val="clear" w:color="auto" w:fill="FFFFFF"/>
+            <w:tcMar>
+              <w:top w:w="60" w:type="dxa"/>
+              <w:left w:w="100" w:type="dxa"/>
+              <w:bottom w:w="60" w:type="dxa"/>
+              <w:right w:w="100" w:type="dxa"/>
+            </w:tcMar>
+          </w:tcPr>
+          <w:p>
+            <w:r>
+              <w:rPr>
+                <w:sz w:val="18"/>
+                <w:szCs w:val="18"/>
+              </w:rPr>
+              <w:t>Anonim sınıf yerine lambda ile kısa ve okunabilir thread tanımları.</w:t>
             </w:r>
           </w:p>
         </w:tc>
@@ -3289,22 +3347,7 @@
         <w:jc w:val="both"/>
       </w:pPr>
       <w:r>
-        <w:t>DeviceFailureException</w:t>
-      </w:r>
-      <w:r>
-        <w:t xml:space="preserve">, </w:t>
-      </w:r>
-      <w:r>
-        <w:t>C++</w:t>
-      </w:r>
-      <w:r>
-        <w:t xml:space="preserve">'nın standart Exception sınıfından türetilmiş bir Checked Exception olarak tasarlanmıştır. Cihazlar performSelfDiagnostic() metodu içinde </w:t>
-      </w:r>
-      <w:r>
-        <w:t>&lt;iostream&gt;</w:t>
-      </w:r>
-      <w:r>
-        <w:t>.Random ile %5 olasılıkla bu istisnayı fırlatmaktadır. Thread içindeki try-catch bloğu istisnayı yakalayarak cihazın durumunu FAULTY olarak işaretler ve sistemin çökmeksizin çalışmaya devam etmesini sağlar.</w:t>
+        <w:t>DeviceFailureException, C++'nın standart Exception sınıfından türetilmiş bir Checked Exception olarak tasarlanmıştır. Cihazlar performSelfDiagnostic() metodu içinde &lt;iostream&gt;.Random ile %5 olasılıkla bu istisnayı fırlatmaktadır. Thread içindeki try-catch bloğu istisnayı yakalayarak cihazın durumunu FAULTY olarak işaretler ve sistemin çökmeksizin çalışmaya devam etmesini sağlar.</w:t>
       </w:r>
     </w:p>
     <w:p>
@@ -3328,25 +3371,7 @@
         <w:jc w:val="both"/>
       </w:pPr>
       <w:r>
-        <w:t xml:space="preserve">LogManager sınıfı, </w:t>
-      </w:r>
-      <w:r>
-        <w:t>Std::ofstream</w:t>
-      </w:r>
-      <w:r>
-        <w:t xml:space="preserve"> ve </w:t>
-      </w:r>
-      <w:r>
-        <w:t>Std::ofstream</w:t>
-      </w:r>
-      <w:r>
-        <w:t xml:space="preserve"> API'lerini </w:t>
-      </w:r>
-      <w:r>
-        <w:t>RAII / lock_guard</w:t>
-      </w:r>
-      <w:r>
-        <w:t xml:space="preserve"> yapısıyla birlikte kullanarak tüm güvenlik olaylarını security_logs.txt dosyasına kalıcı olarak kaydeder. Append modunda çalışan dosya, uygulama yeniden başlatıldığında önceki kayıtları korumaktadır. Her olay için eventId, severity, deviceId, açıklama ve LocalDateTime damgası kayıt altına alınmaktadır.</w:t>
+        <w:t>LogManager sınıfı, Std::ofstream ve Std::ofstream API'lerini RAII / lock_guard yapısıyla birlikte kullanarak tüm güvenlik olaylarını security_logs.txt dosyasına kalıcı olarak kaydeder. Append modunda çalışan dosya, uygulama yeniden başlatıldığında önceki kayıtları korumaktadır. Her olay için eventId, severity, deviceId, açıklama ve LocalDateTime damgası kayıt altına alınmaktadır.</w:t>
       </w:r>
     </w:p>
     <w:p>
@@ -3361,25 +3386,7 @@
           <w:sz w:val="24"/>
           <w:szCs w:val="24"/>
         </w:rPr>
-        <w:t xml:space="preserve">V. KULLANILAN </w:t>
-      </w:r>
-      <w:r>
-        <w:rPr>
-          <w:b/>
-          <w:bCs/>
-          <w:sz w:val="24"/>
-          <w:szCs w:val="24"/>
-        </w:rPr>
-        <w:t>C++</w:t>
-      </w:r>
-      <w:r>
-        <w:rPr>
-          <w:b/>
-          <w:bCs/>
-          <w:sz w:val="24"/>
-          <w:szCs w:val="24"/>
-        </w:rPr>
-        <w:t xml:space="preserve"> API'LERİ</w:t>
+        <w:t>V. KULLANILAN C++ API'LERİ</w:t>
       </w:r>
     </w:p>
     <w:p>
@@ -3389,85 +3396,7 @@
         <w:jc w:val="both"/>
       </w:pPr>
       <w:r>
-        <w:t xml:space="preserve">Proje, </w:t>
-      </w:r>
-      <w:r>
-        <w:t>C++</w:t>
-      </w:r>
-      <w:r>
-        <w:t xml:space="preserve"> Standart Kütüphanesi'nin çeşitli paketlerinden yararlanmaktadır. Veri yapıları için </w:t>
-      </w:r>
-      <w:r>
-        <w:t>&lt;iostream&gt;</w:t>
-      </w:r>
-      <w:r>
-        <w:t>.</w:t>
-      </w:r>
-      <w:r>
-        <w:t>Std::vector</w:t>
-      </w:r>
-      <w:r>
-        <w:t xml:space="preserve"> ve </w:t>
-      </w:r>
-      <w:r>
-        <w:t>&lt;iostream&gt;</w:t>
-      </w:r>
-      <w:r>
-        <w:t xml:space="preserve">.List; rastlantısal tehdit simülasyonu için </w:t>
-      </w:r>
-      <w:r>
-        <w:t>&lt;iostream&gt;</w:t>
-      </w:r>
-      <w:r>
-        <w:t xml:space="preserve">.Random; zaman damgalama için </w:t>
-      </w:r>
-      <w:r>
-        <w:t>C++</w:t>
-      </w:r>
-      <w:r>
-        <w:t xml:space="preserve">.time.LocalDateTime ve </w:t>
-      </w:r>
-      <w:r>
-        <w:t>C++</w:t>
-      </w:r>
-      <w:r>
-        <w:t xml:space="preserve">.time.format.DateTimeFormatter; dosya yazımı için </w:t>
-      </w:r>
-      <w:r>
-        <w:t>C++</w:t>
-      </w:r>
-      <w:r>
-        <w:t>.io.</w:t>
-      </w:r>
-      <w:r>
-        <w:t>Std::ofstream</w:t>
-      </w:r>
-      <w:r>
-        <w:t xml:space="preserve">, </w:t>
-      </w:r>
-      <w:r>
-        <w:t>C++</w:t>
-      </w:r>
-      <w:r>
-        <w:t>.io.</w:t>
-      </w:r>
-      <w:r>
-        <w:t>Std::ofstream</w:t>
-      </w:r>
-      <w:r>
-        <w:t xml:space="preserve"> ve </w:t>
-      </w:r>
-      <w:r>
-        <w:t>C++</w:t>
-      </w:r>
-      <w:r>
-        <w:t xml:space="preserve">.io.IOException; eşzamanlı işleme için </w:t>
-      </w:r>
-      <w:r>
-        <w:t>C++</w:t>
-      </w:r>
-      <w:r>
-        <w:t>.lang.Thread kullanılmaktadır.</w:t>
+        <w:t>Proje, C++ Standart Kütüphanesi'nin çeşitli paketlerinden yararlanmaktadır. Veri yapıları için &lt;iostream&gt;.Std::vector ve &lt;iostream&gt;.List; rastlantısal tehdit simülasyonu için &lt;iostream&gt;.Random; zaman damgalama için C++.time.LocalDateTime ve C++.time.format.DateTimeFormatter; dosya yazımı için C++.io.Std::ofstream, C++.io.Std::ofstream ve C++.io.IOException; eşzamanlı işleme için C++.lang.Thread kullanılmaktadır.</w:t>
       </w:r>
     </w:p>
     <w:p>
@@ -3501,22 +3430,7 @@
         <w:jc w:val="both"/>
       </w:pPr>
       <w:r>
-        <w:t>src/iotguard/core/ → Monitorable</w:t>
-      </w:r>
-      <w:r>
-        <w:t>.cpp</w:t>
-      </w:r>
-      <w:r>
-        <w:t>, SecurityMonitor</w:t>
-      </w:r>
-      <w:r>
-        <w:t>.cpp</w:t>
-      </w:r>
-      <w:r>
-        <w:t>, LogManager</w:t>
-      </w:r>
-      <w:r>
-        <w:t>.cpp</w:t>
+        <w:t>src/iotguard/core/ → Monitorable.cpp, SecurityMonitor.cpp, LogManager.cpp</w:t>
       </w:r>
     </w:p>
     <w:p>
@@ -3525,28 +3439,7 @@
         <w:jc w:val="both"/>
       </w:pPr>
       <w:r>
-        <w:t>src/iotguard/devices/ → Device</w:t>
-      </w:r>
-      <w:r>
-        <w:t>.cpp</w:t>
-      </w:r>
-      <w:r>
-        <w:t>, Camera</w:t>
-      </w:r>
-      <w:r>
-        <w:t>.cpp</w:t>
-      </w:r>
-      <w:r>
-        <w:t>, Router</w:t>
-      </w:r>
-      <w:r>
-        <w:t>.cpp</w:t>
-      </w:r>
-      <w:r>
-        <w:t>, SmartLock</w:t>
-      </w:r>
-      <w:r>
-        <w:t>.cpp</w:t>
+        <w:t>src/iotguard/devices/ → Device.cpp, Camera.cpp, Router.cpp, SmartLock.cpp</w:t>
       </w:r>
     </w:p>
     <w:p>
@@ -3555,22 +3448,7 @@
         <w:jc w:val="both"/>
       </w:pPr>
       <w:r>
-        <w:t>src/iotguard/events/ → EventSeverity</w:t>
-      </w:r>
-      <w:r>
-        <w:t>.cpp</w:t>
-      </w:r>
-      <w:r>
-        <w:t>, SecurityEvent</w:t>
-      </w:r>
-      <w:r>
-        <w:t>.cpp</w:t>
-      </w:r>
-      <w:r>
-        <w:t xml:space="preserve">, </w:t>
-      </w:r>
-      <w:r>
-        <w:t>DeviceFailureException.cpp</w:t>
+        <w:t>src/iotguard/events/ → EventSeverity.cpp, SecurityEvent.cpp, DeviceFailureException.cpp</w:t>
       </w:r>
     </w:p>
     <w:p>
@@ -3579,10 +3457,7 @@
         <w:jc w:val="both"/>
       </w:pPr>
       <w:r>
-        <w:t>src/iotguard/ → Main</w:t>
-      </w:r>
-      <w:r>
-        <w:t>.cpp</w:t>
+        <w:t>src/iotguard/ → Main.cpp</w:t>
       </w:r>
     </w:p>
     <w:p>
@@ -3612,19 +3487,7 @@
         <w:jc w:val="both"/>
       </w:pPr>
       <w:r>
-        <w:t xml:space="preserve">IoTGuard projesi, </w:t>
-      </w:r>
-      <w:r>
-        <w:t>C++</w:t>
-      </w:r>
-      <w:r>
-        <w:t xml:space="preserve"> SE dilinin nesne yönelimli tasarım kapasitesini IoT güvenlik senaryolarına başarıyla uyguladığını ortaya koymaktadır. Beş temel OOP prensibinin yanı sıra çoklu iş parçacığı, özel istisna yönetimi ve kalıcı dosya kaydı gibi ileri düzey </w:t>
-      </w:r>
-      <w:r>
-        <w:t>C++</w:t>
-      </w:r>
-      <w:r>
-        <w:t xml:space="preserve"> bileşenleri entegre edilmiştir.</w:t>
+        <w:t>IoTGuard projesi, C++ SE dilinin nesne yönelimli tasarım kapasitesini IoT güvenlik senaryolarına başarıyla uyguladığını ortaya koymaktadır. Beş temel OOP prensibinin yanı sıra çoklu iş parçacığı, özel istisna yönetimi ve kalıcı dosya kaydı gibi ileri düzey C++ bileşenleri entegre edilmiştir.</w:t>
       </w:r>
     </w:p>
     <w:p>
@@ -3681,13 +3544,7 @@
         <w:jc w:val="both"/>
       </w:pPr>
       <w:r>
-        <w:t xml:space="preserve">[1] J. Bloch, Effective </w:t>
-      </w:r>
-      <w:r>
-        <w:t>C++</w:t>
-      </w:r>
-      <w:r>
-        <w:t>, 3rd ed. Addison-Wesley Professional, 2018.</w:t>
+        <w:t>[1] J. Bloch, Effective C++, 3rd ed. Addison-Wesley Professional, 2018.</w:t>
       </w:r>
     </w:p>
     <w:p>
@@ -3696,13 +3553,7 @@
         <w:jc w:val="both"/>
       </w:pPr>
       <w:r>
-        <w:t xml:space="preserve">[2] B. Eckel, Thinking in </w:t>
-      </w:r>
-      <w:r>
-        <w:t>C++</w:t>
-      </w:r>
-      <w:r>
-        <w:t>, 4th ed. Prentice Hall, 2006.</w:t>
+        <w:t>[2] B. Eckel, Thinking in C++, 4th ed. Prentice Hall, 2006.</w:t>
       </w:r>
     </w:p>
     <w:p>
@@ -3711,13 +3562,7 @@
         <w:jc w:val="both"/>
       </w:pPr>
       <w:r>
-        <w:t xml:space="preserve">[3] Oracle, </w:t>
-      </w:r>
-      <w:r>
-        <w:t>C++</w:t>
-      </w:r>
-      <w:r>
-        <w:t xml:space="preserve"> SE Documentation, 2024. [Çevrimiçi]. Mevcut: https://docs.oracle.com/javase/</w:t>
+        <w:t>[3] Oracle, C++ SE Documentation, 2024. [Çevrimiçi]. Mevcut: https://docs.oracle.com/javase/</w:t>
       </w:r>
     </w:p>
     <w:p>
@@ -3726,13 +3571,7 @@
         <w:jc w:val="both"/>
       </w:pPr>
       <w:r>
-        <w:t xml:space="preserve">[4] Oracle, </w:t>
-      </w:r>
-      <w:r>
-        <w:t>C++</w:t>
-      </w:r>
-      <w:r>
-        <w:t xml:space="preserve"> Concurrency Tutorial, 2024. [Çevrimiçi]. Mevcut: https://docs.oracle.com/javase/tutorial/essential/concurrency/</w:t>
+        <w:t>[4] Oracle, C++ Concurrency Tutorial, 2024. [Çevrimiçi]. Mevcut: https://docs.oracle.com/javase/tutorial/essential/concurrency/</w:t>
       </w:r>
     </w:p>
     <w:p>
@@ -3749,697 +3588,397 @@
         <w:spacing w:before="60" w:after="60"/>
         <w:jc w:val="both"/>
       </w:pPr>
-      <w:r>
-        <w:rPr>
-          <w:b/>
-        </w:rPr>
-        <w:t>SON GÃœNCELLEMELER (V2.0 C++ EDITION):</w:t>
-      </w:r>
-    </w:p>
-    <w:p>
-      <w:pPr>
-        <w:spacing w:before="60" w:after="60"/>
-        <w:jc w:val="both"/>
-      </w:pPr>
-      <w:r>
-        <w:t>- Proje yapÄ±sÄ± karmaÅŸÄ±klÄ±ÄŸÄ± Ã¶nlemek adÄ±na Tek-Dosya (main.cpp) mimarisine geÃ§irilmiÅŸtir.</w:t>
-      </w:r>
-    </w:p>
-    <w:p>
-      <w:pPr>
-        <w:spacing w:before="60" w:after="60"/>
-        <w:jc w:val="both"/>
-      </w:pPr>
-      <w:r>
-        <w:t>- ANSI renk kodlarÄ± ve film tarzÄ± efektler ile geliÅŸmiÅŸ interaktif TUI entegre edilmiÅŸtir.</w:t>
-      </w:r>
-    </w:p>
-    <w:p>
-      <w:pPr>
-        <w:spacing w:before="60" w:after="60"/>
-        <w:jc w:val="both"/>
-      </w:pPr>
-      <w:r>
-        <w:t>- YÃ¶netici (Admin) GiriÅŸ paneli eklenmiÅŸ ve ÅŸifre maskeleme (****) Ã¶zellikleri uygulanmÄ±ÅŸtÄ±r.</w:t>
-      </w:r>
-    </w:p>
-    <w:p>
-      <w:pPr>
-        <w:spacing w:before="60" w:after="60"/>
-        <w:jc w:val="both"/>
-      </w:pPr>
+      <w:bookmarkStart w:id="0" w:name="_GoBack"/>
+      <w:bookmarkEnd w:id="0"/>
     </w:p>
     <w:sectPr>
       <w:pgSz w:w="12240" w:h="15840"/>
       <w:pgMar w:top="1440" w:right="1440" w:bottom="1440" w:left="1440" w:header="708" w:footer="708" w:gutter="0"/>
-      <w:cols w:num="2" w:space="720"/>
-      <w:docGrid w:linePitch="360"/>
+      <w:cols w:space="720" w:num="2"/>
+      <w:docGrid w:linePitch="360" w:charSpace="0"/>
     </w:sectPr>
   </w:body>
 </w:document>
 </file>
 
-<file path=word/numbering.xml><?xml version="1.0" encoding="utf-8"?>
-<w:numbering xmlns:wpc="http://schemas.microsoft.com/office/word/2010/wordprocessingCanvas" xmlns:cx="http://schemas.microsoft.com/office/drawing/2014/chartex" xmlns:cx1="http://schemas.microsoft.com/office/drawing/2015/9/8/chartex" xmlns:cx2="http://schemas.microsoft.com/office/drawing/2015/10/21/chartex" xmlns:cx3="http://schemas.microsoft.com/office/drawing/2016/5/9/chartex" xmlns:cx4="http://schemas.microsoft.com/office/drawing/2016/5/10/chartex" xmlns:cx5="http://schemas.microsoft.com/office/drawing/2016/5/11/chartex" xmlns:cx6="http://schemas.microsoft.com/office/drawing/2016/5/12/chartex" xmlns:cx7="http://schemas.microsoft.com/office/drawing/2016/5/13/chartex" xmlns:cx8="http://schemas.microsoft.com/office/drawing/2016/5/14/chartex" xmlns:mc="http://schemas.openxmlformats.org/markup-compatibility/2006" xmlns:aink="http://schemas.microsoft.com/office/drawing/2016/ink" xmlns:am3d="http://schemas.microsoft.com/office/drawing/2017/model3d" xmlns:o="urn:schemas-microsoft-com:office:office" xmlns:oel="http://schemas.microsoft.com/office/2019/extlst" xmlns:r="http://schemas.openxmlformats.org/officeDocument/2006/relationships" xmlns:m="http://schemas.openxmlformats.org/officeDocument/2006/math" xmlns:v="urn:schemas-microsoft-com:vml" xmlns:wp14="http://schemas.microsoft.com/office/word/2010/wordprocessingDrawing" xmlns:wp="http://schemas.openxmlformats.org/drawingml/2006/wordprocessingDrawing" xmlns:w10="urn:schemas-microsoft-com:office:word" xmlns:w="http://schemas.openxmlformats.org/wordprocessingml/2006/main" xmlns:w14="http://schemas.microsoft.com/office/word/2010/wordml" xmlns:w15="http://schemas.microsoft.com/office/word/2012/wordml" xmlns:w16cex="http://schemas.microsoft.com/office/word/2018/wordml/cex" xmlns:w16cid="http://schemas.microsoft.com/office/word/2016/wordml/cid" xmlns:w16="http://schemas.microsoft.com/office/word/2018/wordml" xmlns:w16du="http://schemas.microsoft.com/office/word/2023/wordml/word16du" xmlns:w16sdtdh="http://schemas.microsoft.com/office/word/2020/wordml/sdtdatahash" xmlns:w16sdtfl="http://schemas.microsoft.com/office/word/2024/wordml/sdtformatlock" xmlns:w16se="http://schemas.microsoft.com/office/word/2015/wordml/symex" xmlns:wpg="http://schemas.microsoft.com/office/word/2010/wordprocessingGroup" xmlns:wpi="http://schemas.microsoft.com/office/word/2010/wordprocessingInk" xmlns:wne="http://schemas.microsoft.com/office/word/2006/wordml" xmlns:wps="http://schemas.microsoft.com/office/word/2010/wordprocessingShape" mc:Ignorable="w14 w15 w16se w16cid w16 w16cex w16sdtdh w16sdtfl w16du wp14">
-  <w:abstractNum w:abstractNumId="0" w15:restartNumberingAfterBreak="0">
-    <w:nsid w:val="5E6B7375"/>
-    <w:multiLevelType w:val="hybridMultilevel"/>
-    <w:tmpl w:val="4A32EA52"/>
-    <w:lvl w:ilvl="0" w:tplc="CD1AEFA0">
-      <w:start w:val="1"/>
-      <w:numFmt w:val="bullet"/>
-      <w:lvlText w:val="•"/>
-      <w:lvlJc w:val="left"/>
-      <w:pPr>
-        <w:ind w:left="720" w:hanging="360"/>
-      </w:pPr>
-    </w:lvl>
-    <w:lvl w:ilvl="1" w:tplc="65944E2C">
-      <w:numFmt w:val="decimal"/>
-      <w:lvlText w:val=""/>
-      <w:lvlJc w:val="left"/>
-    </w:lvl>
-    <w:lvl w:ilvl="2" w:tplc="4254270A">
-      <w:numFmt w:val="decimal"/>
-      <w:lvlText w:val=""/>
-      <w:lvlJc w:val="left"/>
-    </w:lvl>
-    <w:lvl w:ilvl="3" w:tplc="F336F1C4">
-      <w:numFmt w:val="decimal"/>
-      <w:lvlText w:val=""/>
-      <w:lvlJc w:val="left"/>
-    </w:lvl>
-    <w:lvl w:ilvl="4" w:tplc="8EEA0882">
-      <w:numFmt w:val="decimal"/>
-      <w:lvlText w:val=""/>
-      <w:lvlJc w:val="left"/>
-    </w:lvl>
-    <w:lvl w:ilvl="5" w:tplc="B42C86DA">
-      <w:numFmt w:val="decimal"/>
-      <w:lvlText w:val=""/>
-      <w:lvlJc w:val="left"/>
-    </w:lvl>
-    <w:lvl w:ilvl="6" w:tplc="CD84BD2A">
-      <w:numFmt w:val="decimal"/>
-      <w:lvlText w:val=""/>
-      <w:lvlJc w:val="left"/>
-    </w:lvl>
-    <w:lvl w:ilvl="7" w:tplc="A3DE154A">
-      <w:numFmt w:val="decimal"/>
-      <w:lvlText w:val=""/>
-      <w:lvlJc w:val="left"/>
-    </w:lvl>
-    <w:lvl w:ilvl="8" w:tplc="F52672A2">
-      <w:numFmt w:val="decimal"/>
-      <w:lvlText w:val=""/>
-      <w:lvlJc w:val="left"/>
-    </w:lvl>
-  </w:abstractNum>
-  <w:abstractNum w:abstractNumId="1" w15:restartNumberingAfterBreak="0">
-    <w:nsid w:val="76282AE6"/>
-    <w:multiLevelType w:val="hybridMultilevel"/>
-    <w:tmpl w:val="F81012DA"/>
-    <w:lvl w:ilvl="0" w:tplc="A176ACB4">
-      <w:start w:val="1"/>
-      <w:numFmt w:val="bullet"/>
-      <w:lvlText w:val="●"/>
-      <w:lvlJc w:val="left"/>
-      <w:pPr>
-        <w:ind w:left="720" w:hanging="360"/>
-      </w:pPr>
-    </w:lvl>
-    <w:lvl w:ilvl="1" w:tplc="26B42B22">
-      <w:start w:val="1"/>
-      <w:numFmt w:val="bullet"/>
-      <w:lvlText w:val="○"/>
-      <w:lvlJc w:val="left"/>
-      <w:pPr>
-        <w:ind w:left="1440" w:hanging="360"/>
-      </w:pPr>
-    </w:lvl>
-    <w:lvl w:ilvl="2" w:tplc="2064FEB6">
-      <w:start w:val="1"/>
-      <w:numFmt w:val="bullet"/>
-      <w:lvlText w:val="■"/>
-      <w:lvlJc w:val="left"/>
-      <w:pPr>
-        <w:ind w:left="2160" w:hanging="360"/>
-      </w:pPr>
-    </w:lvl>
-    <w:lvl w:ilvl="3" w:tplc="3F0C3148">
-      <w:start w:val="1"/>
-      <w:numFmt w:val="bullet"/>
-      <w:lvlText w:val="●"/>
-      <w:lvlJc w:val="left"/>
-      <w:pPr>
-        <w:ind w:left="2880" w:hanging="360"/>
-      </w:pPr>
-    </w:lvl>
-    <w:lvl w:ilvl="4" w:tplc="DCEE2A98">
-      <w:start w:val="1"/>
-      <w:numFmt w:val="bullet"/>
-      <w:lvlText w:val="○"/>
-      <w:lvlJc w:val="left"/>
-      <w:pPr>
-        <w:ind w:left="3600" w:hanging="360"/>
-      </w:pPr>
-    </w:lvl>
-    <w:lvl w:ilvl="5" w:tplc="67AA713C">
-      <w:start w:val="1"/>
-      <w:numFmt w:val="bullet"/>
-      <w:lvlText w:val="■"/>
-      <w:lvlJc w:val="left"/>
-      <w:pPr>
-        <w:ind w:left="4320" w:hanging="360"/>
-      </w:pPr>
-    </w:lvl>
-    <w:lvl w:ilvl="6" w:tplc="713A1E18">
-      <w:start w:val="1"/>
-      <w:numFmt w:val="bullet"/>
-      <w:lvlText w:val="●"/>
-      <w:lvlJc w:val="left"/>
-      <w:pPr>
-        <w:ind w:left="5040" w:hanging="360"/>
-      </w:pPr>
-    </w:lvl>
-    <w:lvl w:ilvl="7" w:tplc="D47AFBFE">
-      <w:start w:val="1"/>
-      <w:numFmt w:val="bullet"/>
-      <w:lvlText w:val="●"/>
-      <w:lvlJc w:val="left"/>
-      <w:pPr>
-        <w:ind w:left="5760" w:hanging="360"/>
-      </w:pPr>
-    </w:lvl>
-    <w:lvl w:ilvl="8" w:tplc="F39092C2">
-      <w:start w:val="1"/>
-      <w:numFmt w:val="bullet"/>
-      <w:lvlText w:val="●"/>
-      <w:lvlJc w:val="left"/>
-      <w:pPr>
-        <w:ind w:left="6480" w:hanging="360"/>
-      </w:pPr>
-    </w:lvl>
-  </w:abstractNum>
-  <w:num w:numId="1" w16cid:durableId="189299293">
-    <w:abstractNumId w:val="1"/>
-    <w:lvlOverride w:ilvl="0">
-      <w:startOverride w:val="1"/>
-    </w:lvlOverride>
-  </w:num>
-</w:numbering>
-</file>
-
 <file path=word/styles.xml><?xml version="1.0" encoding="utf-8"?>
-<w:styles xmlns:mc="http://schemas.openxmlformats.org/markup-compatibility/2006" xmlns:r="http://schemas.openxmlformats.org/officeDocument/2006/relationships" xmlns:w="http://schemas.openxmlformats.org/wordprocessingml/2006/main" xmlns:w14="http://schemas.microsoft.com/office/word/2010/wordml" xmlns:w15="http://schemas.microsoft.com/office/word/2012/wordml" xmlns:w16cex="http://schemas.microsoft.com/office/word/2018/wordml/cex" xmlns:w16cid="http://schemas.microsoft.com/office/word/2016/wordml/cid" xmlns:w16="http://schemas.microsoft.com/office/word/2018/wordml" xmlns:w16du="http://schemas.microsoft.com/office/word/2023/wordml/word16du" xmlns:w16sdtdh="http://schemas.microsoft.com/office/word/2020/wordml/sdtdatahash" xmlns:w16sdtfl="http://schemas.microsoft.com/office/word/2024/wordml/sdtformatlock" xmlns:w16se="http://schemas.microsoft.com/office/word/2015/wordml/symex" mc:Ignorable="w14 w15 w16se w16cid w16 w16cex w16sdtdh w16sdtfl w16du">
+<w:styles xmlns:mc="http://schemas.openxmlformats.org/markup-compatibility/2006" xmlns:o="urn:schemas-microsoft-com:office:office" xmlns:r="http://schemas.openxmlformats.org/officeDocument/2006/relationships" xmlns:m="http://schemas.openxmlformats.org/officeDocument/2006/math" xmlns:v="urn:schemas-microsoft-com:vml" xmlns:w="http://schemas.openxmlformats.org/wordprocessingml/2006/main" xmlns:w14="http://schemas.microsoft.com/office/word/2010/wordml" xmlns:w10="urn:schemas-microsoft-com:office:word" xmlns:sl="http://schemas.openxmlformats.org/schemaLibrary/2006/main" xmlns:wpsCustomData="http://www.wps.cn/officeDocument/2013/wpsCustomData" mc:Ignorable="w14">
   <w:docDefaults>
     <w:rPrDefault>
       <w:rPr>
-        <w:rFonts w:ascii="Times New Roman" w:eastAsia="Times New Roman" w:hAnsi="Times New Roman" w:cs="Times New Roman"/>
-        <w:lang w:val="tr-TR" w:eastAsia="tr-TR" w:bidi="ar-SA"/>
+        <w:rFonts w:ascii="Times New Roman" w:hAnsi="Times New Roman" w:eastAsia="Times New Roman" w:cs="Times New Roman"/>
       </w:rPr>
     </w:rPrDefault>
     <w:pPrDefault/>
   </w:docDefaults>
-  <w:latentStyles w:defLockedState="0" w:defUIPriority="99" w:defSemiHidden="0" w:defUnhideWhenUsed="0" w:defQFormat="0" w:count="376">
-    <w:lsdException w:name="Normal" w:uiPriority="0" w:qFormat="1"/>
-    <w:lsdException w:name="heading 1" w:uiPriority="9" w:qFormat="1"/>
-    <w:lsdException w:name="heading 2" w:semiHidden="1" w:uiPriority="9" w:unhideWhenUsed="1" w:qFormat="1"/>
-    <w:lsdException w:name="heading 3" w:semiHidden="1" w:uiPriority="9" w:unhideWhenUsed="1" w:qFormat="1"/>
-    <w:lsdException w:name="heading 4" w:semiHidden="1" w:uiPriority="9" w:unhideWhenUsed="1" w:qFormat="1"/>
-    <w:lsdException w:name="heading 5" w:semiHidden="1" w:uiPriority="9" w:unhideWhenUsed="1" w:qFormat="1"/>
-    <w:lsdException w:name="heading 6" w:semiHidden="1" w:uiPriority="9" w:unhideWhenUsed="1" w:qFormat="1"/>
-    <w:lsdException w:name="heading 7" w:semiHidden="1" w:uiPriority="9" w:unhideWhenUsed="1" w:qFormat="1"/>
-    <w:lsdException w:name="heading 8" w:semiHidden="1" w:uiPriority="9" w:unhideWhenUsed="1" w:qFormat="1"/>
-    <w:lsdException w:name="heading 9" w:semiHidden="1" w:uiPriority="9" w:unhideWhenUsed="1" w:qFormat="1"/>
-    <w:lsdException w:name="index 1" w:semiHidden="1" w:unhideWhenUsed="1"/>
-    <w:lsdException w:name="index 2" w:semiHidden="1" w:unhideWhenUsed="1"/>
-    <w:lsdException w:name="index 3" w:semiHidden="1" w:unhideWhenUsed="1"/>
-    <w:lsdException w:name="index 4" w:semiHidden="1" w:unhideWhenUsed="1"/>
-    <w:lsdException w:name="index 5" w:semiHidden="1" w:unhideWhenUsed="1"/>
-    <w:lsdException w:name="index 6" w:semiHidden="1" w:unhideWhenUsed="1"/>
-    <w:lsdException w:name="index 7" w:semiHidden="1" w:unhideWhenUsed="1"/>
-    <w:lsdException w:name="index 8" w:semiHidden="1" w:unhideWhenUsed="1"/>
-    <w:lsdException w:name="index 9" w:semiHidden="1" w:unhideWhenUsed="1"/>
-    <w:lsdException w:name="toc 1" w:semiHidden="1" w:uiPriority="39" w:unhideWhenUsed="1"/>
-    <w:lsdException w:name="toc 2" w:semiHidden="1" w:uiPriority="39" w:unhideWhenUsed="1"/>
-    <w:lsdException w:name="toc 3" w:semiHidden="1" w:uiPriority="39" w:unhideWhenUsed="1"/>
-    <w:lsdException w:name="toc 4" w:semiHidden="1" w:uiPriority="39" w:unhideWhenUsed="1"/>
-    <w:lsdException w:name="toc 5" w:semiHidden="1" w:uiPriority="39" w:unhideWhenUsed="1"/>
-    <w:lsdException w:name="toc 6" w:semiHidden="1" w:uiPriority="39" w:unhideWhenUsed="1"/>
-    <w:lsdException w:name="toc 7" w:semiHidden="1" w:uiPriority="39" w:unhideWhenUsed="1"/>
-    <w:lsdException w:name="toc 8" w:semiHidden="1" w:uiPriority="39" w:unhideWhenUsed="1"/>
-    <w:lsdException w:name="toc 9" w:semiHidden="1" w:uiPriority="39" w:unhideWhenUsed="1"/>
-    <w:lsdException w:name="Normal Indent" w:semiHidden="1" w:unhideWhenUsed="1"/>
-    <w:lsdException w:name="footnote text" w:semiHidden="1" w:unhideWhenUsed="1"/>
-    <w:lsdException w:name="annotation text" w:semiHidden="1" w:unhideWhenUsed="1"/>
-    <w:lsdException w:name="header" w:semiHidden="1" w:unhideWhenUsed="1"/>
-    <w:lsdException w:name="footer" w:semiHidden="1" w:unhideWhenUsed="1"/>
-    <w:lsdException w:name="index heading" w:semiHidden="1" w:unhideWhenUsed="1"/>
-    <w:lsdException w:name="caption" w:semiHidden="1" w:uiPriority="35" w:unhideWhenUsed="1" w:qFormat="1"/>
-    <w:lsdException w:name="table of figures" w:semiHidden="1" w:unhideWhenUsed="1"/>
-    <w:lsdException w:name="envelope address" w:semiHidden="1" w:unhideWhenUsed="1"/>
-    <w:lsdException w:name="envelope return" w:semiHidden="1" w:unhideWhenUsed="1"/>
-    <w:lsdException w:name="footnote reference" w:semiHidden="1" w:unhideWhenUsed="1"/>
-    <w:lsdException w:name="annotation reference" w:semiHidden="1" w:unhideWhenUsed="1"/>
-    <w:lsdException w:name="line number" w:semiHidden="1" w:unhideWhenUsed="1"/>
-    <w:lsdException w:name="page number" w:semiHidden="1" w:unhideWhenUsed="1"/>
-    <w:lsdException w:name="endnote reference" w:semiHidden="1" w:unhideWhenUsed="1"/>
-    <w:lsdException w:name="endnote text" w:semiHidden="1" w:unhideWhenUsed="1"/>
-    <w:lsdException w:name="table of authorities" w:semiHidden="1" w:unhideWhenUsed="1"/>
-    <w:lsdException w:name="macro" w:semiHidden="1" w:unhideWhenUsed="1"/>
-    <w:lsdException w:name="toa heading" w:semiHidden="1" w:unhideWhenUsed="1"/>
-    <w:lsdException w:name="List" w:semiHidden="1" w:unhideWhenUsed="1"/>
-    <w:lsdException w:name="List Bullet" w:semiHidden="1" w:unhideWhenUsed="1"/>
-    <w:lsdException w:name="List Number" w:semiHidden="1" w:unhideWhenUsed="1"/>
-    <w:lsdException w:name="List 2" w:semiHidden="1" w:unhideWhenUsed="1"/>
-    <w:lsdException w:name="List 3" w:semiHidden="1" w:unhideWhenUsed="1"/>
-    <w:lsdException w:name="List 4" w:semiHidden="1" w:unhideWhenUsed="1"/>
-    <w:lsdException w:name="List 5" w:semiHidden="1" w:unhideWhenUsed="1"/>
-    <w:lsdException w:name="List Bullet 2" w:semiHidden="1" w:unhideWhenUsed="1"/>
-    <w:lsdException w:name="List Bullet 3" w:semiHidden="1" w:unhideWhenUsed="1"/>
-    <w:lsdException w:name="List Bullet 4" w:semiHidden="1" w:unhideWhenUsed="1"/>
-    <w:lsdException w:name="List Bullet 5" w:semiHidden="1" w:unhideWhenUsed="1"/>
-    <w:lsdException w:name="List Number 2" w:semiHidden="1" w:unhideWhenUsed="1"/>
-    <w:lsdException w:name="List Number 3" w:semiHidden="1" w:unhideWhenUsed="1"/>
-    <w:lsdException w:name="List Number 4" w:semiHidden="1" w:unhideWhenUsed="1"/>
-    <w:lsdException w:name="List Number 5" w:semiHidden="1" w:unhideWhenUsed="1"/>
-    <w:lsdException w:name="Title" w:uiPriority="10" w:qFormat="1"/>
-    <w:lsdException w:name="Closing" w:semiHidden="1" w:unhideWhenUsed="1"/>
-    <w:lsdException w:name="Signature" w:semiHidden="1" w:unhideWhenUsed="1"/>
-    <w:lsdException w:name="Default Paragraph Font" w:semiHidden="1" w:uiPriority="1" w:unhideWhenUsed="1"/>
-    <w:lsdException w:name="Body Text" w:semiHidden="1" w:unhideWhenUsed="1"/>
-    <w:lsdException w:name="Body Text Indent" w:semiHidden="1" w:unhideWhenUsed="1"/>
-    <w:lsdException w:name="List Continue" w:semiHidden="1" w:unhideWhenUsed="1"/>
-    <w:lsdException w:name="List Continue 2" w:semiHidden="1" w:unhideWhenUsed="1"/>
-    <w:lsdException w:name="List Continue 3" w:semiHidden="1" w:unhideWhenUsed="1"/>
-    <w:lsdException w:name="List Continue 4" w:semiHidden="1" w:unhideWhenUsed="1"/>
-    <w:lsdException w:name="List Continue 5" w:semiHidden="1" w:unhideWhenUsed="1"/>
-    <w:lsdException w:name="Message Header" w:semiHidden="1" w:unhideWhenUsed="1"/>
-    <w:lsdException w:name="Subtitle" w:uiPriority="11" w:qFormat="1"/>
-    <w:lsdException w:name="Salutation" w:semiHidden="1" w:unhideWhenUsed="1"/>
-    <w:lsdException w:name="Date" w:semiHidden="1" w:unhideWhenUsed="1"/>
-    <w:lsdException w:name="Body Text First Indent" w:semiHidden="1" w:unhideWhenUsed="1"/>
-    <w:lsdException w:name="Body Text First Indent 2" w:semiHidden="1" w:unhideWhenUsed="1"/>
-    <w:lsdException w:name="Note Heading" w:semiHidden="1" w:unhideWhenUsed="1"/>
-    <w:lsdException w:name="Body Text 2" w:semiHidden="1" w:unhideWhenUsed="1"/>
-    <w:lsdException w:name="Body Text 3" w:semiHidden="1" w:unhideWhenUsed="1"/>
-    <w:lsdException w:name="Body Text Indent 2" w:semiHidden="1" w:unhideWhenUsed="1"/>
-    <w:lsdException w:name="Body Text Indent 3" w:semiHidden="1" w:unhideWhenUsed="1"/>
-    <w:lsdException w:name="Block Text" w:semiHidden="1" w:unhideWhenUsed="1"/>
-    <w:lsdException w:name="Hyperlink" w:semiHidden="1" w:unhideWhenUsed="1"/>
-    <w:lsdException w:name="FollowedHyperlink" w:semiHidden="1" w:unhideWhenUsed="1"/>
-    <w:lsdException w:name="Strong" w:uiPriority="22" w:qFormat="1"/>
-    <w:lsdException w:name="Emphasis" w:uiPriority="20" w:qFormat="1"/>
-    <w:lsdException w:name="Document Map" w:semiHidden="1" w:unhideWhenUsed="1"/>
-    <w:lsdException w:name="Plain Text" w:semiHidden="1" w:unhideWhenUsed="1"/>
-    <w:lsdException w:name="E-mail Signature" w:semiHidden="1" w:unhideWhenUsed="1"/>
-    <w:lsdException w:name="HTML Top of Form" w:semiHidden="1" w:unhideWhenUsed="1"/>
-    <w:lsdException w:name="HTML Bottom of Form" w:semiHidden="1" w:unhideWhenUsed="1"/>
-    <w:lsdException w:name="Normal (Web)" w:semiHidden="1" w:unhideWhenUsed="1"/>
-    <w:lsdException w:name="HTML Acronym" w:semiHidden="1" w:unhideWhenUsed="1"/>
-    <w:lsdException w:name="HTML Address" w:semiHidden="1" w:unhideWhenUsed="1"/>
-    <w:lsdException w:name="HTML Cite" w:semiHidden="1" w:unhideWhenUsed="1"/>
-    <w:lsdException w:name="HTML Code" w:semiHidden="1" w:unhideWhenUsed="1"/>
-    <w:lsdException w:name="HTML Definition" w:semiHidden="1" w:unhideWhenUsed="1"/>
-    <w:lsdException w:name="HTML Keyboard" w:semiHidden="1" w:unhideWhenUsed="1"/>
-    <w:lsdException w:name="HTML Preformatted" w:semiHidden="1" w:unhideWhenUsed="1"/>
-    <w:lsdException w:name="HTML Sample" w:semiHidden="1" w:unhideWhenUsed="1"/>
-    <w:lsdException w:name="HTML Typewriter" w:semiHidden="1" w:unhideWhenUsed="1"/>
-    <w:lsdException w:name="HTML Variable" w:semiHidden="1" w:unhideWhenUsed="1"/>
-    <w:lsdException w:name="Normal Table" w:semiHidden="1" w:unhideWhenUsed="1"/>
-    <w:lsdException w:name="annotation subject" w:semiHidden="1" w:unhideWhenUsed="1"/>
-    <w:lsdException w:name="No List" w:semiHidden="1" w:unhideWhenUsed="1"/>
-    <w:lsdException w:name="Outline List 1" w:semiHidden="1" w:unhideWhenUsed="1"/>
-    <w:lsdException w:name="Outline List 2" w:semiHidden="1" w:unhideWhenUsed="1"/>
-    <w:lsdException w:name="Outline List 3" w:semiHidden="1" w:unhideWhenUsed="1"/>
-    <w:lsdException w:name="Table Simple 1" w:semiHidden="1" w:unhideWhenUsed="1"/>
-    <w:lsdException w:name="Table Simple 2" w:semiHidden="1" w:unhideWhenUsed="1"/>
-    <w:lsdException w:name="Table Simple 3" w:semiHidden="1" w:unhideWhenUsed="1"/>
-    <w:lsdException w:name="Table Classic 1" w:semiHidden="1" w:unhideWhenUsed="1"/>
-    <w:lsdException w:name="Table Classic 2" w:semiHidden="1" w:unhideWhenUsed="1"/>
-    <w:lsdException w:name="Table Classic 3" w:semiHidden="1" w:unhideWhenUsed="1"/>
-    <w:lsdException w:name="Table Classic 4" w:semiHidden="1" w:unhideWhenUsed="1"/>
-    <w:lsdException w:name="Table Colorful 1" w:semiHidden="1" w:unhideWhenUsed="1"/>
-    <w:lsdException w:name="Table Colorful 2" w:semiHidden="1" w:unhideWhenUsed="1"/>
-    <w:lsdException w:name="Table Colorful 3" w:semiHidden="1" w:unhideWhenUsed="1"/>
-    <w:lsdException w:name="Table Columns 1" w:semiHidden="1" w:unhideWhenUsed="1"/>
-    <w:lsdException w:name="Table Columns 2" w:semiHidden="1" w:unhideWhenUsed="1"/>
-    <w:lsdException w:name="Table Columns 3" w:semiHidden="1" w:unhideWhenUsed="1"/>
-    <w:lsdException w:name="Table Columns 4" w:semiHidden="1" w:unhideWhenUsed="1"/>
-    <w:lsdException w:name="Table Columns 5" w:semiHidden="1" w:unhideWhenUsed="1"/>
-    <w:lsdException w:name="Table Grid 1" w:semiHidden="1" w:unhideWhenUsed="1"/>
-    <w:lsdException w:name="Table Grid 2" w:semiHidden="1" w:unhideWhenUsed="1"/>
-    <w:lsdException w:name="Table Grid 3" w:semiHidden="1" w:unhideWhenUsed="1"/>
-    <w:lsdException w:name="Table Grid 4" w:semiHidden="1" w:unhideWhenUsed="1"/>
-    <w:lsdException w:name="Table Grid 5" w:semiHidden="1" w:unhideWhenUsed="1"/>
-    <w:lsdException w:name="Table Grid 6" w:semiHidden="1" w:unhideWhenUsed="1"/>
-    <w:lsdException w:name="Table Grid 7" w:semiHidden="1" w:unhideWhenUsed="1"/>
-    <w:lsdException w:name="Table Grid 8" w:semiHidden="1" w:unhideWhenUsed="1"/>
-    <w:lsdException w:name="Table List 1" w:semiHidden="1" w:unhideWhenUsed="1"/>
-    <w:lsdException w:name="Table List 2" w:semiHidden="1" w:unhideWhenUsed="1"/>
-    <w:lsdException w:name="Table List 3" w:semiHidden="1" w:unhideWhenUsed="1"/>
-    <w:lsdException w:name="Table List 4" w:semiHidden="1" w:unhideWhenUsed="1"/>
-    <w:lsdException w:name="Table List 5" w:semiHidden="1" w:unhideWhenUsed="1"/>
-    <w:lsdException w:name="Table List 6" w:semiHidden="1" w:unhideWhenUsed="1"/>
-    <w:lsdException w:name="Table List 7" w:semiHidden="1" w:unhideWhenUsed="1"/>
-    <w:lsdException w:name="Table List 8" w:semiHidden="1" w:unhideWhenUsed="1"/>
-    <w:lsdException w:name="Table 3D effects 1" w:semiHidden="1" w:unhideWhenUsed="1"/>
-    <w:lsdException w:name="Table 3D effects 2" w:semiHidden="1" w:unhideWhenUsed="1"/>
-    <w:lsdException w:name="Table 3D effects 3" w:semiHidden="1" w:unhideWhenUsed="1"/>
-    <w:lsdException w:name="Table Contemporary" w:semiHidden="1" w:unhideWhenUsed="1"/>
-    <w:lsdException w:name="Table Elegant" w:semiHidden="1" w:unhideWhenUsed="1"/>
-    <w:lsdException w:name="Table Professional" w:semiHidden="1" w:unhideWhenUsed="1"/>
-    <w:lsdException w:name="Table Subtle 1" w:semiHidden="1" w:unhideWhenUsed="1"/>
-    <w:lsdException w:name="Table Subtle 2" w:semiHidden="1" w:unhideWhenUsed="1"/>
-    <w:lsdException w:name="Table Web 1" w:semiHidden="1" w:unhideWhenUsed="1"/>
-    <w:lsdException w:name="Table Web 2" w:semiHidden="1" w:unhideWhenUsed="1"/>
-    <w:lsdException w:name="Table Web 3" w:semiHidden="1" w:unhideWhenUsed="1"/>
-    <w:lsdException w:name="Balloon Text" w:semiHidden="1" w:unhideWhenUsed="1"/>
-    <w:lsdException w:name="Table Grid" w:uiPriority="39"/>
-    <w:lsdException w:name="Table Theme" w:semiHidden="1" w:unhideWhenUsed="1"/>
-    <w:lsdException w:name="Placeholder Text" w:semiHidden="1"/>
-    <w:lsdException w:name="No Spacing" w:uiPriority="1" w:qFormat="1"/>
-    <w:lsdException w:name="Light Shading" w:uiPriority="60"/>
-    <w:lsdException w:name="Light List" w:uiPriority="61"/>
-    <w:lsdException w:name="Light Grid" w:uiPriority="62"/>
-    <w:lsdException w:name="Medium Shading 1" w:uiPriority="63"/>
-    <w:lsdException w:name="Medium Shading 2" w:uiPriority="64"/>
-    <w:lsdException w:name="Medium List 1" w:uiPriority="65"/>
-    <w:lsdException w:name="Medium List 2" w:uiPriority="66"/>
-    <w:lsdException w:name="Medium Grid 1" w:uiPriority="67"/>
-    <w:lsdException w:name="Medium Grid 2" w:uiPriority="68"/>
-    <w:lsdException w:name="Medium Grid 3" w:uiPriority="69"/>
-    <w:lsdException w:name="Dark List" w:uiPriority="70"/>
-    <w:lsdException w:name="Colorful Shading" w:uiPriority="71"/>
-    <w:lsdException w:name="Colorful List" w:uiPriority="72"/>
-    <w:lsdException w:name="Colorful Grid" w:uiPriority="73"/>
-    <w:lsdException w:name="Light Shading Accent 1" w:uiPriority="60"/>
-    <w:lsdException w:name="Light List Accent 1" w:uiPriority="61"/>
-    <w:lsdException w:name="Light Grid Accent 1" w:uiPriority="62"/>
-    <w:lsdException w:name="Medium Shading 1 Accent 1" w:uiPriority="63"/>
-    <w:lsdException w:name="Medium Shading 2 Accent 1" w:uiPriority="64"/>
-    <w:lsdException w:name="Medium List 1 Accent 1" w:uiPriority="65"/>
-    <w:lsdException w:name="Revision" w:semiHidden="1"/>
-    <w:lsdException w:name="List Paragraph" w:uiPriority="34" w:qFormat="1"/>
-    <w:lsdException w:name="Quote" w:uiPriority="29" w:qFormat="1"/>
-    <w:lsdException w:name="Intense Quote" w:uiPriority="30" w:qFormat="1"/>
-    <w:lsdException w:name="Medium List 2 Accent 1" w:uiPriority="66"/>
-    <w:lsdException w:name="Medium Grid 1 Accent 1" w:uiPriority="67"/>
-    <w:lsdException w:name="Medium Grid 2 Accent 1" w:uiPriority="68"/>
-    <w:lsdException w:name="Medium Grid 3 Accent 1" w:uiPriority="69"/>
-    <w:lsdException w:name="Dark List Accent 1" w:uiPriority="70"/>
-    <w:lsdException w:name="Colorful Shading Accent 1" w:uiPriority="71"/>
-    <w:lsdException w:name="Colorful List Accent 1" w:uiPriority="72"/>
-    <w:lsdException w:name="Colorful Grid Accent 1" w:uiPriority="73"/>
-    <w:lsdException w:name="Light Shading Accent 2" w:uiPriority="60"/>
-    <w:lsdException w:name="Light List Accent 2" w:uiPriority="61"/>
-    <w:lsdException w:name="Light Grid Accent 2" w:uiPriority="62"/>
-    <w:lsdException w:name="Medium Shading 1 Accent 2" w:uiPriority="63"/>
-    <w:lsdException w:name="Medium Shading 2 Accent 2" w:uiPriority="64"/>
-    <w:lsdException w:name="Medium List 1 Accent 2" w:uiPriority="65"/>
-    <w:lsdException w:name="Medium List 2 Accent 2" w:uiPriority="66"/>
-    <w:lsdException w:name="Medium Grid 1 Accent 2" w:uiPriority="67"/>
-    <w:lsdException w:name="Medium Grid 2 Accent 2" w:uiPriority="68"/>
-    <w:lsdException w:name="Medium Grid 3 Accent 2" w:uiPriority="69"/>
-    <w:lsdException w:name="Dark List Accent 2" w:uiPriority="70"/>
-    <w:lsdException w:name="Colorful Shading Accent 2" w:uiPriority="71"/>
-    <w:lsdException w:name="Colorful List Accent 2" w:uiPriority="72"/>
-    <w:lsdException w:name="Colorful Grid Accent 2" w:uiPriority="73"/>
-    <w:lsdException w:name="Light Shading Accent 3" w:uiPriority="60"/>
-    <w:lsdException w:name="Light List Accent 3" w:uiPriority="61"/>
-    <w:lsdException w:name="Light Grid Accent 3" w:uiPriority="62"/>
-    <w:lsdException w:name="Medium Shading 1 Accent 3" w:uiPriority="63"/>
-    <w:lsdException w:name="Medium Shading 2 Accent 3" w:uiPriority="64"/>
-    <w:lsdException w:name="Medium List 1 Accent 3" w:uiPriority="65"/>
-    <w:lsdException w:name="Medium List 2 Accent 3" w:uiPriority="66"/>
-    <w:lsdException w:name="Medium Grid 1 Accent 3" w:uiPriority="67"/>
-    <w:lsdException w:name="Medium Grid 2 Accent 3" w:uiPriority="68"/>
-    <w:lsdException w:name="Medium Grid 3 Accent 3" w:uiPriority="69"/>
-    <w:lsdException w:name="Dark List Accent 3" w:uiPriority="70"/>
-    <w:lsdException w:name="Colorful Shading Accent 3" w:uiPriority="71"/>
-    <w:lsdException w:name="Colorful List Accent 3" w:uiPriority="72"/>
-    <w:lsdException w:name="Colorful Grid Accent 3" w:uiPriority="73"/>
-    <w:lsdException w:name="Light Shading Accent 4" w:uiPriority="60"/>
-    <w:lsdException w:name="Light List Accent 4" w:uiPriority="61"/>
-    <w:lsdException w:name="Light Grid Accent 4" w:uiPriority="62"/>
-    <w:lsdException w:name="Medium Shading 1 Accent 4" w:uiPriority="63"/>
-    <w:lsdException w:name="Medium Shading 2 Accent 4" w:uiPriority="64"/>
-    <w:lsdException w:name="Medium List 1 Accent 4" w:uiPriority="65"/>
-    <w:lsdException w:name="Medium List 2 Accent 4" w:uiPriority="66"/>
-    <w:lsdException w:name="Medium Grid 1 Accent 4" w:uiPriority="67"/>
-    <w:lsdException w:name="Medium Grid 2 Accent 4" w:uiPriority="68"/>
-    <w:lsdException w:name="Medium Grid 3 Accent 4" w:uiPriority="69"/>
-    <w:lsdException w:name="Dark List Accent 4" w:uiPriority="70"/>
-    <w:lsdException w:name="Colorful Shading Accent 4" w:uiPriority="71"/>
-    <w:lsdException w:name="Colorful List Accent 4" w:uiPriority="72"/>
-    <w:lsdException w:name="Colorful Grid Accent 4" w:uiPriority="73"/>
-    <w:lsdException w:name="Light Shading Accent 5" w:uiPriority="60"/>
-    <w:lsdException w:name="Light List Accent 5" w:uiPriority="61"/>
-    <w:lsdException w:name="Light Grid Accent 5" w:uiPriority="62"/>
-    <w:lsdException w:name="Medium Shading 1 Accent 5" w:uiPriority="63"/>
-    <w:lsdException w:name="Medium Shading 2 Accent 5" w:uiPriority="64"/>
-    <w:lsdException w:name="Medium List 1 Accent 5" w:uiPriority="65"/>
-    <w:lsdException w:name="Medium List 2 Accent 5" w:uiPriority="66"/>
-    <w:lsdException w:name="Medium Grid 1 Accent 5" w:uiPriority="67"/>
-    <w:lsdException w:name="Medium Grid 2 Accent 5" w:uiPriority="68"/>
-    <w:lsdException w:name="Medium Grid 3 Accent 5" w:uiPriority="69"/>
-    <w:lsdException w:name="Dark List Accent 5" w:uiPriority="70"/>
-    <w:lsdException w:name="Colorful Shading Accent 5" w:uiPriority="71"/>
-    <w:lsdException w:name="Colorful List Accent 5" w:uiPriority="72"/>
-    <w:lsdException w:name="Colorful Grid Accent 5" w:uiPriority="73"/>
-    <w:lsdException w:name="Light Shading Accent 6" w:uiPriority="60"/>
-    <w:lsdException w:name="Light List Accent 6" w:uiPriority="61"/>
-    <w:lsdException w:name="Light Grid Accent 6" w:uiPriority="62"/>
-    <w:lsdException w:name="Medium Shading 1 Accent 6" w:uiPriority="63"/>
-    <w:lsdException w:name="Medium Shading 2 Accent 6" w:uiPriority="64"/>
-    <w:lsdException w:name="Medium List 1 Accent 6" w:uiPriority="65"/>
-    <w:lsdException w:name="Medium List 2 Accent 6" w:uiPriority="66"/>
-    <w:lsdException w:name="Medium Grid 1 Accent 6" w:uiPriority="67"/>
-    <w:lsdException w:name="Medium Grid 2 Accent 6" w:uiPriority="68"/>
-    <w:lsdException w:name="Medium Grid 3 Accent 6" w:uiPriority="69"/>
-    <w:lsdException w:name="Dark List Accent 6" w:uiPriority="70"/>
-    <w:lsdException w:name="Colorful Shading Accent 6" w:uiPriority="71"/>
-    <w:lsdException w:name="Colorful List Accent 6" w:uiPriority="72"/>
-    <w:lsdException w:name="Colorful Grid Accent 6" w:uiPriority="73"/>
-    <w:lsdException w:name="Subtle Emphasis" w:uiPriority="19" w:qFormat="1"/>
-    <w:lsdException w:name="Intense Emphasis" w:uiPriority="21" w:qFormat="1"/>
-    <w:lsdException w:name="Subtle Reference" w:uiPriority="31" w:qFormat="1"/>
-    <w:lsdException w:name="Intense Reference" w:uiPriority="32" w:qFormat="1"/>
-    <w:lsdException w:name="Book Title" w:uiPriority="33" w:qFormat="1"/>
-    <w:lsdException w:name="Bibliography" w:semiHidden="1" w:uiPriority="37" w:unhideWhenUsed="1"/>
-    <w:lsdException w:name="TOC Heading" w:semiHidden="1" w:uiPriority="39" w:unhideWhenUsed="1" w:qFormat="1"/>
-    <w:lsdException w:name="Plain Table 1" w:uiPriority="41"/>
-    <w:lsdException w:name="Plain Table 2" w:uiPriority="42"/>
-    <w:lsdException w:name="Plain Table 3" w:uiPriority="43"/>
-    <w:lsdException w:name="Plain Table 4" w:uiPriority="44"/>
-    <w:lsdException w:name="Plain Table 5" w:uiPriority="45"/>
-    <w:lsdException w:name="Grid Table Light" w:uiPriority="40"/>
-    <w:lsdException w:name="Grid Table 1 Light" w:uiPriority="46"/>
-    <w:lsdException w:name="Grid Table 2" w:uiPriority="47"/>
-    <w:lsdException w:name="Grid Table 3" w:uiPriority="48"/>
-    <w:lsdException w:name="Grid Table 4" w:uiPriority="49"/>
-    <w:lsdException w:name="Grid Table 5 Dark" w:uiPriority="50"/>
-    <w:lsdException w:name="Grid Table 6 Colorful" w:uiPriority="51"/>
-    <w:lsdException w:name="Grid Table 7 Colorful" w:uiPriority="52"/>
-    <w:lsdException w:name="Grid Table 1 Light Accent 1" w:uiPriority="46"/>
-    <w:lsdException w:name="Grid Table 2 Accent 1" w:uiPriority="47"/>
-    <w:lsdException w:name="Grid Table 3 Accent 1" w:uiPriority="48"/>
-    <w:lsdException w:name="Grid Table 4 Accent 1" w:uiPriority="49"/>
-    <w:lsdException w:name="Grid Table 5 Dark Accent 1" w:uiPriority="50"/>
-    <w:lsdException w:name="Grid Table 6 Colorful Accent 1" w:uiPriority="51"/>
-    <w:lsdException w:name="Grid Table 7 Colorful Accent 1" w:uiPriority="52"/>
-    <w:lsdException w:name="Grid Table 1 Light Accent 2" w:uiPriority="46"/>
-    <w:lsdException w:name="Grid Table 2 Accent 2" w:uiPriority="47"/>
-    <w:lsdException w:name="Grid Table 3 Accent 2" w:uiPriority="48"/>
-    <w:lsdException w:name="Grid Table 4 Accent 2" w:uiPriority="49"/>
-    <w:lsdException w:name="Grid Table 5 Dark Accent 2" w:uiPriority="50"/>
-    <w:lsdException w:name="Grid Table 6 Colorful Accent 2" w:uiPriority="51"/>
-    <w:lsdException w:name="Grid Table 7 Colorful Accent 2" w:uiPriority="52"/>
-    <w:lsdException w:name="Grid Table 1 Light Accent 3" w:uiPriority="46"/>
-    <w:lsdException w:name="Grid Table 2 Accent 3" w:uiPriority="47"/>
-    <w:lsdException w:name="Grid Table 3 Accent 3" w:uiPriority="48"/>
-    <w:lsdException w:name="Grid Table 4 Accent 3" w:uiPriority="49"/>
-    <w:lsdException w:name="Grid Table 5 Dark Accent 3" w:uiPriority="50"/>
-    <w:lsdException w:name="Grid Table 6 Colorful Accent 3" w:uiPriority="51"/>
-    <w:lsdException w:name="Grid Table 7 Colorful Accent 3" w:uiPriority="52"/>
-    <w:lsdException w:name="Grid Table 1 Light Accent 4" w:uiPriority="46"/>
-    <w:lsdException w:name="Grid Table 2 Accent 4" w:uiPriority="47"/>
-    <w:lsdException w:name="Grid Table 3 Accent 4" w:uiPriority="48"/>
-    <w:lsdException w:name="Grid Table 4 Accent 4" w:uiPriority="49"/>
-    <w:lsdException w:name="Grid Table 5 Dark Accent 4" w:uiPriority="50"/>
-    <w:lsdException w:name="Grid Table 6 Colorful Accent 4" w:uiPriority="51"/>
-    <w:lsdException w:name="Grid Table 7 Colorful Accent 4" w:uiPriority="52"/>
-    <w:lsdException w:name="Grid Table 1 Light Accent 5" w:uiPriority="46"/>
-    <w:lsdException w:name="Grid Table 2 Accent 5" w:uiPriority="47"/>
-    <w:lsdException w:name="Grid Table 3 Accent 5" w:uiPriority="48"/>
-    <w:lsdException w:name="Grid Table 4 Accent 5" w:uiPriority="49"/>
-    <w:lsdException w:name="Grid Table 5 Dark Accent 5" w:uiPriority="50"/>
-    <w:lsdException w:name="Grid Table 6 Colorful Accent 5" w:uiPriority="51"/>
-    <w:lsdException w:name="Grid Table 7 Colorful Accent 5" w:uiPriority="52"/>
-    <w:lsdException w:name="Grid Table 1 Light Accent 6" w:uiPriority="46"/>
-    <w:lsdException w:name="Grid Table 2 Accent 6" w:uiPriority="47"/>
-    <w:lsdException w:name="Grid Table 3 Accent 6" w:uiPriority="48"/>
-    <w:lsdException w:name="Grid Table 4 Accent 6" w:uiPriority="49"/>
-    <w:lsdException w:name="Grid Table 5 Dark Accent 6" w:uiPriority="50"/>
-    <w:lsdException w:name="Grid Table 6 Colorful Accent 6" w:uiPriority="51"/>
-    <w:lsdException w:name="Grid Table 7 Colorful Accent 6" w:uiPriority="52"/>
-    <w:lsdException w:name="List Table 1 Light" w:uiPriority="46"/>
-    <w:lsdException w:name="List Table 2" w:uiPriority="47"/>
-    <w:lsdException w:name="List Table 3" w:uiPriority="48"/>
-    <w:lsdException w:name="List Table 4" w:uiPriority="49"/>
-    <w:lsdException w:name="List Table 5 Dark" w:uiPriority="50"/>
-    <w:lsdException w:name="List Table 6 Colorful" w:uiPriority="51"/>
-    <w:lsdException w:name="List Table 7 Colorful" w:uiPriority="52"/>
-    <w:lsdException w:name="List Table 1 Light Accent 1" w:uiPriority="46"/>
-    <w:lsdException w:name="List Table 2 Accent 1" w:uiPriority="47"/>
-    <w:lsdException w:name="List Table 3 Accent 1" w:uiPriority="48"/>
-    <w:lsdException w:name="List Table 4 Accent 1" w:uiPriority="49"/>
-    <w:lsdException w:name="List Table 5 Dark Accent 1" w:uiPriority="50"/>
-    <w:lsdException w:name="List Table 6 Colorful Accent 1" w:uiPriority="51"/>
-    <w:lsdException w:name="List Table 7 Colorful Accent 1" w:uiPriority="52"/>
-    <w:lsdException w:name="List Table 1 Light Accent 2" w:uiPriority="46"/>
-    <w:lsdException w:name="List Table 2 Accent 2" w:uiPriority="47"/>
-    <w:lsdException w:name="List Table 3 Accent 2" w:uiPriority="48"/>
-    <w:lsdException w:name="List Table 4 Accent 2" w:uiPriority="49"/>
-    <w:lsdException w:name="List Table 5 Dark Accent 2" w:uiPriority="50"/>
-    <w:lsdException w:name="List Table 6 Colorful Accent 2" w:uiPriority="51"/>
-    <w:lsdException w:name="List Table 7 Colorful Accent 2" w:uiPriority="52"/>
-    <w:lsdException w:name="List Table 1 Light Accent 3" w:uiPriority="46"/>
-    <w:lsdException w:name="List Table 2 Accent 3" w:uiPriority="47"/>
-    <w:lsdException w:name="List Table 3 Accent 3" w:uiPriority="48"/>
-    <w:lsdException w:name="List Table 4 Accent 3" w:uiPriority="49"/>
-    <w:lsdException w:name="List Table 5 Dark Accent 3" w:uiPriority="50"/>
-    <w:lsdException w:name="List Table 6 Colorful Accent 3" w:uiPriority="51"/>
-    <w:lsdException w:name="List Table 7 Colorful Accent 3" w:uiPriority="52"/>
-    <w:lsdException w:name="List Table 1 Light Accent 4" w:uiPriority="46"/>
-    <w:lsdException w:name="List Table 2 Accent 4" w:uiPriority="47"/>
-    <w:lsdException w:name="List Table 3 Accent 4" w:uiPriority="48"/>
-    <w:lsdException w:name="List Table 4 Accent 4" w:uiPriority="49"/>
-    <w:lsdException w:name="List Table 5 Dark Accent 4" w:uiPriority="50"/>
-    <w:lsdException w:name="List Table 6 Colorful Accent 4" w:uiPriority="51"/>
-    <w:lsdException w:name="List Table 7 Colorful Accent 4" w:uiPriority="52"/>
-    <w:lsdException w:name="List Table 1 Light Accent 5" w:uiPriority="46"/>
-    <w:lsdException w:name="List Table 2 Accent 5" w:uiPriority="47"/>
-    <w:lsdException w:name="List Table 3 Accent 5" w:uiPriority="48"/>
-    <w:lsdException w:name="List Table 4 Accent 5" w:uiPriority="49"/>
-    <w:lsdException w:name="List Table 5 Dark Accent 5" w:uiPriority="50"/>
-    <w:lsdException w:name="List Table 6 Colorful Accent 5" w:uiPriority="51"/>
-    <w:lsdException w:name="List Table 7 Colorful Accent 5" w:uiPriority="52"/>
-    <w:lsdException w:name="List Table 1 Light Accent 6" w:uiPriority="46"/>
-    <w:lsdException w:name="List Table 2 Accent 6" w:uiPriority="47"/>
-    <w:lsdException w:name="List Table 3 Accent 6" w:uiPriority="48"/>
-    <w:lsdException w:name="List Table 4 Accent 6" w:uiPriority="49"/>
-    <w:lsdException w:name="List Table 5 Dark Accent 6" w:uiPriority="50"/>
-    <w:lsdException w:name="List Table 6 Colorful Accent 6" w:uiPriority="51"/>
-    <w:lsdException w:name="List Table 7 Colorful Accent 6" w:uiPriority="52"/>
-    <w:lsdException w:name="Mention" w:semiHidden="1" w:unhideWhenUsed="1"/>
-    <w:lsdException w:name="Smart Hyperlink" w:semiHidden="1" w:unhideWhenUsed="1"/>
-    <w:lsdException w:name="Hashtag" w:semiHidden="1" w:unhideWhenUsed="1"/>
-    <w:lsdException w:name="Unresolved Mention" w:semiHidden="1" w:unhideWhenUsed="1"/>
-    <w:lsdException w:name="Smart Link" w:semiHidden="1" w:unhideWhenUsed="1"/>
+  <w:latentStyles w:count="260" w:defQFormat="0" w:defUnhideWhenUsed="1" w:defSemiHidden="1" w:defUIPriority="99" w:defLockedState="0">
+    <w:lsdException w:qFormat="1" w:unhideWhenUsed="0" w:uiPriority="0" w:semiHidden="0" w:name="Normal"/>
+    <w:lsdException w:qFormat="1" w:unhideWhenUsed="0" w:uiPriority="9" w:semiHidden="0" w:name="heading 1"/>
+    <w:lsdException w:qFormat="1" w:uiPriority="9" w:name="heading 2"/>
+    <w:lsdException w:qFormat="1" w:uiPriority="9" w:name="heading 3"/>
+    <w:lsdException w:qFormat="1" w:uiPriority="9" w:name="heading 4"/>
+    <w:lsdException w:qFormat="1" w:uiPriority="9" w:name="heading 5"/>
+    <w:lsdException w:qFormat="1" w:uiPriority="9" w:name="heading 6"/>
+    <w:lsdException w:qFormat="1" w:uiPriority="9" w:name="heading 7"/>
+    <w:lsdException w:qFormat="1" w:uiPriority="9" w:name="heading 8"/>
+    <w:lsdException w:qFormat="1" w:uiPriority="9" w:name="heading 9"/>
+    <w:lsdException w:uiPriority="99" w:name="index 1"/>
+    <w:lsdException w:uiPriority="99" w:name="index 2"/>
+    <w:lsdException w:uiPriority="99" w:name="index 3"/>
+    <w:lsdException w:uiPriority="99" w:name="index 4"/>
+    <w:lsdException w:uiPriority="99" w:name="index 5"/>
+    <w:lsdException w:uiPriority="99" w:name="index 6"/>
+    <w:lsdException w:uiPriority="99" w:name="index 7"/>
+    <w:lsdException w:uiPriority="99" w:name="index 8"/>
+    <w:lsdException w:uiPriority="99" w:name="index 9"/>
+    <w:lsdException w:uiPriority="39" w:name="toc 1"/>
+    <w:lsdException w:uiPriority="39" w:name="toc 2"/>
+    <w:lsdException w:uiPriority="39" w:name="toc 3"/>
+    <w:lsdException w:uiPriority="39" w:name="toc 4"/>
+    <w:lsdException w:uiPriority="39" w:name="toc 5"/>
+    <w:lsdException w:uiPriority="39" w:name="toc 6"/>
+    <w:lsdException w:uiPriority="39" w:name="toc 7"/>
+    <w:lsdException w:uiPriority="39" w:name="toc 8"/>
+    <w:lsdException w:uiPriority="39" w:name="toc 9"/>
+    <w:lsdException w:uiPriority="99" w:name="Normal Indent"/>
+    <w:lsdException w:qFormat="1" w:uiPriority="99" w:name="footnote text"/>
+    <w:lsdException w:uiPriority="99" w:name="annotation text"/>
+    <w:lsdException w:uiPriority="99" w:name="header"/>
+    <w:lsdException w:uiPriority="99" w:name="footer"/>
+    <w:lsdException w:uiPriority="99" w:name="index heading"/>
+    <w:lsdException w:qFormat="1" w:uiPriority="35" w:name="caption"/>
+    <w:lsdException w:uiPriority="99" w:name="table of figures"/>
+    <w:lsdException w:uiPriority="99" w:name="envelope address"/>
+    <w:lsdException w:uiPriority="99" w:name="envelope return"/>
+    <w:lsdException w:uiPriority="99" w:name="footnote reference"/>
+    <w:lsdException w:uiPriority="99" w:name="annotation reference"/>
+    <w:lsdException w:uiPriority="99" w:name="line number"/>
+    <w:lsdException w:uiPriority="99" w:name="page number"/>
+    <w:lsdException w:uiPriority="99" w:name="endnote reference"/>
+    <w:lsdException w:uiPriority="99" w:name="endnote text"/>
+    <w:lsdException w:uiPriority="99" w:name="table of authorities"/>
+    <w:lsdException w:uiPriority="99" w:name="macro"/>
+    <w:lsdException w:uiPriority="99" w:name="toa heading"/>
+    <w:lsdException w:uiPriority="99" w:name="List"/>
+    <w:lsdException w:uiPriority="99" w:name="List Bullet"/>
+    <w:lsdException w:uiPriority="99" w:name="List Number"/>
+    <w:lsdException w:uiPriority="99" w:name="List 2"/>
+    <w:lsdException w:uiPriority="99" w:name="List 3"/>
+    <w:lsdException w:uiPriority="99" w:name="List 4"/>
+    <w:lsdException w:uiPriority="99" w:name="List 5"/>
+    <w:lsdException w:uiPriority="99" w:name="List Bullet 2"/>
+    <w:lsdException w:uiPriority="99" w:name="List Bullet 3"/>
+    <w:lsdException w:uiPriority="99" w:name="List Bullet 4"/>
+    <w:lsdException w:uiPriority="99" w:name="List Bullet 5"/>
+    <w:lsdException w:uiPriority="99" w:name="List Number 2"/>
+    <w:lsdException w:uiPriority="99" w:name="List Number 3"/>
+    <w:lsdException w:uiPriority="99" w:name="List Number 4"/>
+    <w:lsdException w:uiPriority="99" w:name="List Number 5"/>
+    <w:lsdException w:qFormat="1" w:unhideWhenUsed="0" w:uiPriority="10" w:semiHidden="0" w:name="Title"/>
+    <w:lsdException w:uiPriority="99" w:name="Closing"/>
+    <w:lsdException w:uiPriority="99" w:name="Signature"/>
+    <w:lsdException w:uiPriority="1" w:name="Default Paragraph Font"/>
+    <w:lsdException w:uiPriority="99" w:name="Body Text"/>
+    <w:lsdException w:uiPriority="99" w:name="Body Text Indent"/>
+    <w:lsdException w:uiPriority="99" w:name="List Continue"/>
+    <w:lsdException w:uiPriority="99" w:name="List Continue 2"/>
+    <w:lsdException w:uiPriority="99" w:name="List Continue 3"/>
+    <w:lsdException w:uiPriority="99" w:name="List Continue 4"/>
+    <w:lsdException w:uiPriority="99" w:name="List Continue 5"/>
+    <w:lsdException w:uiPriority="99" w:name="Message Header"/>
+    <w:lsdException w:qFormat="1" w:unhideWhenUsed="0" w:uiPriority="11" w:semiHidden="0" w:name="Subtitle"/>
+    <w:lsdException w:uiPriority="99" w:name="Salutation"/>
+    <w:lsdException w:uiPriority="99" w:name="Date"/>
+    <w:lsdException w:uiPriority="99" w:name="Body Text First Indent"/>
+    <w:lsdException w:uiPriority="99" w:name="Body Text First Indent 2"/>
+    <w:lsdException w:uiPriority="99" w:name="Note Heading"/>
+    <w:lsdException w:uiPriority="99" w:name="Body Text 2"/>
+    <w:lsdException w:uiPriority="99" w:name="Body Text 3"/>
+    <w:lsdException w:uiPriority="99" w:name="Body Text Indent 2"/>
+    <w:lsdException w:uiPriority="99" w:name="Body Text Indent 3"/>
+    <w:lsdException w:uiPriority="99" w:name="Block Text"/>
+    <w:lsdException w:uiPriority="99" w:semiHidden="0" w:name="Hyperlink"/>
+    <w:lsdException w:uiPriority="99" w:name="FollowedHyperlink"/>
+    <w:lsdException w:qFormat="1" w:unhideWhenUsed="0" w:uiPriority="22" w:semiHidden="0" w:name="Strong"/>
+    <w:lsdException w:qFormat="1" w:unhideWhenUsed="0" w:uiPriority="20" w:semiHidden="0" w:name="Emphasis"/>
+    <w:lsdException w:uiPriority="99" w:name="Document Map"/>
+    <w:lsdException w:uiPriority="99" w:name="Plain Text"/>
+    <w:lsdException w:uiPriority="99" w:name="E-mail Signature"/>
+    <w:lsdException w:uiPriority="99" w:name="Normal (Web)"/>
+    <w:lsdException w:uiPriority="99" w:name="HTML Acronym"/>
+    <w:lsdException w:uiPriority="99" w:name="HTML Address"/>
+    <w:lsdException w:uiPriority="99" w:name="HTML Cite"/>
+    <w:lsdException w:uiPriority="99" w:name="HTML Code"/>
+    <w:lsdException w:uiPriority="99" w:name="HTML Definition"/>
+    <w:lsdException w:uiPriority="99" w:name="HTML Keyboard"/>
+    <w:lsdException w:uiPriority="99" w:name="HTML Preformatted"/>
+    <w:lsdException w:uiPriority="99" w:name="HTML Sample"/>
+    <w:lsdException w:uiPriority="99" w:name="HTML Typewriter"/>
+    <w:lsdException w:uiPriority="99" w:name="HTML Variable"/>
+    <w:lsdException w:uiPriority="99" w:name="Normal Table"/>
+    <w:lsdException w:uiPriority="99" w:name="annotation subject"/>
+    <w:lsdException w:uiPriority="99" w:name="Table Simple 1"/>
+    <w:lsdException w:uiPriority="99" w:name="Table Simple 2"/>
+    <w:lsdException w:uiPriority="99" w:name="Table Simple 3"/>
+    <w:lsdException w:uiPriority="99" w:name="Table Classic 1"/>
+    <w:lsdException w:uiPriority="99" w:name="Table Classic 2"/>
+    <w:lsdException w:uiPriority="99" w:name="Table Classic 3"/>
+    <w:lsdException w:uiPriority="99" w:name="Table Classic 4"/>
+    <w:lsdException w:uiPriority="99" w:name="Table Colorful 1"/>
+    <w:lsdException w:uiPriority="99" w:name="Table Colorful 2"/>
+    <w:lsdException w:uiPriority="99" w:name="Table Colorful 3"/>
+    <w:lsdException w:uiPriority="99" w:name="Table Columns 1"/>
+    <w:lsdException w:uiPriority="99" w:name="Table Columns 2"/>
+    <w:lsdException w:uiPriority="99" w:name="Table Columns 3"/>
+    <w:lsdException w:uiPriority="99" w:name="Table Columns 4"/>
+    <w:lsdException w:uiPriority="99" w:name="Table Columns 5"/>
+    <w:lsdException w:uiPriority="99" w:name="Table Grid 1"/>
+    <w:lsdException w:uiPriority="99" w:name="Table Grid 2"/>
+    <w:lsdException w:uiPriority="99" w:name="Table Grid 3"/>
+    <w:lsdException w:uiPriority="99" w:name="Table Grid 4"/>
+    <w:lsdException w:uiPriority="99" w:name="Table Grid 5"/>
+    <w:lsdException w:uiPriority="99" w:name="Table Grid 6"/>
+    <w:lsdException w:uiPriority="99" w:name="Table Grid 7"/>
+    <w:lsdException w:uiPriority="99" w:name="Table Grid 8"/>
+    <w:lsdException w:uiPriority="99" w:name="Table List 1"/>
+    <w:lsdException w:uiPriority="99" w:name="Table List 2"/>
+    <w:lsdException w:uiPriority="99" w:name="Table List 3"/>
+    <w:lsdException w:uiPriority="99" w:name="Table List 4"/>
+    <w:lsdException w:uiPriority="99" w:name="Table List 5"/>
+    <w:lsdException w:uiPriority="99" w:name="Table List 6"/>
+    <w:lsdException w:uiPriority="99" w:name="Table List 7"/>
+    <w:lsdException w:uiPriority="99" w:name="Table List 8"/>
+    <w:lsdException w:uiPriority="99" w:name="Table 3D effects 1"/>
+    <w:lsdException w:uiPriority="99" w:name="Table 3D effects 2"/>
+    <w:lsdException w:uiPriority="99" w:name="Table 3D effects 3"/>
+    <w:lsdException w:uiPriority="99" w:name="Table Contemporary"/>
+    <w:lsdException w:uiPriority="99" w:name="Table Elegant"/>
+    <w:lsdException w:uiPriority="99" w:name="Table Professional"/>
+    <w:lsdException w:uiPriority="99" w:name="Table Subtle 1"/>
+    <w:lsdException w:uiPriority="99" w:name="Table Subtle 2"/>
+    <w:lsdException w:uiPriority="99" w:name="Table Web 1"/>
+    <w:lsdException w:uiPriority="99" w:name="Table Web 2"/>
+    <w:lsdException w:uiPriority="99" w:name="Table Web 3"/>
+    <w:lsdException w:uiPriority="99" w:name="Balloon Text"/>
+    <w:lsdException w:unhideWhenUsed="0" w:uiPriority="39" w:semiHidden="0" w:name="Table Grid"/>
+    <w:lsdException w:uiPriority="99" w:name="Table Theme"/>
+    <w:lsdException w:unhideWhenUsed="0" w:uiPriority="60" w:semiHidden="0" w:name="Light Shading"/>
+    <w:lsdException w:unhideWhenUsed="0" w:uiPriority="61" w:semiHidden="0" w:name="Light List"/>
+    <w:lsdException w:unhideWhenUsed="0" w:uiPriority="62" w:semiHidden="0" w:name="Light Grid"/>
+    <w:lsdException w:unhideWhenUsed="0" w:uiPriority="63" w:semiHidden="0" w:name="Medium Shading 1"/>
+    <w:lsdException w:unhideWhenUsed="0" w:uiPriority="64" w:semiHidden="0" w:name="Medium Shading 2"/>
+    <w:lsdException w:unhideWhenUsed="0" w:uiPriority="65" w:semiHidden="0" w:name="Medium List 1"/>
+    <w:lsdException w:unhideWhenUsed="0" w:uiPriority="66" w:semiHidden="0" w:name="Medium List 2"/>
+    <w:lsdException w:unhideWhenUsed="0" w:uiPriority="67" w:semiHidden="0" w:name="Medium Grid 1"/>
+    <w:lsdException w:unhideWhenUsed="0" w:uiPriority="68" w:semiHidden="0" w:name="Medium Grid 2"/>
+    <w:lsdException w:unhideWhenUsed="0" w:uiPriority="69" w:semiHidden="0" w:name="Medium Grid 3"/>
+    <w:lsdException w:unhideWhenUsed="0" w:uiPriority="70" w:semiHidden="0" w:name="Dark List"/>
+    <w:lsdException w:unhideWhenUsed="0" w:uiPriority="71" w:semiHidden="0" w:name="Colorful Shading"/>
+    <w:lsdException w:unhideWhenUsed="0" w:uiPriority="72" w:semiHidden="0" w:name="Colorful List"/>
+    <w:lsdException w:unhideWhenUsed="0" w:uiPriority="73" w:semiHidden="0" w:name="Colorful Grid"/>
+    <w:lsdException w:unhideWhenUsed="0" w:uiPriority="60" w:semiHidden="0" w:name="Light Shading Accent 1"/>
+    <w:lsdException w:unhideWhenUsed="0" w:uiPriority="61" w:semiHidden="0" w:name="Light List Accent 1"/>
+    <w:lsdException w:unhideWhenUsed="0" w:uiPriority="62" w:semiHidden="0" w:name="Light Grid Accent 1"/>
+    <w:lsdException w:unhideWhenUsed="0" w:uiPriority="63" w:semiHidden="0" w:name="Medium Shading 1 Accent 1"/>
+    <w:lsdException w:unhideWhenUsed="0" w:uiPriority="64" w:semiHidden="0" w:name="Medium Shading 2 Accent 1"/>
+    <w:lsdException w:unhideWhenUsed="0" w:uiPriority="65" w:semiHidden="0" w:name="Medium List 1 Accent 1"/>
+    <w:lsdException w:qFormat="1" w:unhideWhenUsed="0" w:uiPriority="0" w:semiHidden="0" w:name="List Paragraph"/>
+    <w:lsdException w:unhideWhenUsed="0" w:uiPriority="66" w:semiHidden="0" w:name="Medium List 2 Accent 1"/>
+    <w:lsdException w:unhideWhenUsed="0" w:uiPriority="67" w:semiHidden="0" w:name="Medium Grid 1 Accent 1"/>
+    <w:lsdException w:unhideWhenUsed="0" w:uiPriority="68" w:semiHidden="0" w:name="Medium Grid 2 Accent 1"/>
+    <w:lsdException w:unhideWhenUsed="0" w:uiPriority="69" w:semiHidden="0" w:name="Medium Grid 3 Accent 1"/>
+    <w:lsdException w:unhideWhenUsed="0" w:uiPriority="70" w:semiHidden="0" w:name="Dark List Accent 1"/>
+    <w:lsdException w:unhideWhenUsed="0" w:uiPriority="71" w:semiHidden="0" w:name="Colorful Shading Accent 1"/>
+    <w:lsdException w:unhideWhenUsed="0" w:uiPriority="72" w:semiHidden="0" w:name="Colorful List Accent 1"/>
+    <w:lsdException w:unhideWhenUsed="0" w:uiPriority="73" w:semiHidden="0" w:name="Colorful Grid Accent 1"/>
+    <w:lsdException w:unhideWhenUsed="0" w:uiPriority="60" w:semiHidden="0" w:name="Light Shading Accent 2"/>
+    <w:lsdException w:unhideWhenUsed="0" w:uiPriority="61" w:semiHidden="0" w:name="Light List Accent 2"/>
+    <w:lsdException w:unhideWhenUsed="0" w:uiPriority="62" w:semiHidden="0" w:name="Light Grid Accent 2"/>
+    <w:lsdException w:unhideWhenUsed="0" w:uiPriority="63" w:semiHidden="0" w:name="Medium Shading 1 Accent 2"/>
+    <w:lsdException w:unhideWhenUsed="0" w:uiPriority="64" w:semiHidden="0" w:name="Medium Shading 2 Accent 2"/>
+    <w:lsdException w:unhideWhenUsed="0" w:uiPriority="65" w:semiHidden="0" w:name="Medium List 1 Accent 2"/>
+    <w:lsdException w:unhideWhenUsed="0" w:uiPriority="66" w:semiHidden="0" w:name="Medium List 2 Accent 2"/>
+    <w:lsdException w:unhideWhenUsed="0" w:uiPriority="67" w:semiHidden="0" w:name="Medium Grid 1 Accent 2"/>
+    <w:lsdException w:unhideWhenUsed="0" w:uiPriority="68" w:semiHidden="0" w:name="Medium Grid 2 Accent 2"/>
+    <w:lsdException w:unhideWhenUsed="0" w:uiPriority="69" w:semiHidden="0" w:name="Medium Grid 3 Accent 2"/>
+    <w:lsdException w:unhideWhenUsed="0" w:uiPriority="70" w:semiHidden="0" w:name="Dark List Accent 2"/>
+    <w:lsdException w:unhideWhenUsed="0" w:uiPriority="71" w:semiHidden="0" w:name="Colorful Shading Accent 2"/>
+    <w:lsdException w:unhideWhenUsed="0" w:uiPriority="72" w:semiHidden="0" w:name="Colorful List Accent 2"/>
+    <w:lsdException w:unhideWhenUsed="0" w:uiPriority="73" w:semiHidden="0" w:name="Colorful Grid Accent 2"/>
+    <w:lsdException w:unhideWhenUsed="0" w:uiPriority="60" w:semiHidden="0" w:name="Light Shading Accent 3"/>
+    <w:lsdException w:unhideWhenUsed="0" w:uiPriority="61" w:semiHidden="0" w:name="Light List Accent 3"/>
+    <w:lsdException w:unhideWhenUsed="0" w:uiPriority="62" w:semiHidden="0" w:name="Light Grid Accent 3"/>
+    <w:lsdException w:unhideWhenUsed="0" w:uiPriority="63" w:semiHidden="0" w:name="Medium Shading 1 Accent 3"/>
+    <w:lsdException w:unhideWhenUsed="0" w:uiPriority="64" w:semiHidden="0" w:name="Medium Shading 2 Accent 3"/>
+    <w:lsdException w:unhideWhenUsed="0" w:uiPriority="65" w:semiHidden="0" w:name="Medium List 1 Accent 3"/>
+    <w:lsdException w:unhideWhenUsed="0" w:uiPriority="66" w:semiHidden="0" w:name="Medium List 2 Accent 3"/>
+    <w:lsdException w:unhideWhenUsed="0" w:uiPriority="67" w:semiHidden="0" w:name="Medium Grid 1 Accent 3"/>
+    <w:lsdException w:unhideWhenUsed="0" w:uiPriority="68" w:semiHidden="0" w:name="Medium Grid 2 Accent 3"/>
+    <w:lsdException w:unhideWhenUsed="0" w:uiPriority="69" w:semiHidden="0" w:name="Medium Grid 3 Accent 3"/>
+    <w:lsdException w:unhideWhenUsed="0" w:uiPriority="70" w:semiHidden="0" w:name="Dark List Accent 3"/>
+    <w:lsdException w:unhideWhenUsed="0" w:uiPriority="71" w:semiHidden="0" w:name="Colorful Shading Accent 3"/>
+    <w:lsdException w:unhideWhenUsed="0" w:uiPriority="72" w:semiHidden="0" w:name="Colorful List Accent 3"/>
+    <w:lsdException w:unhideWhenUsed="0" w:uiPriority="73" w:semiHidden="0" w:name="Colorful Grid Accent 3"/>
+    <w:lsdException w:unhideWhenUsed="0" w:uiPriority="60" w:semiHidden="0" w:name="Light Shading Accent 4"/>
+    <w:lsdException w:unhideWhenUsed="0" w:uiPriority="61" w:semiHidden="0" w:name="Light List Accent 4"/>
+    <w:lsdException w:unhideWhenUsed="0" w:uiPriority="62" w:semiHidden="0" w:name="Light Grid Accent 4"/>
+    <w:lsdException w:unhideWhenUsed="0" w:uiPriority="63" w:semiHidden="0" w:name="Medium Shading 1 Accent 4"/>
+    <w:lsdException w:unhideWhenUsed="0" w:uiPriority="64" w:semiHidden="0" w:name="Medium Shading 2 Accent 4"/>
+    <w:lsdException w:unhideWhenUsed="0" w:uiPriority="65" w:semiHidden="0" w:name="Medium List 1 Accent 4"/>
+    <w:lsdException w:unhideWhenUsed="0" w:uiPriority="66" w:semiHidden="0" w:name="Medium List 2 Accent 4"/>
+    <w:lsdException w:unhideWhenUsed="0" w:uiPriority="67" w:semiHidden="0" w:name="Medium Grid 1 Accent 4"/>
+    <w:lsdException w:unhideWhenUsed="0" w:uiPriority="68" w:semiHidden="0" w:name="Medium Grid 2 Accent 4"/>
+    <w:lsdException w:unhideWhenUsed="0" w:uiPriority="69" w:semiHidden="0" w:name="Medium Grid 3 Accent 4"/>
+    <w:lsdException w:unhideWhenUsed="0" w:uiPriority="70" w:semiHidden="0" w:name="Dark List Accent 4"/>
+    <w:lsdException w:unhideWhenUsed="0" w:uiPriority="71" w:semiHidden="0" w:name="Colorful Shading Accent 4"/>
+    <w:lsdException w:unhideWhenUsed="0" w:uiPriority="72" w:semiHidden="0" w:name="Colorful List Accent 4"/>
+    <w:lsdException w:unhideWhenUsed="0" w:uiPriority="73" w:semiHidden="0" w:name="Colorful Grid Accent 4"/>
+    <w:lsdException w:unhideWhenUsed="0" w:uiPriority="60" w:semiHidden="0" w:name="Light Shading Accent 5"/>
+    <w:lsdException w:unhideWhenUsed="0" w:uiPriority="61" w:semiHidden="0" w:name="Light List Accent 5"/>
+    <w:lsdException w:unhideWhenUsed="0" w:uiPriority="62" w:semiHidden="0" w:name="Light Grid Accent 5"/>
+    <w:lsdException w:unhideWhenUsed="0" w:uiPriority="63" w:semiHidden="0" w:name="Medium Shading 1 Accent 5"/>
+    <w:lsdException w:unhideWhenUsed="0" w:uiPriority="64" w:semiHidden="0" w:name="Medium Shading 2 Accent 5"/>
+    <w:lsdException w:unhideWhenUsed="0" w:uiPriority="65" w:semiHidden="0" w:name="Medium List 1 Accent 5"/>
+    <w:lsdException w:unhideWhenUsed="0" w:uiPriority="66" w:semiHidden="0" w:name="Medium List 2 Accent 5"/>
+    <w:lsdException w:unhideWhenUsed="0" w:uiPriority="67" w:semiHidden="0" w:name="Medium Grid 1 Accent 5"/>
+    <w:lsdException w:unhideWhenUsed="0" w:uiPriority="68" w:semiHidden="0" w:name="Medium Grid 2 Accent 5"/>
+    <w:lsdException w:unhideWhenUsed="0" w:uiPriority="69" w:semiHidden="0" w:name="Medium Grid 3 Accent 5"/>
+    <w:lsdException w:unhideWhenUsed="0" w:uiPriority="70" w:semiHidden="0" w:name="Dark List Accent 5"/>
+    <w:lsdException w:unhideWhenUsed="0" w:uiPriority="71" w:semiHidden="0" w:name="Colorful Shading Accent 5"/>
+    <w:lsdException w:unhideWhenUsed="0" w:uiPriority="72" w:semiHidden="0" w:name="Colorful List Accent 5"/>
+    <w:lsdException w:unhideWhenUsed="0" w:uiPriority="73" w:semiHidden="0" w:name="Colorful Grid Accent 5"/>
+    <w:lsdException w:unhideWhenUsed="0" w:uiPriority="60" w:semiHidden="0" w:name="Light Shading Accent 6"/>
+    <w:lsdException w:unhideWhenUsed="0" w:uiPriority="61" w:semiHidden="0" w:name="Light List Accent 6"/>
+    <w:lsdException w:unhideWhenUsed="0" w:uiPriority="62" w:semiHidden="0" w:name="Light Grid Accent 6"/>
+    <w:lsdException w:unhideWhenUsed="0" w:uiPriority="63" w:semiHidden="0" w:name="Medium Shading 1 Accent 6"/>
+    <w:lsdException w:unhideWhenUsed="0" w:uiPriority="64" w:semiHidden="0" w:name="Medium Shading 2 Accent 6"/>
+    <w:lsdException w:unhideWhenUsed="0" w:uiPriority="65" w:semiHidden="0" w:name="Medium List 1 Accent 6"/>
+    <w:lsdException w:unhideWhenUsed="0" w:uiPriority="66" w:semiHidden="0" w:name="Medium List 2 Accent 6"/>
+    <w:lsdException w:unhideWhenUsed="0" w:uiPriority="67" w:semiHidden="0" w:name="Medium Grid 1 Accent 6"/>
+    <w:lsdException w:unhideWhenUsed="0" w:uiPriority="68" w:semiHidden="0" w:name="Medium Grid 2 Accent 6"/>
+    <w:lsdException w:unhideWhenUsed="0" w:uiPriority="69" w:semiHidden="0" w:name="Medium Grid 3 Accent 6"/>
+    <w:lsdException w:unhideWhenUsed="0" w:uiPriority="70" w:semiHidden="0" w:name="Dark List Accent 6"/>
+    <w:lsdException w:unhideWhenUsed="0" w:uiPriority="71" w:semiHidden="0" w:name="Colorful Shading Accent 6"/>
+    <w:lsdException w:unhideWhenUsed="0" w:uiPriority="72" w:semiHidden="0" w:name="Colorful List Accent 6"/>
+    <w:lsdException w:unhideWhenUsed="0" w:uiPriority="73" w:semiHidden="0" w:name="Colorful Grid Accent 6"/>
   </w:latentStyles>
-  <w:style w:type="paragraph" w:default="1" w:styleId="Normal">
+  <w:style w:type="paragraph" w:default="1" w:styleId="1">
     <w:name w:val="Normal"/>
     <w:qFormat/>
+    <w:uiPriority w:val="0"/>
+    <w:rPr>
+      <w:rFonts w:ascii="Times New Roman" w:hAnsi="Times New Roman" w:eastAsia="Times New Roman" w:cs="Times New Roman"/>
+      <w:lang w:val="tr-TR" w:eastAsia="tr-TR" w:bidi="ar-SA"/>
+    </w:rPr>
   </w:style>
-  <w:style w:type="paragraph" w:styleId="Balk1">
+  <w:style w:type="paragraph" w:styleId="2">
     <w:name w:val="heading 1"/>
+    <w:qFormat/>
     <w:uiPriority w:val="9"/>
-    <w:qFormat/>
     <w:pPr>
       <w:outlineLvl w:val="0"/>
     </w:pPr>
     <w:rPr>
+      <w:rFonts w:ascii="Times New Roman" w:hAnsi="Times New Roman" w:eastAsia="Times New Roman" w:cs="Times New Roman"/>
       <w:color w:val="2E74B5"/>
       <w:sz w:val="32"/>
       <w:szCs w:val="32"/>
+      <w:lang w:val="tr-TR" w:eastAsia="tr-TR" w:bidi="ar-SA"/>
     </w:rPr>
   </w:style>
-  <w:style w:type="paragraph" w:styleId="Balk2">
+  <w:style w:type="paragraph" w:styleId="3">
     <w:name w:val="heading 2"/>
-    <w:uiPriority w:val="9"/>
     <w:semiHidden/>
     <w:unhideWhenUsed/>
     <w:qFormat/>
+    <w:uiPriority w:val="9"/>
     <w:pPr>
       <w:outlineLvl w:val="1"/>
     </w:pPr>
     <w:rPr>
+      <w:rFonts w:ascii="Times New Roman" w:hAnsi="Times New Roman" w:eastAsia="Times New Roman" w:cs="Times New Roman"/>
       <w:color w:val="2E74B5"/>
       <w:sz w:val="26"/>
       <w:szCs w:val="26"/>
+      <w:lang w:val="tr-TR" w:eastAsia="tr-TR" w:bidi="ar-SA"/>
     </w:rPr>
   </w:style>
-  <w:style w:type="paragraph" w:styleId="Balk3">
+  <w:style w:type="paragraph" w:styleId="4">
     <w:name w:val="heading 3"/>
-    <w:uiPriority w:val="9"/>
     <w:semiHidden/>
     <w:unhideWhenUsed/>
     <w:qFormat/>
+    <w:uiPriority w:val="9"/>
     <w:pPr>
       <w:outlineLvl w:val="2"/>
     </w:pPr>
     <w:rPr>
+      <w:rFonts w:ascii="Times New Roman" w:hAnsi="Times New Roman" w:eastAsia="Times New Roman" w:cs="Times New Roman"/>
       <w:color w:val="1F4D78"/>
       <w:sz w:val="24"/>
       <w:szCs w:val="24"/>
+      <w:lang w:val="tr-TR" w:eastAsia="tr-TR" w:bidi="ar-SA"/>
     </w:rPr>
   </w:style>
-  <w:style w:type="paragraph" w:styleId="Balk4">
+  <w:style w:type="paragraph" w:styleId="5">
     <w:name w:val="heading 4"/>
-    <w:uiPriority w:val="9"/>
     <w:semiHidden/>
     <w:unhideWhenUsed/>
     <w:qFormat/>
+    <w:uiPriority w:val="9"/>
     <w:pPr>
       <w:outlineLvl w:val="3"/>
     </w:pPr>
     <w:rPr>
+      <w:rFonts w:ascii="Times New Roman" w:hAnsi="Times New Roman" w:eastAsia="Times New Roman" w:cs="Times New Roman"/>
       <w:i/>
       <w:iCs/>
       <w:color w:val="2E74B5"/>
+      <w:lang w:val="tr-TR" w:eastAsia="tr-TR" w:bidi="ar-SA"/>
     </w:rPr>
   </w:style>
-  <w:style w:type="paragraph" w:styleId="Balk5">
+  <w:style w:type="paragraph" w:styleId="6">
     <w:name w:val="heading 5"/>
-    <w:uiPriority w:val="9"/>
     <w:semiHidden/>
     <w:unhideWhenUsed/>
     <w:qFormat/>
+    <w:uiPriority w:val="9"/>
     <w:pPr>
       <w:outlineLvl w:val="4"/>
     </w:pPr>
     <w:rPr>
+      <w:rFonts w:ascii="Times New Roman" w:hAnsi="Times New Roman" w:eastAsia="Times New Roman" w:cs="Times New Roman"/>
       <w:color w:val="2E74B5"/>
+      <w:lang w:val="tr-TR" w:eastAsia="tr-TR" w:bidi="ar-SA"/>
     </w:rPr>
   </w:style>
-  <w:style w:type="paragraph" w:styleId="Balk6">
+  <w:style w:type="paragraph" w:styleId="7">
     <w:name w:val="heading 6"/>
-    <w:uiPriority w:val="9"/>
     <w:semiHidden/>
     <w:unhideWhenUsed/>
     <w:qFormat/>
+    <w:uiPriority w:val="9"/>
     <w:pPr>
       <w:outlineLvl w:val="5"/>
     </w:pPr>
     <w:rPr>
+      <w:rFonts w:ascii="Times New Roman" w:hAnsi="Times New Roman" w:eastAsia="Times New Roman" w:cs="Times New Roman"/>
       <w:color w:val="1F4D78"/>
+      <w:lang w:val="tr-TR" w:eastAsia="tr-TR" w:bidi="ar-SA"/>
     </w:rPr>
   </w:style>
-  <w:style w:type="character" w:default="1" w:styleId="VarsaylanParagrafYazTipi">
+  <w:style w:type="character" w:default="1" w:styleId="8">
     <w:name w:val="Default Paragraph Font"/>
-    <w:uiPriority w:val="1"/>
     <w:semiHidden/>
     <w:unhideWhenUsed/>
+    <w:uiPriority w:val="1"/>
   </w:style>
-  <w:style w:type="table" w:default="1" w:styleId="NormalTablo">
+  <w:style w:type="table" w:default="1" w:styleId="9">
     <w:name w:val="Normal Table"/>
-    <w:uiPriority w:val="99"/>
     <w:semiHidden/>
     <w:unhideWhenUsed/>
+    <w:uiPriority w:val="99"/>
     <w:tblPr>
-      <w:tblInd w:w="0" w:type="dxa"/>
       <w:tblCellMar>
         <w:top w:w="0" w:type="dxa"/>
         <w:left w:w="108" w:type="dxa"/>
@@ -4448,91 +3987,104 @@
       </w:tblCellMar>
     </w:tblPr>
   </w:style>
-  <w:style w:type="numbering" w:default="1" w:styleId="ListeYok">
-    <w:name w:val="No List"/>
-    <w:uiPriority w:val="99"/>
+  <w:style w:type="character" w:styleId="10">
+    <w:name w:val="endnote reference"/>
     <w:semiHidden/>
     <w:unhideWhenUsed/>
-  </w:style>
-  <w:style w:type="paragraph" w:styleId="KonuBal">
-    <w:name w:val="Title"/>
-    <w:uiPriority w:val="10"/>
-    <w:qFormat/>
+    <w:uiPriority w:val="99"/>
     <w:rPr>
-      <w:sz w:val="56"/>
-      <w:szCs w:val="56"/>
+      <w:vertAlign w:val="superscript"/>
     </w:rPr>
   </w:style>
-  <w:style w:type="paragraph" w:customStyle="1" w:styleId="Gl1">
-    <w:name w:val="Güçlü1"/>
-    <w:qFormat/>
+  <w:style w:type="paragraph" w:styleId="11">
+    <w:name w:val="endnote text"/>
+    <w:link w:val="19"/>
+    <w:semiHidden/>
+    <w:unhideWhenUsed/>
+    <w:uiPriority w:val="99"/>
     <w:rPr>
-      <w:b/>
-      <w:bCs/>
+      <w:rFonts w:ascii="Times New Roman" w:hAnsi="Times New Roman" w:eastAsia="Times New Roman" w:cs="Times New Roman"/>
+      <w:lang w:val="tr-TR" w:eastAsia="tr-TR" w:bidi="ar-SA"/>
     </w:rPr>
   </w:style>
-  <w:style w:type="paragraph" w:styleId="ListeParagraf">
-    <w:name w:val="List Paragraph"/>
+  <w:style w:type="character" w:styleId="12">
+    <w:name w:val="footnote reference"/>
+    <w:semiHidden/>
+    <w:unhideWhenUsed/>
+    <w:uiPriority w:val="99"/>
+    <w:rPr>
+      <w:vertAlign w:val="superscript"/>
+    </w:rPr>
+  </w:style>
+  <w:style w:type="paragraph" w:styleId="13">
+    <w:name w:val="footnote text"/>
+    <w:link w:val="18"/>
+    <w:semiHidden/>
+    <w:unhideWhenUsed/>
     <w:qFormat/>
+    <w:uiPriority w:val="99"/>
+    <w:rPr>
+      <w:rFonts w:ascii="Times New Roman" w:hAnsi="Times New Roman" w:eastAsia="Times New Roman" w:cs="Times New Roman"/>
+      <w:lang w:val="tr-TR" w:eastAsia="tr-TR" w:bidi="ar-SA"/>
+    </w:rPr>
   </w:style>
-  <w:style w:type="character" w:styleId="Kpr">
+  <w:style w:type="character" w:styleId="14">
     <w:name w:val="Hyperlink"/>
+    <w:unhideWhenUsed/>
     <w:uiPriority w:val="99"/>
-    <w:unhideWhenUsed/>
     <w:rPr>
       <w:color w:val="0563C1"/>
       <w:u w:val="single"/>
     </w:rPr>
   </w:style>
-  <w:style w:type="character" w:styleId="DipnotBavurusu">
-    <w:name w:val="footnote reference"/>
-    <w:uiPriority w:val="99"/>
+  <w:style w:type="paragraph" w:styleId="15">
+    <w:name w:val="Title"/>
+    <w:qFormat/>
+    <w:uiPriority w:val="10"/>
+    <w:rPr>
+      <w:rFonts w:ascii="Times New Roman" w:hAnsi="Times New Roman" w:eastAsia="Times New Roman" w:cs="Times New Roman"/>
+      <w:sz w:val="56"/>
+      <w:szCs w:val="56"/>
+      <w:lang w:val="tr-TR" w:eastAsia="tr-TR" w:bidi="ar-SA"/>
+    </w:rPr>
+  </w:style>
+  <w:style w:type="paragraph" w:customStyle="1" w:styleId="16">
+    <w:name w:val="Güçlü1"/>
+    <w:qFormat/>
+    <w:uiPriority w:val="0"/>
+    <w:rPr>
+      <w:rFonts w:ascii="Times New Roman" w:hAnsi="Times New Roman" w:eastAsia="Times New Roman" w:cs="Times New Roman"/>
+      <w:b/>
+      <w:bCs/>
+      <w:lang w:val="tr-TR" w:eastAsia="tr-TR" w:bidi="ar-SA"/>
+    </w:rPr>
+  </w:style>
+  <w:style w:type="paragraph" w:styleId="17">
+    <w:name w:val="List Paragraph"/>
+    <w:qFormat/>
+    <w:uiPriority w:val="0"/>
+    <w:rPr>
+      <w:rFonts w:ascii="Times New Roman" w:hAnsi="Times New Roman" w:eastAsia="Times New Roman" w:cs="Times New Roman"/>
+      <w:lang w:val="tr-TR" w:eastAsia="tr-TR" w:bidi="ar-SA"/>
+    </w:rPr>
+  </w:style>
+  <w:style w:type="character" w:customStyle="1" w:styleId="18">
+    <w:name w:val="Dipnot Metni Char"/>
+    <w:link w:val="13"/>
     <w:semiHidden/>
     <w:unhideWhenUsed/>
-    <w:rPr>
-      <w:vertAlign w:val="superscript"/>
-    </w:rPr>
-  </w:style>
-  <w:style w:type="paragraph" w:styleId="DipnotMetni">
-    <w:name w:val="footnote text"/>
-    <w:link w:val="DipnotMetniChar"/>
     <w:uiPriority w:val="99"/>
-    <w:semiHidden/>
-    <w:unhideWhenUsed/>
-  </w:style>
-  <w:style w:type="character" w:customStyle="1" w:styleId="DipnotMetniChar">
-    <w:name w:val="Dipnot Metni Char"/>
-    <w:link w:val="DipnotMetni"/>
-    <w:uiPriority w:val="99"/>
-    <w:semiHidden/>
-    <w:unhideWhenUsed/>
     <w:rPr>
       <w:sz w:val="20"/>
       <w:szCs w:val="20"/>
     </w:rPr>
   </w:style>
-  <w:style w:type="character" w:styleId="SonNotBavurusu">
-    <w:name w:val="endnote reference"/>
-    <w:uiPriority w:val="99"/>
+  <w:style w:type="character" w:customStyle="1" w:styleId="19">
+    <w:name w:val="Son Not Metni Char"/>
+    <w:link w:val="11"/>
     <w:semiHidden/>
     <w:unhideWhenUsed/>
-    <w:rPr>
-      <w:vertAlign w:val="superscript"/>
-    </w:rPr>
-  </w:style>
-  <w:style w:type="paragraph" w:styleId="SonNotMetni">
-    <w:name w:val="endnote text"/>
-    <w:link w:val="SonNotMetniChar"/>
     <w:uiPriority w:val="99"/>
-    <w:semiHidden/>
-    <w:unhideWhenUsed/>
-  </w:style>
-  <w:style w:type="character" w:customStyle="1" w:styleId="SonNotMetniChar">
-    <w:name w:val="Son Not Metni Char"/>
-    <w:link w:val="SonNotMetni"/>
-    <w:uiPriority w:val="99"/>
-    <w:semiHidden/>
-    <w:unhideWhenUsed/>
     <w:rPr>
       <w:sz w:val="20"/>
       <w:szCs w:val="20"/>
@@ -4584,7 +4136,7 @@
     </a:clrScheme>
     <a:fontScheme name="Office">
       <a:majorFont>
-        <a:latin typeface="Calibri Light" panose="020F0302020204030204"/>
+        <a:latin typeface="Calibri Light"/>
         <a:ea typeface=""/>
         <a:cs typeface=""/>
         <a:font script="Jpan" typeface="游ゴシック Light"/>
@@ -4617,26 +4169,9 @@
         <a:font script="Viet" typeface="Times New Roman"/>
         <a:font script="Uigh" typeface="Microsoft Uighur"/>
         <a:font script="Geor" typeface="Sylfaen"/>
-        <a:font script="Armn" typeface="Arial"/>
-        <a:font script="Bugi" typeface="Leelawadee UI"/>
-        <a:font script="Bopo" typeface="Microsoft JhengHei"/>
-        <a:font script="Java" typeface="Javanese Text"/>
-        <a:font script="Lisu" typeface="Segoe UI"/>
-        <a:font script="Mymr" typeface="Myanmar Text"/>
-        <a:font script="Nkoo" typeface="Ebrima"/>
-        <a:font script="Olck" typeface="Nirmala UI"/>
-        <a:font script="Osma" typeface="Ebrima"/>
-        <a:font script="Phag" typeface="Phagspa"/>
-        <a:font script="Syrn" typeface="Estrangelo Edessa"/>
-        <a:font script="Syrj" typeface="Estrangelo Edessa"/>
-        <a:font script="Syre" typeface="Estrangelo Edessa"/>
-        <a:font script="Sora" typeface="Nirmala UI"/>
-        <a:font script="Tale" typeface="Microsoft Tai Le"/>
-        <a:font script="Talu" typeface="Microsoft New Tai Lue"/>
-        <a:font script="Tfng" typeface="Ebrima"/>
       </a:majorFont>
       <a:minorFont>
-        <a:latin typeface="Calibri" panose="020F0502020204030204"/>
+        <a:latin typeface="Calibri"/>
         <a:ea typeface=""/>
         <a:cs typeface=""/>
         <a:font script="Jpan" typeface="游明朝"/>
@@ -4669,23 +4204,6 @@
         <a:font script="Viet" typeface="Arial"/>
         <a:font script="Uigh" typeface="Microsoft Uighur"/>
         <a:font script="Geor" typeface="Sylfaen"/>
-        <a:font script="Armn" typeface="Arial"/>
-        <a:font script="Bugi" typeface="Leelawadee UI"/>
-        <a:font script="Bopo" typeface="Microsoft JhengHei"/>
-        <a:font script="Java" typeface="Javanese Text"/>
-        <a:font script="Lisu" typeface="Segoe UI"/>
-        <a:font script="Mymr" typeface="Myanmar Text"/>
-        <a:font script="Nkoo" typeface="Ebrima"/>
-        <a:font script="Olck" typeface="Nirmala UI"/>
-        <a:font script="Osma" typeface="Ebrima"/>
-        <a:font script="Phag" typeface="Phagspa"/>
-        <a:font script="Syrn" typeface="Estrangelo Edessa"/>
-        <a:font script="Syrj" typeface="Estrangelo Edessa"/>
-        <a:font script="Syre" typeface="Estrangelo Edessa"/>
-        <a:font script="Sora" typeface="Nirmala UI"/>
-        <a:font script="Tale" typeface="Microsoft Tai Le"/>
-        <a:font script="Talu" typeface="Microsoft New Tai Lue"/>
-        <a:font script="Tfng" typeface="Ebrima"/>
       </a:minorFont>
     </a:fontScheme>
     <a:fmtScheme name="Office">
@@ -4827,11 +4345,5 @@
     </a:fmtScheme>
   </a:themeElements>
   <a:objectDefaults/>
-  <a:extraClrSchemeLst/>
-  <a:extLst>
-    <a:ext uri="{05A4C25C-085E-4340-85A3-A5531E510DB2}">
-      <thm15:themeFamily xmlns:thm15="http://schemas.microsoft.com/office/thememl/2012/main" name="Office Theme" id="{62F939B6-93AF-4DB8-9C6B-D6C7DFDC589F}" vid="{4A3C46E8-61CC-4603-A589-7422A47A8E4A}"/>
-    </a:ext>
-  </a:extLst>
 </a:theme>
 </file>
</xml_diff>